<commit_message>
Add documentation and Arbor v0.1.0 game results.
</commit_message>
<xml_diff>
--- a/Documentation/DOCUMENTATION.docx
+++ b/Documentation/DOCUMENTATION.docx
@@ -45,11 +45,47 @@
         </w:rPr>
         <w:t xml:space="preserve">Starting Position – </w:t>
       </w:r>
-      <w:r>
-        <w:rPr>
-          <w:lang w:val="en-US"/>
-        </w:rPr>
-        <w:t>rnbqkbnr/pppppppp/8/8/8/8/PPPPPPPP/RNBQKBNR w KQkq - 0 1</w:t>
+      <w:proofErr w:type="spellStart"/>
+      <w:r>
+        <w:rPr>
+          <w:lang w:val="en-US"/>
+        </w:rPr>
+        <w:t>rnbqkbnr</w:t>
+      </w:r>
+      <w:proofErr w:type="spellEnd"/>
+      <w:r>
+        <w:rPr>
+          <w:lang w:val="en-US"/>
+        </w:rPr>
+        <w:t>/</w:t>
+      </w:r>
+      <w:proofErr w:type="spellStart"/>
+      <w:r>
+        <w:rPr>
+          <w:lang w:val="en-US"/>
+        </w:rPr>
+        <w:t>pppppppp</w:t>
+      </w:r>
+      <w:proofErr w:type="spellEnd"/>
+      <w:r>
+        <w:rPr>
+          <w:lang w:val="en-US"/>
+        </w:rPr>
+        <w:t xml:space="preserve">/8/8/8/8/PPPPPPPP/RNBQKBNR w </w:t>
+      </w:r>
+      <w:proofErr w:type="spellStart"/>
+      <w:r>
+        <w:rPr>
+          <w:lang w:val="en-US"/>
+        </w:rPr>
+        <w:t>KQkq</w:t>
+      </w:r>
+      <w:proofErr w:type="spellEnd"/>
+      <w:r>
+        <w:rPr>
+          <w:lang w:val="en-US"/>
+        </w:rPr>
+        <w:t xml:space="preserve"> - 0 1</w:t>
       </w:r>
     </w:p>
     <w:p>
@@ -310,7 +346,21 @@
         <w:rPr>
           <w:lang w:val="en-US"/>
         </w:rPr>
-        <w:t>r3r1k1/1bpp1p1p/p2b1q2/1p1npnN1/B2PP3/1PN1B3/P1PQ1PPP/R3R1K1 b KQkq - 0 1</w:t>
+        <w:t xml:space="preserve">r3r1k1/1bpp1p1p/p2b1q2/1p1npnN1/B2PP3/1PN1B3/P1PQ1PPP/R3R1K1 b </w:t>
+      </w:r>
+      <w:proofErr w:type="spellStart"/>
+      <w:r>
+        <w:rPr>
+          <w:lang w:val="en-US"/>
+        </w:rPr>
+        <w:t>KQkq</w:t>
+      </w:r>
+      <w:proofErr w:type="spellEnd"/>
+      <w:r>
+        <w:rPr>
+          <w:lang w:val="en-US"/>
+        </w:rPr>
+        <w:t xml:space="preserve"> - 0 1</w:t>
       </w:r>
     </w:p>
     <w:p>
@@ -560,7 +610,21 @@
         <w:rPr>
           <w:lang w:val="en-US"/>
         </w:rPr>
-        <w:t>r3k2r/Pppp1ppp/1b3nbN/nP6/BBP1P3/q4N2/Pp1P2PP/R2Q1RK1 w kq - 0 1</w:t>
+        <w:t xml:space="preserve">r3k2r/Pppp1ppp/1b3nbN/nP6/BBP1P3/q4N2/Pp1P2PP/R2Q1RK1 w </w:t>
+      </w:r>
+      <w:proofErr w:type="spellStart"/>
+      <w:r>
+        <w:rPr>
+          <w:lang w:val="en-US"/>
+        </w:rPr>
+        <w:t>kq</w:t>
+      </w:r>
+      <w:proofErr w:type="spellEnd"/>
+      <w:r>
+        <w:rPr>
+          <w:lang w:val="en-US"/>
+        </w:rPr>
+        <w:t xml:space="preserve"> - 0 1</w:t>
       </w:r>
     </w:p>
     <w:p>
@@ -728,7 +792,21 @@
         <w:rPr>
           <w:lang w:val="en-US"/>
         </w:rPr>
-        <w:t xml:space="preserve">r3k2r/p1ppqpb1/bn2pnp1/3PN3/1p2P3/2N2Q1p/PPPBBPPP/R3K2R w KQkq </w:t>
+        <w:t xml:space="preserve">r3k2r/p1ppqpb1/bn2pnp1/3PN3/1p2P3/2N2Q1p/PPPBBPPP/R3K2R w </w:t>
+      </w:r>
+      <w:proofErr w:type="spellStart"/>
+      <w:r>
+        <w:rPr>
+          <w:lang w:val="en-US"/>
+        </w:rPr>
+        <w:t>KQkq</w:t>
+      </w:r>
+      <w:proofErr w:type="spellEnd"/>
+      <w:r>
+        <w:rPr>
+          <w:lang w:val="en-US"/>
+        </w:rPr>
+        <w:t xml:space="preserve"> </w:t>
       </w:r>
       <w:r>
         <w:rPr>
@@ -4785,28 +4863,7 @@
           <w:sz w:val="20"/>
           <w:szCs w:val="20"/>
         </w:rPr>
-        <w:t xml:space="preserve">Missed pinning the rook on a6 to queen on f8 on depth </w:t>
-      </w:r>
-      <w:r>
-        <w:rPr>
-          <w:sz w:val="20"/>
-          <w:szCs w:val="20"/>
-        </w:rPr>
-        <w:t>2</w:t>
-      </w:r>
-      <w:r>
-        <w:rPr>
-          <w:sz w:val="20"/>
-          <w:szCs w:val="20"/>
-        </w:rPr>
-        <w:t xml:space="preserve"> without quiescence search</w:t>
-      </w:r>
-      <w:r>
-        <w:rPr>
-          <w:sz w:val="20"/>
-          <w:szCs w:val="20"/>
-        </w:rPr>
-        <w:t xml:space="preserve"> with negligible time and node count increase.</w:t>
+        <w:t>Missed pinning the rook on a6 to queen on f8 on depth 2 without quiescence search with negligible time and node count increase.</w:t>
       </w:r>
     </w:p>
     <w:p>
@@ -5453,8 +5510,18 @@
           <w:szCs w:val="18"/>
           <w:lang w:val="en-US"/>
         </w:rPr>
-        <w:t>)                                                     (</w:t>
-      </w:r>
+        <w:t xml:space="preserve">)                                                  </w:t>
+      </w:r>
+      <w:proofErr w:type="gramStart"/>
+      <w:r>
+        <w:rPr>
+          <w:sz w:val="18"/>
+          <w:szCs w:val="18"/>
+          <w:lang w:val="en-US"/>
+        </w:rPr>
+        <w:t xml:space="preserve">   (</w:t>
+      </w:r>
+      <w:proofErr w:type="gramEnd"/>
       <w:r>
         <w:rPr>
           <w:sz w:val="18"/>
@@ -5707,26 +5774,2798 @@
           <w:szCs w:val="18"/>
           <w:lang w:val="en-US"/>
         </w:rPr>
-        <w:t>Tactical sequence caught by quiescence search demonstrating reduction in horizon effect –        (Ra6a8, Qf8a8, Qc6a8)</w:t>
-      </w:r>
-    </w:p>
-    <w:p>
-      <w:pPr>
+        <w:t xml:space="preserve">Tactical sequence caught by quiescence search </w:t>
+      </w:r>
+      <w:r>
         <w:rPr>
           <w:sz w:val="18"/>
           <w:szCs w:val="18"/>
           <w:lang w:val="en-US"/>
         </w:rPr>
-      </w:pPr>
-    </w:p>
-    <w:p>
-      <w:pPr>
+        <w:t xml:space="preserve">at depth 1, </w:t>
+      </w:r>
+      <w:r>
         <w:rPr>
           <w:sz w:val="18"/>
           <w:szCs w:val="18"/>
           <w:lang w:val="en-US"/>
         </w:rPr>
-      </w:pPr>
+        <w:t xml:space="preserve">demonstrating reduction in horizon effect –     </w:t>
+      </w:r>
+      <w:proofErr w:type="gramStart"/>
+      <w:r>
+        <w:rPr>
+          <w:sz w:val="18"/>
+          <w:szCs w:val="18"/>
+          <w:lang w:val="en-US"/>
+        </w:rPr>
+        <w:t xml:space="preserve">   (</w:t>
+      </w:r>
+      <w:proofErr w:type="gramEnd"/>
+      <w:r>
+        <w:rPr>
+          <w:sz w:val="18"/>
+          <w:szCs w:val="18"/>
+          <w:lang w:val="en-US"/>
+        </w:rPr>
+        <w:t>Ra6a8, Qf8a8, Qc6a8)</w:t>
+      </w:r>
+    </w:p>
+    <w:p>
+      <w:pPr>
+        <w:rPr>
+          <w:sz w:val="18"/>
+          <w:szCs w:val="18"/>
+          <w:lang w:val="en-US"/>
+        </w:rPr>
+      </w:pPr>
+    </w:p>
+    <w:p>
+      <w:pPr>
+        <w:rPr>
+          <w:sz w:val="18"/>
+          <w:szCs w:val="18"/>
+          <w:lang w:val="en-US"/>
+        </w:rPr>
+      </w:pPr>
+    </w:p>
+    <w:p>
+      <w:pPr>
+        <w:rPr>
+          <w:sz w:val="18"/>
+          <w:szCs w:val="18"/>
+          <w:lang w:val="en-US"/>
+        </w:rPr>
+      </w:pPr>
+    </w:p>
+    <w:p>
+      <w:pPr>
+        <w:rPr>
+          <w:sz w:val="18"/>
+          <w:szCs w:val="18"/>
+          <w:lang w:val="en-US"/>
+        </w:rPr>
+      </w:pPr>
+    </w:p>
+    <w:p>
+      <w:pPr>
+        <w:rPr>
+          <w:sz w:val="18"/>
+          <w:szCs w:val="18"/>
+          <w:lang w:val="en-US"/>
+        </w:rPr>
+      </w:pPr>
+    </w:p>
+    <w:p>
+      <w:pPr>
+        <w:rPr>
+          <w:sz w:val="18"/>
+          <w:szCs w:val="18"/>
+          <w:lang w:val="en-US"/>
+        </w:rPr>
+      </w:pPr>
+    </w:p>
+    <w:p>
+      <w:pPr>
+        <w:rPr>
+          <w:sz w:val="18"/>
+          <w:szCs w:val="18"/>
+          <w:lang w:val="en-US"/>
+        </w:rPr>
+      </w:pPr>
+    </w:p>
+    <w:p>
+      <w:pPr>
+        <w:rPr>
+          <w:sz w:val="18"/>
+          <w:szCs w:val="18"/>
+          <w:lang w:val="en-US"/>
+        </w:rPr>
+      </w:pPr>
+    </w:p>
+    <w:p>
+      <w:pPr>
+        <w:rPr>
+          <w:sz w:val="18"/>
+          <w:szCs w:val="18"/>
+          <w:lang w:val="en-US"/>
+        </w:rPr>
+      </w:pPr>
+    </w:p>
+    <w:p>
+      <w:pPr>
+        <w:spacing w:before="100" w:beforeAutospacing="1" w:after="100" w:afterAutospacing="1" w:line="240" w:lineRule="auto"/>
+        <w:outlineLvl w:val="1"/>
+        <w:rPr>
+          <w:rFonts w:ascii="Times New Roman" w:eastAsia="Times New Roman" w:hAnsi="Times New Roman" w:cs="Times New Roman"/>
+          <w:b/>
+          <w:bCs/>
+          <w:kern w:val="0"/>
+          <w:sz w:val="28"/>
+          <w:szCs w:val="28"/>
+          <w:lang w:eastAsia="en-IN" w:bidi="hi-IN"/>
+          <w14:ligatures w14:val="none"/>
+        </w:rPr>
+      </w:pPr>
+      <w:r>
+        <w:rPr>
+          <w:rFonts w:ascii="Times New Roman" w:eastAsia="Times New Roman" w:hAnsi="Times New Roman" w:cs="Times New Roman"/>
+          <w:b/>
+          <w:bCs/>
+          <w:kern w:val="0"/>
+          <w:sz w:val="28"/>
+          <w:szCs w:val="28"/>
+          <w:lang w:eastAsia="en-IN" w:bidi="hi-IN"/>
+          <w14:ligatures w14:val="none"/>
+        </w:rPr>
+        <w:lastRenderedPageBreak/>
+        <w:t>Ghost Piece Bug - The Most Difficult Bug Encountered So Far</w:t>
+      </w:r>
+    </w:p>
+    <w:p>
+      <w:pPr>
+        <w:spacing w:before="100" w:beforeAutospacing="1" w:after="100" w:afterAutospacing="1" w:line="240" w:lineRule="auto"/>
+        <w:outlineLvl w:val="2"/>
+        <w:rPr>
+          <w:rFonts w:ascii="Times New Roman" w:eastAsia="Times New Roman" w:hAnsi="Times New Roman" w:cs="Times New Roman"/>
+          <w:b/>
+          <w:bCs/>
+          <w:kern w:val="0"/>
+          <w:sz w:val="24"/>
+          <w:szCs w:val="24"/>
+          <w:lang w:eastAsia="en-IN" w:bidi="hi-IN"/>
+          <w14:ligatures w14:val="none"/>
+        </w:rPr>
+      </w:pPr>
+      <w:r>
+        <w:rPr>
+          <w:rFonts w:ascii="Times New Roman" w:eastAsia="Times New Roman" w:hAnsi="Times New Roman" w:cs="Times New Roman"/>
+          <w:b/>
+          <w:bCs/>
+          <w:kern w:val="0"/>
+          <w:sz w:val="24"/>
+          <w:szCs w:val="24"/>
+          <w:lang w:eastAsia="en-IN" w:bidi="hi-IN"/>
+          <w14:ligatures w14:val="none"/>
+        </w:rPr>
+        <w:t>Background</w:t>
+      </w:r>
+    </w:p>
+    <w:p>
+      <w:pPr>
+        <w:spacing w:before="100" w:beforeAutospacing="1" w:after="100" w:afterAutospacing="1" w:line="240" w:lineRule="auto"/>
+        <w:rPr>
+          <w:rFonts w:ascii="Times New Roman" w:eastAsia="Times New Roman" w:hAnsi="Times New Roman" w:cs="Times New Roman"/>
+          <w:kern w:val="0"/>
+          <w:lang w:eastAsia="en-IN" w:bidi="hi-IN"/>
+          <w14:ligatures w14:val="none"/>
+        </w:rPr>
+      </w:pPr>
+      <w:r>
+        <w:rPr>
+          <w:rFonts w:ascii="Times New Roman" w:eastAsia="Times New Roman" w:hAnsi="Times New Roman" w:cs="Times New Roman"/>
+          <w:kern w:val="0"/>
+          <w:lang w:eastAsia="en-IN" w:bidi="hi-IN"/>
+          <w14:ligatures w14:val="none"/>
+        </w:rPr>
+        <w:t>Following the implementation of UCI support, Arbor was finally ready to play complete games through a chess GUI. Initial testing appeared successful, with the engine responding correctly to the first few moves. However, after several plies, the engine would consistently disconnect and crash.</w:t>
+      </w:r>
+    </w:p>
+    <w:p>
+      <w:pPr>
+        <w:spacing w:before="100" w:beforeAutospacing="1" w:after="100" w:afterAutospacing="1" w:line="240" w:lineRule="auto"/>
+        <w:rPr>
+          <w:rFonts w:ascii="Times New Roman" w:eastAsia="Times New Roman" w:hAnsi="Times New Roman" w:cs="Times New Roman"/>
+          <w:kern w:val="0"/>
+          <w:lang w:eastAsia="en-IN" w:bidi="hi-IN"/>
+          <w14:ligatures w14:val="none"/>
+        </w:rPr>
+      </w:pPr>
+      <w:r>
+        <w:rPr>
+          <w:rFonts w:ascii="Times New Roman" w:eastAsia="Times New Roman" w:hAnsi="Times New Roman" w:cs="Times New Roman"/>
+          <w:kern w:val="0"/>
+          <w:lang w:eastAsia="en-IN" w:bidi="hi-IN"/>
+          <w14:ligatures w14:val="none"/>
+        </w:rPr>
+        <w:t xml:space="preserve">The exception reported an index out-of-bounds error inside the </w:t>
+      </w:r>
+      <w:proofErr w:type="spellStart"/>
+      <w:proofErr w:type="gramStart"/>
+      <w:r>
+        <w:rPr>
+          <w:rFonts w:ascii="Courier New" w:eastAsia="Times New Roman" w:hAnsi="Courier New" w:cs="Courier New"/>
+          <w:kern w:val="0"/>
+          <w:sz w:val="18"/>
+          <w:szCs w:val="18"/>
+          <w:lang w:eastAsia="en-IN" w:bidi="hi-IN"/>
+          <w14:ligatures w14:val="none"/>
+        </w:rPr>
+        <w:t>MakeMove</w:t>
+      </w:r>
+      <w:proofErr w:type="spellEnd"/>
+      <w:r>
+        <w:rPr>
+          <w:rFonts w:ascii="Courier New" w:eastAsia="Times New Roman" w:hAnsi="Courier New" w:cs="Courier New"/>
+          <w:kern w:val="0"/>
+          <w:sz w:val="18"/>
+          <w:szCs w:val="18"/>
+          <w:lang w:eastAsia="en-IN" w:bidi="hi-IN"/>
+          <w14:ligatures w14:val="none"/>
+        </w:rPr>
+        <w:t>(</w:t>
+      </w:r>
+      <w:proofErr w:type="gramEnd"/>
+      <w:r>
+        <w:rPr>
+          <w:rFonts w:ascii="Courier New" w:eastAsia="Times New Roman" w:hAnsi="Courier New" w:cs="Courier New"/>
+          <w:kern w:val="0"/>
+          <w:sz w:val="18"/>
+          <w:szCs w:val="18"/>
+          <w:lang w:eastAsia="en-IN" w:bidi="hi-IN"/>
+          <w14:ligatures w14:val="none"/>
+        </w:rPr>
+        <w:t>)</w:t>
+      </w:r>
+      <w:r>
+        <w:rPr>
+          <w:rFonts w:ascii="Times New Roman" w:eastAsia="Times New Roman" w:hAnsi="Times New Roman" w:cs="Times New Roman"/>
+          <w:kern w:val="0"/>
+          <w:lang w:eastAsia="en-IN" w:bidi="hi-IN"/>
+          <w14:ligatures w14:val="none"/>
+        </w:rPr>
+        <w:t xml:space="preserve"> function. Since move generation and board manipulation are among the most complex parts of a chess engine, these systems immediately became the primary suspects.</w:t>
+      </w:r>
+    </w:p>
+    <w:p>
+      <w:pPr>
+        <w:spacing w:before="100" w:beforeAutospacing="1" w:after="100" w:afterAutospacing="1" w:line="240" w:lineRule="auto"/>
+        <w:outlineLvl w:val="2"/>
+        <w:rPr>
+          <w:rFonts w:ascii="Times New Roman" w:eastAsia="Times New Roman" w:hAnsi="Times New Roman" w:cs="Times New Roman"/>
+          <w:b/>
+          <w:bCs/>
+          <w:kern w:val="0"/>
+          <w:sz w:val="24"/>
+          <w:szCs w:val="24"/>
+          <w:lang w:eastAsia="en-IN" w:bidi="hi-IN"/>
+          <w14:ligatures w14:val="none"/>
+        </w:rPr>
+      </w:pPr>
+      <w:r>
+        <w:rPr>
+          <w:rFonts w:ascii="Times New Roman" w:eastAsia="Times New Roman" w:hAnsi="Times New Roman" w:cs="Times New Roman"/>
+          <w:b/>
+          <w:bCs/>
+          <w:kern w:val="0"/>
+          <w:sz w:val="24"/>
+          <w:szCs w:val="24"/>
+          <w:lang w:eastAsia="en-IN" w:bidi="hi-IN"/>
+          <w14:ligatures w14:val="none"/>
+        </w:rPr>
+        <w:t>Investigation</w:t>
+      </w:r>
+    </w:p>
+    <w:p>
+      <w:pPr>
+        <w:spacing w:before="100" w:beforeAutospacing="1" w:after="100" w:afterAutospacing="1" w:line="240" w:lineRule="auto"/>
+        <w:rPr>
+          <w:rFonts w:ascii="Times New Roman" w:eastAsia="Times New Roman" w:hAnsi="Times New Roman" w:cs="Times New Roman"/>
+          <w:kern w:val="0"/>
+          <w:lang w:eastAsia="en-IN" w:bidi="hi-IN"/>
+          <w14:ligatures w14:val="none"/>
+        </w:rPr>
+      </w:pPr>
+      <w:r>
+        <w:rPr>
+          <w:rFonts w:ascii="Times New Roman" w:eastAsia="Times New Roman" w:hAnsi="Times New Roman" w:cs="Times New Roman"/>
+          <w:kern w:val="0"/>
+          <w:lang w:eastAsia="en-IN" w:bidi="hi-IN"/>
+          <w14:ligatures w14:val="none"/>
+        </w:rPr>
+        <w:t>For approximately two days, debugging efforts focused almost entirely on the search and move generation pipeline.</w:t>
+      </w:r>
+    </w:p>
+    <w:p>
+      <w:pPr>
+        <w:spacing w:before="100" w:beforeAutospacing="1" w:after="100" w:afterAutospacing="1" w:line="240" w:lineRule="auto"/>
+        <w:rPr>
+          <w:rFonts w:ascii="Times New Roman" w:eastAsia="Times New Roman" w:hAnsi="Times New Roman" w:cs="Times New Roman"/>
+          <w:kern w:val="0"/>
+          <w:lang w:eastAsia="en-IN" w:bidi="hi-IN"/>
+          <w14:ligatures w14:val="none"/>
+        </w:rPr>
+      </w:pPr>
+      <w:r>
+        <w:rPr>
+          <w:rFonts w:ascii="Times New Roman" w:eastAsia="Times New Roman" w:hAnsi="Times New Roman" w:cs="Times New Roman"/>
+          <w:kern w:val="0"/>
+          <w:lang w:eastAsia="en-IN" w:bidi="hi-IN"/>
+          <w14:ligatures w14:val="none"/>
+        </w:rPr>
+        <w:t>The following components were investigated extensively:</w:t>
+      </w:r>
+    </w:p>
+    <w:p>
+      <w:pPr>
+        <w:numPr>
+          <w:ilvl w:val="0"/>
+          <w:numId w:val="13"/>
+        </w:numPr>
+        <w:spacing w:before="100" w:beforeAutospacing="1" w:after="100" w:afterAutospacing="1" w:line="240" w:lineRule="auto"/>
+        <w:rPr>
+          <w:rFonts w:ascii="Times New Roman" w:eastAsia="Times New Roman" w:hAnsi="Times New Roman" w:cs="Times New Roman"/>
+          <w:kern w:val="0"/>
+          <w:lang w:eastAsia="en-IN" w:bidi="hi-IN"/>
+          <w14:ligatures w14:val="none"/>
+        </w:rPr>
+      </w:pPr>
+      <w:r>
+        <w:rPr>
+          <w:rFonts w:ascii="Times New Roman" w:eastAsia="Times New Roman" w:hAnsi="Times New Roman" w:cs="Times New Roman"/>
+          <w:kern w:val="0"/>
+          <w:lang w:eastAsia="en-IN" w:bidi="hi-IN"/>
+          <w14:ligatures w14:val="none"/>
+        </w:rPr>
+        <w:t>Move generation</w:t>
+      </w:r>
+      <w:r>
+        <w:rPr>
+          <w:rFonts w:ascii="Times New Roman" w:eastAsia="Times New Roman" w:hAnsi="Times New Roman" w:cs="Times New Roman"/>
+          <w:kern w:val="0"/>
+          <w:lang w:eastAsia="en-IN" w:bidi="hi-IN"/>
+          <w14:ligatures w14:val="none"/>
+        </w:rPr>
+        <w:t>.</w:t>
+      </w:r>
+    </w:p>
+    <w:p>
+      <w:pPr>
+        <w:numPr>
+          <w:ilvl w:val="0"/>
+          <w:numId w:val="13"/>
+        </w:numPr>
+        <w:spacing w:before="100" w:beforeAutospacing="1" w:after="100" w:afterAutospacing="1" w:line="240" w:lineRule="auto"/>
+        <w:rPr>
+          <w:rFonts w:ascii="Times New Roman" w:eastAsia="Times New Roman" w:hAnsi="Times New Roman" w:cs="Times New Roman"/>
+          <w:kern w:val="0"/>
+          <w:lang w:eastAsia="en-IN" w:bidi="hi-IN"/>
+          <w14:ligatures w14:val="none"/>
+        </w:rPr>
+      </w:pPr>
+      <w:proofErr w:type="spellStart"/>
+      <w:proofErr w:type="gramStart"/>
+      <w:r>
+        <w:rPr>
+          <w:rFonts w:ascii="Times New Roman" w:eastAsia="Times New Roman" w:hAnsi="Times New Roman" w:cs="Times New Roman"/>
+          <w:kern w:val="0"/>
+          <w:lang w:eastAsia="en-IN" w:bidi="hi-IN"/>
+          <w14:ligatures w14:val="none"/>
+        </w:rPr>
+        <w:t>MakeMove</w:t>
+      </w:r>
+      <w:proofErr w:type="spellEnd"/>
+      <w:r>
+        <w:rPr>
+          <w:rFonts w:ascii="Times New Roman" w:eastAsia="Times New Roman" w:hAnsi="Times New Roman" w:cs="Times New Roman"/>
+          <w:kern w:val="0"/>
+          <w:lang w:eastAsia="en-IN" w:bidi="hi-IN"/>
+          <w14:ligatures w14:val="none"/>
+        </w:rPr>
+        <w:t>(</w:t>
+      </w:r>
+      <w:proofErr w:type="gramEnd"/>
+      <w:r>
+        <w:rPr>
+          <w:rFonts w:ascii="Times New Roman" w:eastAsia="Times New Roman" w:hAnsi="Times New Roman" w:cs="Times New Roman"/>
+          <w:kern w:val="0"/>
+          <w:lang w:eastAsia="en-IN" w:bidi="hi-IN"/>
+          <w14:ligatures w14:val="none"/>
+        </w:rPr>
+        <w:t xml:space="preserve">) and </w:t>
+      </w:r>
+      <w:proofErr w:type="spellStart"/>
+      <w:r>
+        <w:rPr>
+          <w:rFonts w:ascii="Times New Roman" w:eastAsia="Times New Roman" w:hAnsi="Times New Roman" w:cs="Times New Roman"/>
+          <w:kern w:val="0"/>
+          <w:lang w:eastAsia="en-IN" w:bidi="hi-IN"/>
+          <w14:ligatures w14:val="none"/>
+        </w:rPr>
+        <w:t>UnmakeMove</w:t>
+      </w:r>
+      <w:proofErr w:type="spellEnd"/>
+      <w:r>
+        <w:rPr>
+          <w:rFonts w:ascii="Times New Roman" w:eastAsia="Times New Roman" w:hAnsi="Times New Roman" w:cs="Times New Roman"/>
+          <w:kern w:val="0"/>
+          <w:lang w:eastAsia="en-IN" w:bidi="hi-IN"/>
+          <w14:ligatures w14:val="none"/>
+        </w:rPr>
+        <w:t>()</w:t>
+      </w:r>
+    </w:p>
+    <w:p>
+      <w:pPr>
+        <w:numPr>
+          <w:ilvl w:val="0"/>
+          <w:numId w:val="13"/>
+        </w:numPr>
+        <w:spacing w:before="100" w:beforeAutospacing="1" w:after="100" w:afterAutospacing="1" w:line="240" w:lineRule="auto"/>
+        <w:rPr>
+          <w:rFonts w:ascii="Times New Roman" w:eastAsia="Times New Roman" w:hAnsi="Times New Roman" w:cs="Times New Roman"/>
+          <w:kern w:val="0"/>
+          <w:lang w:eastAsia="en-IN" w:bidi="hi-IN"/>
+          <w14:ligatures w14:val="none"/>
+        </w:rPr>
+      </w:pPr>
+      <w:proofErr w:type="spellStart"/>
+      <w:r>
+        <w:rPr>
+          <w:rFonts w:ascii="Times New Roman" w:eastAsia="Times New Roman" w:hAnsi="Times New Roman" w:cs="Times New Roman"/>
+          <w:kern w:val="0"/>
+          <w:lang w:eastAsia="en-IN" w:bidi="hi-IN"/>
+          <w14:ligatures w14:val="none"/>
+        </w:rPr>
+        <w:t>Negamax</w:t>
+      </w:r>
+      <w:proofErr w:type="spellEnd"/>
+      <w:r>
+        <w:rPr>
+          <w:rFonts w:ascii="Times New Roman" w:eastAsia="Times New Roman" w:hAnsi="Times New Roman" w:cs="Times New Roman"/>
+          <w:kern w:val="0"/>
+          <w:lang w:eastAsia="en-IN" w:bidi="hi-IN"/>
+          <w14:ligatures w14:val="none"/>
+        </w:rPr>
+        <w:t xml:space="preserve"> search</w:t>
+      </w:r>
+    </w:p>
+    <w:p>
+      <w:pPr>
+        <w:numPr>
+          <w:ilvl w:val="0"/>
+          <w:numId w:val="13"/>
+        </w:numPr>
+        <w:spacing w:before="100" w:beforeAutospacing="1" w:after="100" w:afterAutospacing="1" w:line="240" w:lineRule="auto"/>
+        <w:rPr>
+          <w:rFonts w:ascii="Times New Roman" w:eastAsia="Times New Roman" w:hAnsi="Times New Roman" w:cs="Times New Roman"/>
+          <w:kern w:val="0"/>
+          <w:lang w:eastAsia="en-IN" w:bidi="hi-IN"/>
+          <w14:ligatures w14:val="none"/>
+        </w:rPr>
+      </w:pPr>
+      <w:r>
+        <w:rPr>
+          <w:rFonts w:ascii="Times New Roman" w:eastAsia="Times New Roman" w:hAnsi="Times New Roman" w:cs="Times New Roman"/>
+          <w:kern w:val="0"/>
+          <w:lang w:eastAsia="en-IN" w:bidi="hi-IN"/>
+          <w14:ligatures w14:val="none"/>
+        </w:rPr>
+        <w:t>Quiescence Search</w:t>
+      </w:r>
+    </w:p>
+    <w:p>
+      <w:pPr>
+        <w:numPr>
+          <w:ilvl w:val="0"/>
+          <w:numId w:val="13"/>
+        </w:numPr>
+        <w:spacing w:before="100" w:beforeAutospacing="1" w:after="100" w:afterAutospacing="1" w:line="240" w:lineRule="auto"/>
+        <w:rPr>
+          <w:rFonts w:ascii="Times New Roman" w:eastAsia="Times New Roman" w:hAnsi="Times New Roman" w:cs="Times New Roman"/>
+          <w:kern w:val="0"/>
+          <w:lang w:eastAsia="en-IN" w:bidi="hi-IN"/>
+          <w14:ligatures w14:val="none"/>
+        </w:rPr>
+      </w:pPr>
+      <w:r>
+        <w:rPr>
+          <w:rFonts w:ascii="Times New Roman" w:eastAsia="Times New Roman" w:hAnsi="Times New Roman" w:cs="Times New Roman"/>
+          <w:kern w:val="0"/>
+          <w:lang w:eastAsia="en-IN" w:bidi="hi-IN"/>
+          <w14:ligatures w14:val="none"/>
+        </w:rPr>
+        <w:t>UCI command handling</w:t>
+      </w:r>
+    </w:p>
+    <w:p>
+      <w:pPr>
+        <w:spacing w:before="100" w:beforeAutospacing="1" w:after="100" w:afterAutospacing="1" w:line="240" w:lineRule="auto"/>
+        <w:rPr>
+          <w:rFonts w:ascii="Times New Roman" w:eastAsia="Times New Roman" w:hAnsi="Times New Roman" w:cs="Times New Roman"/>
+          <w:kern w:val="0"/>
+          <w:lang w:eastAsia="en-IN" w:bidi="hi-IN"/>
+          <w14:ligatures w14:val="none"/>
+        </w:rPr>
+      </w:pPr>
+      <w:r>
+        <w:rPr>
+          <w:rFonts w:ascii="Times New Roman" w:eastAsia="Times New Roman" w:hAnsi="Times New Roman" w:cs="Times New Roman"/>
+          <w:kern w:val="0"/>
+          <w:lang w:eastAsia="en-IN" w:bidi="hi-IN"/>
+          <w14:ligatures w14:val="none"/>
+        </w:rPr>
+        <w:t xml:space="preserve">Large amounts of debug logging were added throughout the engine </w:t>
+      </w:r>
+      <w:proofErr w:type="gramStart"/>
+      <w:r>
+        <w:rPr>
+          <w:rFonts w:ascii="Times New Roman" w:eastAsia="Times New Roman" w:hAnsi="Times New Roman" w:cs="Times New Roman"/>
+          <w:kern w:val="0"/>
+          <w:lang w:eastAsia="en-IN" w:bidi="hi-IN"/>
+          <w14:ligatures w14:val="none"/>
+        </w:rPr>
+        <w:t>in an attempt to</w:t>
+      </w:r>
+      <w:proofErr w:type="gramEnd"/>
+      <w:r>
+        <w:rPr>
+          <w:rFonts w:ascii="Times New Roman" w:eastAsia="Times New Roman" w:hAnsi="Times New Roman" w:cs="Times New Roman"/>
+          <w:kern w:val="0"/>
+          <w:lang w:eastAsia="en-IN" w:bidi="hi-IN"/>
+          <w14:ligatures w14:val="none"/>
+        </w:rPr>
+        <w:t xml:space="preserve"> locate the source of the corruption. Every major function was instrumented to print intermediate states and detect invalid moves.</w:t>
+      </w:r>
+    </w:p>
+    <w:p>
+      <w:pPr>
+        <w:spacing w:before="100" w:beforeAutospacing="1" w:after="100" w:afterAutospacing="1" w:line="240" w:lineRule="auto"/>
+        <w:rPr>
+          <w:rFonts w:ascii="Times New Roman" w:eastAsia="Times New Roman" w:hAnsi="Times New Roman" w:cs="Times New Roman"/>
+          <w:kern w:val="0"/>
+          <w:lang w:eastAsia="en-IN" w:bidi="hi-IN"/>
+          <w14:ligatures w14:val="none"/>
+        </w:rPr>
+      </w:pPr>
+      <w:r>
+        <w:rPr>
+          <w:rFonts w:ascii="Times New Roman" w:eastAsia="Times New Roman" w:hAnsi="Times New Roman" w:cs="Times New Roman"/>
+          <w:kern w:val="0"/>
+          <w:lang w:eastAsia="en-IN" w:bidi="hi-IN"/>
+          <w14:ligatures w14:val="none"/>
+        </w:rPr>
+        <w:t>At the time, move generation seemed the most likely culprit because the crash occurred while attempting to make a move generated by the engine itself.</w:t>
+      </w:r>
+    </w:p>
+    <w:p>
+      <w:pPr>
+        <w:spacing w:before="100" w:beforeAutospacing="1" w:after="100" w:afterAutospacing="1" w:line="240" w:lineRule="auto"/>
+        <w:rPr>
+          <w:rFonts w:ascii="Times New Roman" w:eastAsia="Times New Roman" w:hAnsi="Times New Roman" w:cs="Times New Roman"/>
+          <w:kern w:val="0"/>
+          <w:lang w:eastAsia="en-IN" w:bidi="hi-IN"/>
+          <w14:ligatures w14:val="none"/>
+        </w:rPr>
+      </w:pPr>
+      <w:r>
+        <w:rPr>
+          <w:rFonts w:ascii="Times New Roman" w:eastAsia="Times New Roman" w:hAnsi="Times New Roman" w:cs="Times New Roman"/>
+          <w:kern w:val="0"/>
+          <w:lang w:eastAsia="en-IN" w:bidi="hi-IN"/>
+          <w14:ligatures w14:val="none"/>
+        </w:rPr>
+        <w:t xml:space="preserve">This theory appeared reasonable, but there was one major contradiction: Arbor had already passed extensive </w:t>
+      </w:r>
+      <w:proofErr w:type="spellStart"/>
+      <w:r>
+        <w:rPr>
+          <w:rFonts w:ascii="Times New Roman" w:eastAsia="Times New Roman" w:hAnsi="Times New Roman" w:cs="Times New Roman"/>
+          <w:kern w:val="0"/>
+          <w:lang w:eastAsia="en-IN" w:bidi="hi-IN"/>
+          <w14:ligatures w14:val="none"/>
+        </w:rPr>
+        <w:t>Perft</w:t>
+      </w:r>
+      <w:proofErr w:type="spellEnd"/>
+      <w:r>
+        <w:rPr>
+          <w:rFonts w:ascii="Times New Roman" w:eastAsia="Times New Roman" w:hAnsi="Times New Roman" w:cs="Times New Roman"/>
+          <w:kern w:val="0"/>
+          <w:lang w:eastAsia="en-IN" w:bidi="hi-IN"/>
+          <w14:ligatures w14:val="none"/>
+        </w:rPr>
+        <w:t xml:space="preserve"> testing, including hundreds of positions at depths ranging from 5 to 10 plies. Move generation had survived far more demanding validation than the positions causing the crash.</w:t>
+      </w:r>
+    </w:p>
+    <w:p>
+      <w:pPr>
+        <w:spacing w:before="100" w:beforeAutospacing="1" w:after="100" w:afterAutospacing="1" w:line="240" w:lineRule="auto"/>
+        <w:outlineLvl w:val="2"/>
+        <w:rPr>
+          <w:rFonts w:ascii="Times New Roman" w:eastAsia="Times New Roman" w:hAnsi="Times New Roman" w:cs="Times New Roman"/>
+          <w:b/>
+          <w:bCs/>
+          <w:kern w:val="0"/>
+          <w:sz w:val="24"/>
+          <w:szCs w:val="24"/>
+          <w:lang w:eastAsia="en-IN" w:bidi="hi-IN"/>
+          <w14:ligatures w14:val="none"/>
+        </w:rPr>
+      </w:pPr>
+      <w:r>
+        <w:rPr>
+          <w:rFonts w:ascii="Times New Roman" w:eastAsia="Times New Roman" w:hAnsi="Times New Roman" w:cs="Times New Roman"/>
+          <w:b/>
+          <w:bCs/>
+          <w:kern w:val="0"/>
+          <w:sz w:val="24"/>
+          <w:szCs w:val="24"/>
+          <w:lang w:eastAsia="en-IN" w:bidi="hi-IN"/>
+          <w14:ligatures w14:val="none"/>
+        </w:rPr>
+        <w:t>The Breakthrough</w:t>
+      </w:r>
+    </w:p>
+    <w:p>
+      <w:pPr>
+        <w:spacing w:before="100" w:beforeAutospacing="1" w:after="100" w:afterAutospacing="1" w:line="240" w:lineRule="auto"/>
+        <w:rPr>
+          <w:rFonts w:ascii="Times New Roman" w:eastAsia="Times New Roman" w:hAnsi="Times New Roman" w:cs="Times New Roman"/>
+          <w:kern w:val="0"/>
+          <w:lang w:eastAsia="en-IN" w:bidi="hi-IN"/>
+          <w14:ligatures w14:val="none"/>
+        </w:rPr>
+      </w:pPr>
+      <w:r>
+        <w:rPr>
+          <w:rFonts w:ascii="Times New Roman" w:eastAsia="Times New Roman" w:hAnsi="Times New Roman" w:cs="Times New Roman"/>
+          <w:kern w:val="0"/>
+          <w:lang w:eastAsia="en-IN" w:bidi="hi-IN"/>
+          <w14:ligatures w14:val="none"/>
+        </w:rPr>
+        <w:t>The turning point came when complete board states were printed whenever the UCI module received or sent a command.</w:t>
+      </w:r>
+    </w:p>
+    <w:p>
+      <w:pPr>
+        <w:spacing w:before="100" w:beforeAutospacing="1" w:after="100" w:afterAutospacing="1" w:line="240" w:lineRule="auto"/>
+        <w:rPr>
+          <w:rFonts w:ascii="Times New Roman" w:eastAsia="Times New Roman" w:hAnsi="Times New Roman" w:cs="Times New Roman"/>
+          <w:kern w:val="0"/>
+          <w:lang w:eastAsia="en-IN" w:bidi="hi-IN"/>
+          <w14:ligatures w14:val="none"/>
+        </w:rPr>
+      </w:pPr>
+      <w:r>
+        <w:rPr>
+          <w:rFonts w:ascii="Times New Roman" w:eastAsia="Times New Roman" w:hAnsi="Times New Roman" w:cs="Times New Roman"/>
+          <w:kern w:val="0"/>
+          <w:lang w:eastAsia="en-IN" w:bidi="hi-IN"/>
+          <w14:ligatures w14:val="none"/>
+        </w:rPr>
+        <w:t>Initially, it appeared that moves were somehow being applied to copies of the board rather than the active position. Previous moves seemed to disappear unexpectedly, creating confusion about where the board state was being stored.</w:t>
+      </w:r>
+    </w:p>
+    <w:p>
+      <w:pPr>
+        <w:spacing w:before="100" w:beforeAutospacing="1" w:after="100" w:afterAutospacing="1" w:line="240" w:lineRule="auto"/>
+        <w:rPr>
+          <w:rFonts w:ascii="Times New Roman" w:eastAsia="Times New Roman" w:hAnsi="Times New Roman" w:cs="Times New Roman"/>
+          <w:kern w:val="0"/>
+          <w:lang w:eastAsia="en-IN" w:bidi="hi-IN"/>
+          <w14:ligatures w14:val="none"/>
+        </w:rPr>
+      </w:pPr>
+      <w:r>
+        <w:rPr>
+          <w:rFonts w:ascii="Times New Roman" w:eastAsia="Times New Roman" w:hAnsi="Times New Roman" w:cs="Times New Roman"/>
+          <w:kern w:val="0"/>
+          <w:lang w:eastAsia="en-IN" w:bidi="hi-IN"/>
+          <w14:ligatures w14:val="none"/>
+        </w:rPr>
+        <w:t>Further investigation revealed a more surprising reality.</w:t>
+      </w:r>
+    </w:p>
+    <w:p>
+      <w:pPr>
+        <w:spacing w:before="100" w:beforeAutospacing="1" w:after="100" w:afterAutospacing="1" w:line="240" w:lineRule="auto"/>
+        <w:rPr>
+          <w:rFonts w:ascii="Times New Roman" w:eastAsia="Times New Roman" w:hAnsi="Times New Roman" w:cs="Times New Roman"/>
+          <w:kern w:val="0"/>
+          <w:lang w:eastAsia="en-IN" w:bidi="hi-IN"/>
+          <w14:ligatures w14:val="none"/>
+        </w:rPr>
+      </w:pPr>
+      <w:r>
+        <w:rPr>
+          <w:rFonts w:ascii="Times New Roman" w:eastAsia="Times New Roman" w:hAnsi="Times New Roman" w:cs="Times New Roman"/>
+          <w:kern w:val="0"/>
+          <w:lang w:eastAsia="en-IN" w:bidi="hi-IN"/>
+          <w14:ligatures w14:val="none"/>
+        </w:rPr>
+        <w:t xml:space="preserve">Whenever the GUI sent a new </w:t>
+      </w:r>
+      <w:r>
+        <w:rPr>
+          <w:rFonts w:ascii="Courier New" w:eastAsia="Times New Roman" w:hAnsi="Courier New" w:cs="Courier New"/>
+          <w:kern w:val="0"/>
+          <w:sz w:val="18"/>
+          <w:szCs w:val="18"/>
+          <w:lang w:eastAsia="en-IN" w:bidi="hi-IN"/>
+          <w14:ligatures w14:val="none"/>
+        </w:rPr>
+        <w:t>position</w:t>
+      </w:r>
+      <w:r>
+        <w:rPr>
+          <w:rFonts w:ascii="Times New Roman" w:eastAsia="Times New Roman" w:hAnsi="Times New Roman" w:cs="Times New Roman"/>
+          <w:kern w:val="0"/>
+          <w:lang w:eastAsia="en-IN" w:bidi="hi-IN"/>
+          <w14:ligatures w14:val="none"/>
+        </w:rPr>
+        <w:t xml:space="preserve"> command, Arbor loaded the supplied FEN position without first clearing the existing board.</w:t>
+      </w:r>
+    </w:p>
+    <w:p>
+      <w:pPr>
+        <w:spacing w:before="100" w:beforeAutospacing="1" w:after="100" w:afterAutospacing="1" w:line="240" w:lineRule="auto"/>
+        <w:rPr>
+          <w:rFonts w:ascii="Times New Roman" w:eastAsia="Times New Roman" w:hAnsi="Times New Roman" w:cs="Times New Roman"/>
+          <w:kern w:val="0"/>
+          <w:lang w:eastAsia="en-IN" w:bidi="hi-IN"/>
+          <w14:ligatures w14:val="none"/>
+        </w:rPr>
+      </w:pPr>
+      <w:r>
+        <w:rPr>
+          <w:rFonts w:ascii="Times New Roman" w:eastAsia="Times New Roman" w:hAnsi="Times New Roman" w:cs="Times New Roman"/>
+          <w:kern w:val="0"/>
+          <w:lang w:eastAsia="en-IN" w:bidi="hi-IN"/>
+          <w14:ligatures w14:val="none"/>
+        </w:rPr>
+        <w:t>As a result, pieces from previous positions remained present in the bitboards. New pieces were effectively merged with old pieces, creating "ghost pieces" that no longer existed on the actual board.</w:t>
+      </w:r>
+    </w:p>
+    <w:p>
+      <w:pPr>
+        <w:spacing w:before="100" w:beforeAutospacing="1" w:after="100" w:afterAutospacing="1" w:line="240" w:lineRule="auto"/>
+        <w:rPr>
+          <w:rFonts w:ascii="Times New Roman" w:eastAsia="Times New Roman" w:hAnsi="Times New Roman" w:cs="Times New Roman"/>
+          <w:kern w:val="0"/>
+          <w:lang w:eastAsia="en-IN" w:bidi="hi-IN"/>
+          <w14:ligatures w14:val="none"/>
+        </w:rPr>
+      </w:pPr>
+      <w:r>
+        <w:rPr>
+          <w:rFonts w:ascii="Times New Roman" w:eastAsia="Times New Roman" w:hAnsi="Times New Roman" w:cs="Times New Roman"/>
+          <w:kern w:val="0"/>
+          <w:lang w:eastAsia="en-IN" w:bidi="hi-IN"/>
+          <w14:ligatures w14:val="none"/>
+        </w:rPr>
+        <w:lastRenderedPageBreak/>
+        <w:t xml:space="preserve">The corrupted board state gradually accumulated until move generation eventually produced impossible moves, which then caused </w:t>
+      </w:r>
+      <w:proofErr w:type="spellStart"/>
+      <w:proofErr w:type="gramStart"/>
+      <w:r>
+        <w:rPr>
+          <w:rFonts w:ascii="Times New Roman" w:eastAsia="Times New Roman" w:hAnsi="Times New Roman" w:cs="Times New Roman"/>
+          <w:kern w:val="0"/>
+          <w:lang w:eastAsia="en-IN" w:bidi="hi-IN"/>
+          <w14:ligatures w14:val="none"/>
+        </w:rPr>
+        <w:t>MakeMove</w:t>
+      </w:r>
+      <w:proofErr w:type="spellEnd"/>
+      <w:r>
+        <w:rPr>
+          <w:rFonts w:ascii="Times New Roman" w:eastAsia="Times New Roman" w:hAnsi="Times New Roman" w:cs="Times New Roman"/>
+          <w:kern w:val="0"/>
+          <w:lang w:eastAsia="en-IN" w:bidi="hi-IN"/>
+          <w14:ligatures w14:val="none"/>
+        </w:rPr>
+        <w:t>(</w:t>
+      </w:r>
+      <w:proofErr w:type="gramEnd"/>
+      <w:r>
+        <w:rPr>
+          <w:rFonts w:ascii="Times New Roman" w:eastAsia="Times New Roman" w:hAnsi="Times New Roman" w:cs="Times New Roman"/>
+          <w:kern w:val="0"/>
+          <w:lang w:eastAsia="en-IN" w:bidi="hi-IN"/>
+          <w14:ligatures w14:val="none"/>
+        </w:rPr>
+        <w:t>) to access invalid data and crash.</w:t>
+      </w:r>
+    </w:p>
+    <w:p>
+      <w:pPr>
+        <w:spacing w:before="100" w:beforeAutospacing="1" w:after="100" w:afterAutospacing="1" w:line="240" w:lineRule="auto"/>
+        <w:outlineLvl w:val="2"/>
+        <w:rPr>
+          <w:rFonts w:ascii="Times New Roman" w:eastAsia="Times New Roman" w:hAnsi="Times New Roman" w:cs="Times New Roman"/>
+          <w:b/>
+          <w:bCs/>
+          <w:kern w:val="0"/>
+          <w:sz w:val="24"/>
+          <w:szCs w:val="24"/>
+          <w:lang w:eastAsia="en-IN" w:bidi="hi-IN"/>
+          <w14:ligatures w14:val="none"/>
+        </w:rPr>
+      </w:pPr>
+      <w:r>
+        <w:rPr>
+          <w:rFonts w:ascii="Times New Roman" w:eastAsia="Times New Roman" w:hAnsi="Times New Roman" w:cs="Times New Roman"/>
+          <w:b/>
+          <w:bCs/>
+          <w:kern w:val="0"/>
+          <w:sz w:val="24"/>
+          <w:szCs w:val="24"/>
+          <w:lang w:eastAsia="en-IN" w:bidi="hi-IN"/>
+          <w14:ligatures w14:val="none"/>
+        </w:rPr>
+        <w:t>Root Cause</w:t>
+      </w:r>
+    </w:p>
+    <w:p>
+      <w:pPr>
+        <w:spacing w:before="100" w:beforeAutospacing="1" w:after="100" w:afterAutospacing="1" w:line="240" w:lineRule="auto"/>
+        <w:rPr>
+          <w:rFonts w:ascii="Times New Roman" w:eastAsia="Times New Roman" w:hAnsi="Times New Roman" w:cs="Times New Roman"/>
+          <w:kern w:val="0"/>
+          <w:lang w:eastAsia="en-IN" w:bidi="hi-IN"/>
+          <w14:ligatures w14:val="none"/>
+        </w:rPr>
+      </w:pPr>
+      <w:r>
+        <w:rPr>
+          <w:rFonts w:ascii="Times New Roman" w:eastAsia="Times New Roman" w:hAnsi="Times New Roman" w:cs="Times New Roman"/>
+          <w:kern w:val="0"/>
+          <w:lang w:eastAsia="en-IN" w:bidi="hi-IN"/>
+          <w14:ligatures w14:val="none"/>
+        </w:rPr>
+        <w:t>The bug was located inside the FEN parser.</w:t>
+      </w:r>
+    </w:p>
+    <w:p>
+      <w:pPr>
+        <w:spacing w:before="100" w:beforeAutospacing="1" w:after="100" w:afterAutospacing="1" w:line="240" w:lineRule="auto"/>
+        <w:rPr>
+          <w:rFonts w:ascii="Times New Roman" w:eastAsia="Times New Roman" w:hAnsi="Times New Roman" w:cs="Times New Roman"/>
+          <w:kern w:val="0"/>
+          <w:lang w:eastAsia="en-IN" w:bidi="hi-IN"/>
+          <w14:ligatures w14:val="none"/>
+        </w:rPr>
+      </w:pPr>
+      <w:r>
+        <w:rPr>
+          <w:rFonts w:ascii="Times New Roman" w:eastAsia="Times New Roman" w:hAnsi="Times New Roman" w:cs="Times New Roman"/>
+          <w:kern w:val="0"/>
+          <w:lang w:eastAsia="en-IN" w:bidi="hi-IN"/>
+          <w14:ligatures w14:val="none"/>
+        </w:rPr>
+        <w:t>Ironically, the FEN parser was one of the first pieces of code written for the project, dating back to the first day of development.</w:t>
+      </w:r>
+    </w:p>
+    <w:p>
+      <w:pPr>
+        <w:spacing w:before="100" w:beforeAutospacing="1" w:after="100" w:afterAutospacing="1" w:line="240" w:lineRule="auto"/>
+        <w:rPr>
+          <w:rFonts w:ascii="Times New Roman" w:eastAsia="Times New Roman" w:hAnsi="Times New Roman" w:cs="Times New Roman"/>
+          <w:kern w:val="0"/>
+          <w:lang w:eastAsia="en-IN" w:bidi="hi-IN"/>
+          <w14:ligatures w14:val="none"/>
+        </w:rPr>
+      </w:pPr>
+      <w:r>
+        <w:rPr>
+          <w:rFonts w:ascii="Times New Roman" w:eastAsia="Times New Roman" w:hAnsi="Times New Roman" w:cs="Times New Roman"/>
+          <w:kern w:val="0"/>
+          <w:lang w:eastAsia="en-IN" w:bidi="hi-IN"/>
+          <w14:ligatures w14:val="none"/>
+        </w:rPr>
+        <w:t xml:space="preserve">Because it had existed for so long and appeared simple compared to search algorithms, it was rarely considered during debugging. Instead, attention remained focused on recently implemented systems such as </w:t>
+      </w:r>
+      <w:proofErr w:type="spellStart"/>
+      <w:r>
+        <w:rPr>
+          <w:rFonts w:ascii="Times New Roman" w:eastAsia="Times New Roman" w:hAnsi="Times New Roman" w:cs="Times New Roman"/>
+          <w:kern w:val="0"/>
+          <w:lang w:eastAsia="en-IN" w:bidi="hi-IN"/>
+          <w14:ligatures w14:val="none"/>
+        </w:rPr>
+        <w:t>Negamax</w:t>
+      </w:r>
+      <w:proofErr w:type="spellEnd"/>
+      <w:r>
+        <w:rPr>
+          <w:rFonts w:ascii="Times New Roman" w:eastAsia="Times New Roman" w:hAnsi="Times New Roman" w:cs="Times New Roman"/>
+          <w:kern w:val="0"/>
+          <w:lang w:eastAsia="en-IN" w:bidi="hi-IN"/>
+          <w14:ligatures w14:val="none"/>
+        </w:rPr>
+        <w:t>, Quiescence Search, and UCI integration.</w:t>
+      </w:r>
+    </w:p>
+    <w:p>
+      <w:pPr>
+        <w:spacing w:before="100" w:beforeAutospacing="1" w:after="100" w:afterAutospacing="1" w:line="240" w:lineRule="auto"/>
+        <w:rPr>
+          <w:rFonts w:ascii="Times New Roman" w:eastAsia="Times New Roman" w:hAnsi="Times New Roman" w:cs="Times New Roman"/>
+          <w:kern w:val="0"/>
+          <w:lang w:eastAsia="en-IN" w:bidi="hi-IN"/>
+          <w14:ligatures w14:val="none"/>
+        </w:rPr>
+      </w:pPr>
+      <w:r>
+        <w:rPr>
+          <w:rFonts w:ascii="Times New Roman" w:eastAsia="Times New Roman" w:hAnsi="Times New Roman" w:cs="Times New Roman"/>
+          <w:kern w:val="0"/>
+          <w:lang w:eastAsia="en-IN" w:bidi="hi-IN"/>
+          <w14:ligatures w14:val="none"/>
+        </w:rPr>
+        <w:t>The actual fix was straightforward:</w:t>
+      </w:r>
+    </w:p>
+    <w:p>
+      <w:pPr>
+        <w:spacing w:before="100" w:beforeAutospacing="1" w:after="100" w:afterAutospacing="1" w:line="240" w:lineRule="auto"/>
+        <w:rPr>
+          <w:rFonts w:ascii="Times New Roman" w:eastAsia="Times New Roman" w:hAnsi="Times New Roman" w:cs="Times New Roman"/>
+          <w:kern w:val="0"/>
+          <w:lang w:eastAsia="en-IN" w:bidi="hi-IN"/>
+          <w14:ligatures w14:val="none"/>
+        </w:rPr>
+      </w:pPr>
+      <w:r>
+        <w:rPr>
+          <w:rFonts w:ascii="Times New Roman" w:eastAsia="Times New Roman" w:hAnsi="Times New Roman" w:cs="Times New Roman"/>
+          <w:kern w:val="0"/>
+          <w:lang w:eastAsia="en-IN" w:bidi="hi-IN"/>
+          <w14:ligatures w14:val="none"/>
+        </w:rPr>
+        <w:t>Before loading a new FEN position, all piece and occupancy bitboards must be cleared.</w:t>
+      </w:r>
+    </w:p>
+    <w:p>
+      <w:pPr>
+        <w:spacing w:before="100" w:beforeAutospacing="1" w:after="100" w:afterAutospacing="1" w:line="240" w:lineRule="auto"/>
+        <w:outlineLvl w:val="2"/>
+        <w:rPr>
+          <w:rFonts w:ascii="Times New Roman" w:eastAsia="Times New Roman" w:hAnsi="Times New Roman" w:cs="Times New Roman"/>
+          <w:b/>
+          <w:bCs/>
+          <w:kern w:val="0"/>
+          <w:sz w:val="24"/>
+          <w:szCs w:val="24"/>
+          <w:lang w:eastAsia="en-IN" w:bidi="hi-IN"/>
+          <w14:ligatures w14:val="none"/>
+        </w:rPr>
+      </w:pPr>
+      <w:r>
+        <w:rPr>
+          <w:rFonts w:ascii="Times New Roman" w:eastAsia="Times New Roman" w:hAnsi="Times New Roman" w:cs="Times New Roman"/>
+          <w:b/>
+          <w:bCs/>
+          <w:kern w:val="0"/>
+          <w:sz w:val="24"/>
+          <w:szCs w:val="24"/>
+          <w:lang w:eastAsia="en-IN" w:bidi="hi-IN"/>
+          <w14:ligatures w14:val="none"/>
+        </w:rPr>
+        <w:t>Lessons Learned</w:t>
+      </w:r>
+    </w:p>
+    <w:p>
+      <w:pPr>
+        <w:spacing w:before="100" w:beforeAutospacing="1" w:after="100" w:afterAutospacing="1" w:line="240" w:lineRule="auto"/>
+        <w:rPr>
+          <w:rFonts w:ascii="Times New Roman" w:eastAsia="Times New Roman" w:hAnsi="Times New Roman" w:cs="Times New Roman"/>
+          <w:kern w:val="0"/>
+          <w:lang w:eastAsia="en-IN" w:bidi="hi-IN"/>
+          <w14:ligatures w14:val="none"/>
+        </w:rPr>
+      </w:pPr>
+      <w:r>
+        <w:rPr>
+          <w:rFonts w:ascii="Times New Roman" w:eastAsia="Times New Roman" w:hAnsi="Times New Roman" w:cs="Times New Roman"/>
+          <w:kern w:val="0"/>
+          <w:lang w:eastAsia="en-IN" w:bidi="hi-IN"/>
+          <w14:ligatures w14:val="none"/>
+        </w:rPr>
+        <w:t>This bug provided several valuable lessons:</w:t>
+      </w:r>
+    </w:p>
+    <w:p>
+      <w:pPr>
+        <w:numPr>
+          <w:ilvl w:val="0"/>
+          <w:numId w:val="14"/>
+        </w:numPr>
+        <w:spacing w:before="100" w:beforeAutospacing="1" w:after="100" w:afterAutospacing="1" w:line="240" w:lineRule="auto"/>
+        <w:rPr>
+          <w:rFonts w:ascii="Times New Roman" w:eastAsia="Times New Roman" w:hAnsi="Times New Roman" w:cs="Times New Roman"/>
+          <w:kern w:val="0"/>
+          <w:lang w:eastAsia="en-IN" w:bidi="hi-IN"/>
+          <w14:ligatures w14:val="none"/>
+        </w:rPr>
+      </w:pPr>
+      <w:r>
+        <w:rPr>
+          <w:rFonts w:ascii="Times New Roman" w:eastAsia="Times New Roman" w:hAnsi="Times New Roman" w:cs="Times New Roman"/>
+          <w:kern w:val="0"/>
+          <w:lang w:eastAsia="en-IN" w:bidi="hi-IN"/>
+          <w14:ligatures w14:val="none"/>
+        </w:rPr>
+        <w:t>The location of a crash is not necessarily the source of the bug.</w:t>
+      </w:r>
+    </w:p>
+    <w:p>
+      <w:pPr>
+        <w:numPr>
+          <w:ilvl w:val="0"/>
+          <w:numId w:val="14"/>
+        </w:numPr>
+        <w:spacing w:before="100" w:beforeAutospacing="1" w:after="100" w:afterAutospacing="1" w:line="240" w:lineRule="auto"/>
+        <w:rPr>
+          <w:rFonts w:ascii="Times New Roman" w:eastAsia="Times New Roman" w:hAnsi="Times New Roman" w:cs="Times New Roman"/>
+          <w:kern w:val="0"/>
+          <w:lang w:eastAsia="en-IN" w:bidi="hi-IN"/>
+          <w14:ligatures w14:val="none"/>
+        </w:rPr>
+      </w:pPr>
+      <w:r>
+        <w:rPr>
+          <w:rFonts w:ascii="Times New Roman" w:eastAsia="Times New Roman" w:hAnsi="Times New Roman" w:cs="Times New Roman"/>
+          <w:kern w:val="0"/>
+          <w:lang w:eastAsia="en-IN" w:bidi="hi-IN"/>
+          <w14:ligatures w14:val="none"/>
+        </w:rPr>
+        <w:t>Long-standing code can be just as dangerous as newly written code.</w:t>
+      </w:r>
+    </w:p>
+    <w:p>
+      <w:pPr>
+        <w:numPr>
+          <w:ilvl w:val="0"/>
+          <w:numId w:val="14"/>
+        </w:numPr>
+        <w:spacing w:before="100" w:beforeAutospacing="1" w:after="100" w:afterAutospacing="1" w:line="240" w:lineRule="auto"/>
+        <w:rPr>
+          <w:rFonts w:ascii="Times New Roman" w:eastAsia="Times New Roman" w:hAnsi="Times New Roman" w:cs="Times New Roman"/>
+          <w:kern w:val="0"/>
+          <w:lang w:eastAsia="en-IN" w:bidi="hi-IN"/>
+          <w14:ligatures w14:val="none"/>
+        </w:rPr>
+      </w:pPr>
+      <w:r>
+        <w:rPr>
+          <w:rFonts w:ascii="Times New Roman" w:eastAsia="Times New Roman" w:hAnsi="Times New Roman" w:cs="Times New Roman"/>
+          <w:kern w:val="0"/>
+          <w:lang w:eastAsia="en-IN" w:bidi="hi-IN"/>
+          <w14:ligatures w14:val="none"/>
+        </w:rPr>
+        <w:t xml:space="preserve">Passing </w:t>
+      </w:r>
+      <w:proofErr w:type="spellStart"/>
+      <w:r>
+        <w:rPr>
+          <w:rFonts w:ascii="Times New Roman" w:eastAsia="Times New Roman" w:hAnsi="Times New Roman" w:cs="Times New Roman"/>
+          <w:kern w:val="0"/>
+          <w:lang w:eastAsia="en-IN" w:bidi="hi-IN"/>
+          <w14:ligatures w14:val="none"/>
+        </w:rPr>
+        <w:t>Perft</w:t>
+      </w:r>
+      <w:proofErr w:type="spellEnd"/>
+      <w:r>
+        <w:rPr>
+          <w:rFonts w:ascii="Times New Roman" w:eastAsia="Times New Roman" w:hAnsi="Times New Roman" w:cs="Times New Roman"/>
+          <w:kern w:val="0"/>
+          <w:lang w:eastAsia="en-IN" w:bidi="hi-IN"/>
+          <w14:ligatures w14:val="none"/>
+        </w:rPr>
+        <w:t xml:space="preserve"> tests significantly increases confidence in move generation correctness.</w:t>
+      </w:r>
+    </w:p>
+    <w:p>
+      <w:pPr>
+        <w:numPr>
+          <w:ilvl w:val="0"/>
+          <w:numId w:val="14"/>
+        </w:numPr>
+        <w:spacing w:before="100" w:beforeAutospacing="1" w:after="100" w:afterAutospacing="1" w:line="240" w:lineRule="auto"/>
+        <w:rPr>
+          <w:rFonts w:ascii="Times New Roman" w:eastAsia="Times New Roman" w:hAnsi="Times New Roman" w:cs="Times New Roman"/>
+          <w:kern w:val="0"/>
+          <w:lang w:eastAsia="en-IN" w:bidi="hi-IN"/>
+          <w14:ligatures w14:val="none"/>
+        </w:rPr>
+      </w:pPr>
+      <w:r>
+        <w:rPr>
+          <w:rFonts w:ascii="Times New Roman" w:eastAsia="Times New Roman" w:hAnsi="Times New Roman" w:cs="Times New Roman"/>
+          <w:kern w:val="0"/>
+          <w:lang w:eastAsia="en-IN" w:bidi="hi-IN"/>
+          <w14:ligatures w14:val="none"/>
+        </w:rPr>
+        <w:t>If a feature works manually but fails through UCI, the interface layer should be investigated early.</w:t>
+      </w:r>
+    </w:p>
+    <w:p>
+      <w:pPr>
+        <w:numPr>
+          <w:ilvl w:val="0"/>
+          <w:numId w:val="14"/>
+        </w:numPr>
+        <w:spacing w:before="100" w:beforeAutospacing="1" w:after="100" w:afterAutospacing="1" w:line="240" w:lineRule="auto"/>
+        <w:rPr>
+          <w:rFonts w:ascii="Times New Roman" w:eastAsia="Times New Roman" w:hAnsi="Times New Roman" w:cs="Times New Roman"/>
+          <w:kern w:val="0"/>
+          <w:lang w:eastAsia="en-IN" w:bidi="hi-IN"/>
+          <w14:ligatures w14:val="none"/>
+        </w:rPr>
+      </w:pPr>
+      <w:r>
+        <w:rPr>
+          <w:rFonts w:ascii="Times New Roman" w:eastAsia="Times New Roman" w:hAnsi="Times New Roman" w:cs="Times New Roman"/>
+          <w:kern w:val="0"/>
+          <w:lang w:eastAsia="en-IN" w:bidi="hi-IN"/>
+          <w14:ligatures w14:val="none"/>
+        </w:rPr>
+        <w:t>Printing board states is often more valuable than printing search information.</w:t>
+      </w:r>
+    </w:p>
+    <w:p>
+      <w:pPr>
+        <w:spacing w:before="100" w:beforeAutospacing="1" w:after="100" w:afterAutospacing="1" w:line="240" w:lineRule="auto"/>
+        <w:rPr>
+          <w:rFonts w:ascii="Times New Roman" w:eastAsia="Times New Roman" w:hAnsi="Times New Roman" w:cs="Times New Roman"/>
+          <w:kern w:val="0"/>
+          <w:lang w:eastAsia="en-IN" w:bidi="hi-IN"/>
+          <w14:ligatures w14:val="none"/>
+        </w:rPr>
+      </w:pPr>
+      <w:r>
+        <w:rPr>
+          <w:rFonts w:ascii="Times New Roman" w:eastAsia="Times New Roman" w:hAnsi="Times New Roman" w:cs="Times New Roman"/>
+          <w:kern w:val="0"/>
+          <w:lang w:eastAsia="en-IN" w:bidi="hi-IN"/>
+          <w14:ligatures w14:val="none"/>
+        </w:rPr>
+        <w:t>Most importantly, the bug demonstrated how corruption introduced in one subsystem can remain hidden until it manifests much later in an entirely different area of the engine.</w:t>
+      </w:r>
+    </w:p>
+    <w:p>
+      <w:pPr>
+        <w:spacing w:before="100" w:beforeAutospacing="1" w:after="100" w:afterAutospacing="1" w:line="240" w:lineRule="auto"/>
+        <w:rPr>
+          <w:rFonts w:ascii="Times New Roman" w:eastAsia="Times New Roman" w:hAnsi="Times New Roman" w:cs="Times New Roman"/>
+          <w:kern w:val="0"/>
+          <w:lang w:eastAsia="en-IN" w:bidi="hi-IN"/>
+          <w14:ligatures w14:val="none"/>
+        </w:rPr>
+      </w:pPr>
+      <w:r>
+        <w:rPr>
+          <w:rFonts w:ascii="Times New Roman" w:eastAsia="Times New Roman" w:hAnsi="Times New Roman" w:cs="Times New Roman"/>
+          <w:kern w:val="0"/>
+          <w:lang w:eastAsia="en-IN" w:bidi="hi-IN"/>
+          <w14:ligatures w14:val="none"/>
+        </w:rPr>
+        <w:t>Although the fix itself was simple, locating the problem required two days of debugging and ultimately became the most memorable bug encountered during development of Arbor v0.1.0.</w:t>
+      </w:r>
+    </w:p>
+    <w:p>
+      <w:pPr>
+        <w:rPr>
+          <w:sz w:val="16"/>
+          <w:szCs w:val="16"/>
+          <w:lang w:val="en-US"/>
+        </w:rPr>
+      </w:pPr>
+      <w:r>
+        <w:rPr>
+          <w:sz w:val="16"/>
+          <w:szCs w:val="16"/>
+          <w:lang w:val="en-US"/>
+        </w:rPr>
+        <w:br w:type="page"/>
+      </w:r>
+    </w:p>
+    <w:p>
+      <w:pPr>
+        <w:spacing w:before="100" w:beforeAutospacing="1" w:after="100" w:afterAutospacing="1" w:line="240" w:lineRule="auto"/>
+        <w:outlineLvl w:val="1"/>
+        <w:rPr>
+          <w:rFonts w:ascii="Times New Roman" w:eastAsia="Times New Roman" w:hAnsi="Times New Roman" w:cs="Times New Roman"/>
+          <w:b/>
+          <w:bCs/>
+          <w:kern w:val="0"/>
+          <w:sz w:val="32"/>
+          <w:szCs w:val="32"/>
+          <w:lang w:eastAsia="en-IN" w:bidi="hi-IN"/>
+          <w14:ligatures w14:val="none"/>
+        </w:rPr>
+      </w:pPr>
+      <w:r>
+        <w:rPr>
+          <w:rFonts w:ascii="Times New Roman" w:eastAsia="Times New Roman" w:hAnsi="Times New Roman" w:cs="Times New Roman"/>
+          <w:b/>
+          <w:bCs/>
+          <w:kern w:val="0"/>
+          <w:sz w:val="32"/>
+          <w:szCs w:val="32"/>
+          <w:lang w:eastAsia="en-IN" w:bidi="hi-IN"/>
+          <w14:ligatures w14:val="none"/>
+        </w:rPr>
+        <w:lastRenderedPageBreak/>
+        <w:t>Arbor v0.1.0 Testing Results</w:t>
+      </w:r>
+    </w:p>
+    <w:p>
+      <w:pPr>
+        <w:spacing w:before="100" w:beforeAutospacing="1" w:after="100" w:afterAutospacing="1" w:line="240" w:lineRule="auto"/>
+        <w:outlineLvl w:val="2"/>
+        <w:rPr>
+          <w:rFonts w:ascii="Times New Roman" w:eastAsia="Times New Roman" w:hAnsi="Times New Roman" w:cs="Times New Roman"/>
+          <w:b/>
+          <w:bCs/>
+          <w:kern w:val="0"/>
+          <w:sz w:val="24"/>
+          <w:szCs w:val="24"/>
+          <w:lang w:eastAsia="en-IN" w:bidi="hi-IN"/>
+          <w14:ligatures w14:val="none"/>
+        </w:rPr>
+      </w:pPr>
+      <w:r>
+        <w:rPr>
+          <w:rFonts w:ascii="Times New Roman" w:eastAsia="Times New Roman" w:hAnsi="Times New Roman" w:cs="Times New Roman"/>
+          <w:b/>
+          <w:bCs/>
+          <w:kern w:val="0"/>
+          <w:sz w:val="24"/>
+          <w:szCs w:val="24"/>
+          <w:lang w:eastAsia="en-IN" w:bidi="hi-IN"/>
+          <w14:ligatures w14:val="none"/>
+        </w:rPr>
+        <w:t>Self-Play Testing</w:t>
+      </w:r>
+    </w:p>
+    <w:p>
+      <w:pPr>
+        <w:spacing w:before="100" w:beforeAutospacing="1" w:after="100" w:afterAutospacing="1" w:line="240" w:lineRule="auto"/>
+        <w:rPr>
+          <w:rFonts w:ascii="Times New Roman" w:eastAsia="Times New Roman" w:hAnsi="Times New Roman" w:cs="Times New Roman"/>
+          <w:kern w:val="0"/>
+          <w:lang w:eastAsia="en-IN" w:bidi="hi-IN"/>
+          <w14:ligatures w14:val="none"/>
+        </w:rPr>
+      </w:pPr>
+      <w:r>
+        <w:rPr>
+          <w:rFonts w:ascii="Times New Roman" w:eastAsia="Times New Roman" w:hAnsi="Times New Roman" w:cs="Times New Roman"/>
+          <w:kern w:val="0"/>
+          <w:lang w:eastAsia="en-IN" w:bidi="hi-IN"/>
+          <w14:ligatures w14:val="none"/>
+        </w:rPr>
+        <w:t>Arbor was tested against itself in 50 consecutive games.</w:t>
+      </w:r>
+      <w:r>
+        <w:rPr>
+          <w:rFonts w:ascii="Times New Roman" w:eastAsia="Times New Roman" w:hAnsi="Times New Roman" w:cs="Times New Roman"/>
+          <w:kern w:val="0"/>
+          <w:lang w:eastAsia="en-IN" w:bidi="hi-IN"/>
+          <w14:ligatures w14:val="none"/>
+        </w:rPr>
+        <w:t xml:space="preserve"> Games can be found in </w:t>
+      </w:r>
+      <w:proofErr w:type="spellStart"/>
+      <w:proofErr w:type="gramStart"/>
+      <w:r>
+        <w:rPr>
+          <w:rFonts w:ascii="Times New Roman" w:eastAsia="Times New Roman" w:hAnsi="Times New Roman" w:cs="Times New Roman"/>
+          <w:kern w:val="0"/>
+          <w:lang w:eastAsia="en-IN" w:bidi="hi-IN"/>
+          <w14:ligatures w14:val="none"/>
+        </w:rPr>
+        <w:t>arbor_selfplay.pgn</w:t>
+      </w:r>
+      <w:proofErr w:type="spellEnd"/>
+      <w:proofErr w:type="gramEnd"/>
+    </w:p>
+    <w:p>
+      <w:pPr>
+        <w:spacing w:before="100" w:beforeAutospacing="1" w:after="100" w:afterAutospacing="1" w:line="240" w:lineRule="auto"/>
+        <w:rPr>
+          <w:rFonts w:ascii="Times New Roman" w:eastAsia="Times New Roman" w:hAnsi="Times New Roman" w:cs="Times New Roman"/>
+          <w:kern w:val="0"/>
+          <w:lang w:eastAsia="en-IN" w:bidi="hi-IN"/>
+          <w14:ligatures w14:val="none"/>
+        </w:rPr>
+      </w:pPr>
+      <w:r>
+        <w:rPr>
+          <w:rFonts w:ascii="Times New Roman" w:eastAsia="Times New Roman" w:hAnsi="Times New Roman" w:cs="Times New Roman"/>
+          <w:kern w:val="0"/>
+          <w:lang w:eastAsia="en-IN" w:bidi="hi-IN"/>
+          <w14:ligatures w14:val="none"/>
+        </w:rPr>
+        <w:t>Results:</w:t>
+      </w:r>
+    </w:p>
+    <w:p>
+      <w:pPr>
+        <w:numPr>
+          <w:ilvl w:val="0"/>
+          <w:numId w:val="15"/>
+        </w:numPr>
+        <w:spacing w:before="100" w:beforeAutospacing="1" w:after="100" w:afterAutospacing="1" w:line="240" w:lineRule="auto"/>
+        <w:rPr>
+          <w:rFonts w:ascii="Times New Roman" w:eastAsia="Times New Roman" w:hAnsi="Times New Roman" w:cs="Times New Roman"/>
+          <w:kern w:val="0"/>
+          <w:lang w:eastAsia="en-IN" w:bidi="hi-IN"/>
+          <w14:ligatures w14:val="none"/>
+        </w:rPr>
+      </w:pPr>
+      <w:r>
+        <w:rPr>
+          <w:rFonts w:ascii="Times New Roman" w:eastAsia="Times New Roman" w:hAnsi="Times New Roman" w:cs="Times New Roman"/>
+          <w:kern w:val="0"/>
+          <w:lang w:eastAsia="en-IN" w:bidi="hi-IN"/>
+          <w14:ligatures w14:val="none"/>
+        </w:rPr>
+        <w:t>Wins: 0</w:t>
+      </w:r>
+    </w:p>
+    <w:p>
+      <w:pPr>
+        <w:numPr>
+          <w:ilvl w:val="0"/>
+          <w:numId w:val="15"/>
+        </w:numPr>
+        <w:spacing w:before="100" w:beforeAutospacing="1" w:after="100" w:afterAutospacing="1" w:line="240" w:lineRule="auto"/>
+        <w:rPr>
+          <w:rFonts w:ascii="Times New Roman" w:eastAsia="Times New Roman" w:hAnsi="Times New Roman" w:cs="Times New Roman"/>
+          <w:kern w:val="0"/>
+          <w:lang w:eastAsia="en-IN" w:bidi="hi-IN"/>
+          <w14:ligatures w14:val="none"/>
+        </w:rPr>
+      </w:pPr>
+      <w:r>
+        <w:rPr>
+          <w:rFonts w:ascii="Times New Roman" w:eastAsia="Times New Roman" w:hAnsi="Times New Roman" w:cs="Times New Roman"/>
+          <w:kern w:val="0"/>
+          <w:lang w:eastAsia="en-IN" w:bidi="hi-IN"/>
+          <w14:ligatures w14:val="none"/>
+        </w:rPr>
+        <w:t>Draws: 50</w:t>
+      </w:r>
+    </w:p>
+    <w:p>
+      <w:pPr>
+        <w:numPr>
+          <w:ilvl w:val="0"/>
+          <w:numId w:val="15"/>
+        </w:numPr>
+        <w:spacing w:before="100" w:beforeAutospacing="1" w:after="100" w:afterAutospacing="1" w:line="240" w:lineRule="auto"/>
+        <w:rPr>
+          <w:rFonts w:ascii="Times New Roman" w:eastAsia="Times New Roman" w:hAnsi="Times New Roman" w:cs="Times New Roman"/>
+          <w:kern w:val="0"/>
+          <w:lang w:eastAsia="en-IN" w:bidi="hi-IN"/>
+          <w14:ligatures w14:val="none"/>
+        </w:rPr>
+      </w:pPr>
+      <w:r>
+        <w:rPr>
+          <w:rFonts w:ascii="Times New Roman" w:eastAsia="Times New Roman" w:hAnsi="Times New Roman" w:cs="Times New Roman"/>
+          <w:kern w:val="0"/>
+          <w:lang w:eastAsia="en-IN" w:bidi="hi-IN"/>
+          <w14:ligatures w14:val="none"/>
+        </w:rPr>
+        <w:t>Losses: 0</w:t>
+      </w:r>
+    </w:p>
+    <w:p>
+      <w:pPr>
+        <w:spacing w:before="100" w:beforeAutospacing="1" w:after="100" w:afterAutospacing="1" w:line="240" w:lineRule="auto"/>
+        <w:outlineLvl w:val="3"/>
+        <w:rPr>
+          <w:rFonts w:ascii="Times New Roman" w:eastAsia="Times New Roman" w:hAnsi="Times New Roman" w:cs="Times New Roman"/>
+          <w:b/>
+          <w:bCs/>
+          <w:kern w:val="0"/>
+          <w:lang w:eastAsia="en-IN" w:bidi="hi-IN"/>
+          <w14:ligatures w14:val="none"/>
+        </w:rPr>
+      </w:pPr>
+      <w:r>
+        <w:rPr>
+          <w:rFonts w:ascii="Times New Roman" w:eastAsia="Times New Roman" w:hAnsi="Times New Roman" w:cs="Times New Roman"/>
+          <w:b/>
+          <w:bCs/>
+          <w:kern w:val="0"/>
+          <w:lang w:eastAsia="en-IN" w:bidi="hi-IN"/>
+          <w14:ligatures w14:val="none"/>
+        </w:rPr>
+        <w:t>Observations</w:t>
+      </w:r>
+    </w:p>
+    <w:p>
+      <w:pPr>
+        <w:spacing w:before="100" w:beforeAutospacing="1" w:after="100" w:afterAutospacing="1" w:line="240" w:lineRule="auto"/>
+        <w:rPr>
+          <w:rFonts w:ascii="Times New Roman" w:eastAsia="Times New Roman" w:hAnsi="Times New Roman" w:cs="Times New Roman"/>
+          <w:kern w:val="0"/>
+          <w:lang w:eastAsia="en-IN" w:bidi="hi-IN"/>
+          <w14:ligatures w14:val="none"/>
+        </w:rPr>
+      </w:pPr>
+      <w:r>
+        <w:rPr>
+          <w:rFonts w:ascii="Times New Roman" w:eastAsia="Times New Roman" w:hAnsi="Times New Roman" w:cs="Times New Roman"/>
+          <w:kern w:val="0"/>
+          <w:lang w:eastAsia="en-IN" w:bidi="hi-IN"/>
+          <w14:ligatures w14:val="none"/>
+        </w:rPr>
+        <w:t>All games completed successfully without crashes or illegal move generation.</w:t>
+      </w:r>
+    </w:p>
+    <w:p>
+      <w:pPr>
+        <w:spacing w:before="100" w:beforeAutospacing="1" w:after="100" w:afterAutospacing="1" w:line="240" w:lineRule="auto"/>
+        <w:rPr>
+          <w:rFonts w:ascii="Times New Roman" w:eastAsia="Times New Roman" w:hAnsi="Times New Roman" w:cs="Times New Roman"/>
+          <w:kern w:val="0"/>
+          <w:lang w:eastAsia="en-IN" w:bidi="hi-IN"/>
+          <w14:ligatures w14:val="none"/>
+        </w:rPr>
+      </w:pPr>
+      <w:r>
+        <w:rPr>
+          <w:rFonts w:ascii="Times New Roman" w:eastAsia="Times New Roman" w:hAnsi="Times New Roman" w:cs="Times New Roman"/>
+          <w:kern w:val="0"/>
+          <w:lang w:eastAsia="en-IN" w:bidi="hi-IN"/>
+          <w14:ligatures w14:val="none"/>
+        </w:rPr>
+        <w:t>The consistent draw rate is expected when identical versions of the engine compete against one another. More importantly, these tests verified stability, repetition detection, and overall engine reliability during extended play.</w:t>
+      </w:r>
+    </w:p>
+    <w:p>
+      <w:pPr>
+        <w:spacing w:after="0" w:line="240" w:lineRule="auto"/>
+        <w:rPr>
+          <w:rFonts w:ascii="Times New Roman" w:eastAsia="Times New Roman" w:hAnsi="Times New Roman" w:cs="Times New Roman"/>
+          <w:kern w:val="0"/>
+          <w:lang w:eastAsia="en-IN" w:bidi="hi-IN"/>
+          <w14:ligatures w14:val="none"/>
+        </w:rPr>
+      </w:pPr>
+      <w:r>
+        <w:rPr>
+          <w:rFonts w:ascii="Times New Roman" w:eastAsia="Times New Roman" w:hAnsi="Times New Roman" w:cs="Times New Roman"/>
+          <w:kern w:val="0"/>
+          <w:lang w:eastAsia="en-IN" w:bidi="hi-IN"/>
+          <w14:ligatures w14:val="none"/>
+        </w:rPr>
+        <w:pict w14:anchorId="03991D62">
+          <v:rect id="_x0000_i1049" style="width:0;height:1.5pt" o:hralign="center" o:hrstd="t" o:hr="t" fillcolor="#a0a0a0" stroked="f"/>
+        </w:pict>
+      </w:r>
+    </w:p>
+    <w:p>
+      <w:pPr>
+        <w:spacing w:before="100" w:beforeAutospacing="1" w:after="100" w:afterAutospacing="1" w:line="240" w:lineRule="auto"/>
+        <w:outlineLvl w:val="2"/>
+        <w:rPr>
+          <w:rFonts w:ascii="Times New Roman" w:eastAsia="Times New Roman" w:hAnsi="Times New Roman" w:cs="Times New Roman"/>
+          <w:b/>
+          <w:bCs/>
+          <w:kern w:val="0"/>
+          <w:sz w:val="24"/>
+          <w:szCs w:val="24"/>
+          <w:lang w:eastAsia="en-IN" w:bidi="hi-IN"/>
+          <w14:ligatures w14:val="none"/>
+        </w:rPr>
+      </w:pPr>
+      <w:r>
+        <w:rPr>
+          <w:rFonts w:ascii="Times New Roman" w:eastAsia="Times New Roman" w:hAnsi="Times New Roman" w:cs="Times New Roman"/>
+          <w:b/>
+          <w:bCs/>
+          <w:kern w:val="0"/>
+          <w:sz w:val="24"/>
+          <w:szCs w:val="24"/>
+          <w:lang w:eastAsia="en-IN" w:bidi="hi-IN"/>
+          <w14:ligatures w14:val="none"/>
+        </w:rPr>
+        <w:t>Stockfish Testing</w:t>
+      </w:r>
+    </w:p>
+    <w:p>
+      <w:pPr>
+        <w:spacing w:before="100" w:beforeAutospacing="1" w:after="100" w:afterAutospacing="1" w:line="240" w:lineRule="auto"/>
+        <w:rPr>
+          <w:rFonts w:ascii="Times New Roman" w:eastAsia="Times New Roman" w:hAnsi="Times New Roman" w:cs="Times New Roman"/>
+          <w:kern w:val="0"/>
+          <w:lang w:eastAsia="en-IN" w:bidi="hi-IN"/>
+          <w14:ligatures w14:val="none"/>
+        </w:rPr>
+      </w:pPr>
+      <w:r>
+        <w:rPr>
+          <w:rFonts w:ascii="Times New Roman" w:eastAsia="Times New Roman" w:hAnsi="Times New Roman" w:cs="Times New Roman"/>
+          <w:kern w:val="0"/>
+          <w:lang w:eastAsia="en-IN" w:bidi="hi-IN"/>
+          <w14:ligatures w14:val="none"/>
+        </w:rPr>
+        <w:t>Arbor played 100 games against Stockfish with Stockfish restricted to a fixed search depth of 6 plies.</w:t>
+      </w:r>
+      <w:r>
+        <w:rPr>
+          <w:rFonts w:ascii="Times New Roman" w:eastAsia="Times New Roman" w:hAnsi="Times New Roman" w:cs="Times New Roman"/>
+          <w:kern w:val="0"/>
+          <w:lang w:eastAsia="en-IN" w:bidi="hi-IN"/>
+          <w14:ligatures w14:val="none"/>
+        </w:rPr>
+        <w:t xml:space="preserve"> Games can be found in </w:t>
+      </w:r>
+      <w:proofErr w:type="spellStart"/>
+      <w:proofErr w:type="gramStart"/>
+      <w:r>
+        <w:rPr>
+          <w:rFonts w:ascii="Times New Roman" w:eastAsia="Times New Roman" w:hAnsi="Times New Roman" w:cs="Times New Roman"/>
+          <w:kern w:val="0"/>
+          <w:lang w:eastAsia="en-IN" w:bidi="hi-IN"/>
+          <w14:ligatures w14:val="none"/>
+        </w:rPr>
+        <w:t>arbor_stockfish_tournament_results.pgn</w:t>
+      </w:r>
+      <w:proofErr w:type="spellEnd"/>
+      <w:proofErr w:type="gramEnd"/>
+    </w:p>
+    <w:p>
+      <w:pPr>
+        <w:spacing w:before="100" w:beforeAutospacing="1" w:after="100" w:afterAutospacing="1" w:line="240" w:lineRule="auto"/>
+        <w:rPr>
+          <w:rFonts w:ascii="Times New Roman" w:eastAsia="Times New Roman" w:hAnsi="Times New Roman" w:cs="Times New Roman"/>
+          <w:kern w:val="0"/>
+          <w:lang w:eastAsia="en-IN" w:bidi="hi-IN"/>
+          <w14:ligatures w14:val="none"/>
+        </w:rPr>
+      </w:pPr>
+      <w:r>
+        <w:rPr>
+          <w:rFonts w:ascii="Times New Roman" w:eastAsia="Times New Roman" w:hAnsi="Times New Roman" w:cs="Times New Roman"/>
+          <w:kern w:val="0"/>
+          <w:lang w:eastAsia="en-IN" w:bidi="hi-IN"/>
+          <w14:ligatures w14:val="none"/>
+        </w:rPr>
+        <w:t>Results:</w:t>
+      </w:r>
+    </w:p>
+    <w:p>
+      <w:pPr>
+        <w:numPr>
+          <w:ilvl w:val="0"/>
+          <w:numId w:val="16"/>
+        </w:numPr>
+        <w:spacing w:before="100" w:beforeAutospacing="1" w:after="100" w:afterAutospacing="1" w:line="240" w:lineRule="auto"/>
+        <w:rPr>
+          <w:rFonts w:ascii="Times New Roman" w:eastAsia="Times New Roman" w:hAnsi="Times New Roman" w:cs="Times New Roman"/>
+          <w:kern w:val="0"/>
+          <w:lang w:eastAsia="en-IN" w:bidi="hi-IN"/>
+          <w14:ligatures w14:val="none"/>
+        </w:rPr>
+      </w:pPr>
+      <w:r>
+        <w:rPr>
+          <w:rFonts w:ascii="Times New Roman" w:eastAsia="Times New Roman" w:hAnsi="Times New Roman" w:cs="Times New Roman"/>
+          <w:kern w:val="0"/>
+          <w:lang w:eastAsia="en-IN" w:bidi="hi-IN"/>
+          <w14:ligatures w14:val="none"/>
+        </w:rPr>
+        <w:t>Wins: 2</w:t>
+      </w:r>
+    </w:p>
+    <w:p>
+      <w:pPr>
+        <w:numPr>
+          <w:ilvl w:val="0"/>
+          <w:numId w:val="16"/>
+        </w:numPr>
+        <w:spacing w:before="100" w:beforeAutospacing="1" w:after="100" w:afterAutospacing="1" w:line="240" w:lineRule="auto"/>
+        <w:rPr>
+          <w:rFonts w:ascii="Times New Roman" w:eastAsia="Times New Roman" w:hAnsi="Times New Roman" w:cs="Times New Roman"/>
+          <w:kern w:val="0"/>
+          <w:lang w:eastAsia="en-IN" w:bidi="hi-IN"/>
+          <w14:ligatures w14:val="none"/>
+        </w:rPr>
+      </w:pPr>
+      <w:r>
+        <w:rPr>
+          <w:rFonts w:ascii="Times New Roman" w:eastAsia="Times New Roman" w:hAnsi="Times New Roman" w:cs="Times New Roman"/>
+          <w:kern w:val="0"/>
+          <w:lang w:eastAsia="en-IN" w:bidi="hi-IN"/>
+          <w14:ligatures w14:val="none"/>
+        </w:rPr>
+        <w:t>Draws: 27</w:t>
+      </w:r>
+    </w:p>
+    <w:p>
+      <w:pPr>
+        <w:numPr>
+          <w:ilvl w:val="0"/>
+          <w:numId w:val="16"/>
+        </w:numPr>
+        <w:spacing w:before="100" w:beforeAutospacing="1" w:after="100" w:afterAutospacing="1" w:line="240" w:lineRule="auto"/>
+        <w:rPr>
+          <w:rFonts w:ascii="Times New Roman" w:eastAsia="Times New Roman" w:hAnsi="Times New Roman" w:cs="Times New Roman"/>
+          <w:kern w:val="0"/>
+          <w:lang w:eastAsia="en-IN" w:bidi="hi-IN"/>
+          <w14:ligatures w14:val="none"/>
+        </w:rPr>
+      </w:pPr>
+      <w:r>
+        <w:rPr>
+          <w:rFonts w:ascii="Times New Roman" w:eastAsia="Times New Roman" w:hAnsi="Times New Roman" w:cs="Times New Roman"/>
+          <w:kern w:val="0"/>
+          <w:lang w:eastAsia="en-IN" w:bidi="hi-IN"/>
+          <w14:ligatures w14:val="none"/>
+        </w:rPr>
+        <w:t>Losses: 71</w:t>
+      </w:r>
+    </w:p>
+    <w:p>
+      <w:pPr>
+        <w:spacing w:before="100" w:beforeAutospacing="1" w:after="100" w:afterAutospacing="1" w:line="240" w:lineRule="auto"/>
+        <w:outlineLvl w:val="3"/>
+        <w:rPr>
+          <w:rFonts w:ascii="Times New Roman" w:eastAsia="Times New Roman" w:hAnsi="Times New Roman" w:cs="Times New Roman"/>
+          <w:b/>
+          <w:bCs/>
+          <w:kern w:val="0"/>
+          <w:lang w:eastAsia="en-IN" w:bidi="hi-IN"/>
+          <w14:ligatures w14:val="none"/>
+        </w:rPr>
+      </w:pPr>
+      <w:r>
+        <w:rPr>
+          <w:rFonts w:ascii="Times New Roman" w:eastAsia="Times New Roman" w:hAnsi="Times New Roman" w:cs="Times New Roman"/>
+          <w:b/>
+          <w:bCs/>
+          <w:kern w:val="0"/>
+          <w:lang w:eastAsia="en-IN" w:bidi="hi-IN"/>
+          <w14:ligatures w14:val="none"/>
+        </w:rPr>
+        <w:t>Observations</w:t>
+      </w:r>
+    </w:p>
+    <w:p>
+      <w:pPr>
+        <w:spacing w:before="100" w:beforeAutospacing="1" w:after="100" w:afterAutospacing="1" w:line="240" w:lineRule="auto"/>
+        <w:rPr>
+          <w:rFonts w:ascii="Times New Roman" w:eastAsia="Times New Roman" w:hAnsi="Times New Roman" w:cs="Times New Roman"/>
+          <w:kern w:val="0"/>
+          <w:lang w:eastAsia="en-IN" w:bidi="hi-IN"/>
+          <w14:ligatures w14:val="none"/>
+        </w:rPr>
+      </w:pPr>
+      <w:r>
+        <w:rPr>
+          <w:rFonts w:ascii="Times New Roman" w:eastAsia="Times New Roman" w:hAnsi="Times New Roman" w:cs="Times New Roman"/>
+          <w:kern w:val="0"/>
+          <w:lang w:eastAsia="en-IN" w:bidi="hi-IN"/>
+          <w14:ligatures w14:val="none"/>
+        </w:rPr>
+        <w:t>Despite lacking many modern search optimizations and evaluation features, Arbor was able to avoid defeat in 29% of games.</w:t>
+      </w:r>
+    </w:p>
+    <w:p>
+      <w:pPr>
+        <w:spacing w:before="100" w:beforeAutospacing="1" w:after="100" w:afterAutospacing="1" w:line="240" w:lineRule="auto"/>
+        <w:rPr>
+          <w:rFonts w:ascii="Times New Roman" w:eastAsia="Times New Roman" w:hAnsi="Times New Roman" w:cs="Times New Roman"/>
+          <w:kern w:val="0"/>
+          <w:lang w:eastAsia="en-IN" w:bidi="hi-IN"/>
+          <w14:ligatures w14:val="none"/>
+        </w:rPr>
+      </w:pPr>
+      <w:r>
+        <w:rPr>
+          <w:rFonts w:ascii="Times New Roman" w:eastAsia="Times New Roman" w:hAnsi="Times New Roman" w:cs="Times New Roman"/>
+          <w:kern w:val="0"/>
+          <w:lang w:eastAsia="en-IN" w:bidi="hi-IN"/>
+          <w14:ligatures w14:val="none"/>
+        </w:rPr>
+        <w:t xml:space="preserve">The engine occasionally demonstrated strong tactical play and </w:t>
+      </w:r>
+      <w:proofErr w:type="gramStart"/>
+      <w:r>
+        <w:rPr>
+          <w:rFonts w:ascii="Times New Roman" w:eastAsia="Times New Roman" w:hAnsi="Times New Roman" w:cs="Times New Roman"/>
+          <w:kern w:val="0"/>
+          <w:lang w:eastAsia="en-IN" w:bidi="hi-IN"/>
+          <w14:ligatures w14:val="none"/>
+        </w:rPr>
+        <w:t>was capable of holding</w:t>
+      </w:r>
+      <w:proofErr w:type="gramEnd"/>
+      <w:r>
+        <w:rPr>
+          <w:rFonts w:ascii="Times New Roman" w:eastAsia="Times New Roman" w:hAnsi="Times New Roman" w:cs="Times New Roman"/>
+          <w:kern w:val="0"/>
+          <w:lang w:eastAsia="en-IN" w:bidi="hi-IN"/>
+          <w14:ligatures w14:val="none"/>
+        </w:rPr>
+        <w:t xml:space="preserve"> equal positions through repetition and accurate </w:t>
+      </w:r>
+      <w:r>
+        <w:rPr>
+          <w:rFonts w:ascii="Times New Roman" w:eastAsia="Times New Roman" w:hAnsi="Times New Roman" w:cs="Times New Roman"/>
+          <w:kern w:val="0"/>
+          <w:lang w:eastAsia="en-IN" w:bidi="hi-IN"/>
+          <w14:ligatures w14:val="none"/>
+        </w:rPr>
+        <w:t>defence</w:t>
+      </w:r>
+      <w:r>
+        <w:rPr>
+          <w:rFonts w:ascii="Times New Roman" w:eastAsia="Times New Roman" w:hAnsi="Times New Roman" w:cs="Times New Roman"/>
+          <w:kern w:val="0"/>
+          <w:lang w:eastAsia="en-IN" w:bidi="hi-IN"/>
+          <w14:ligatures w14:val="none"/>
+        </w:rPr>
+        <w:t>.</w:t>
+      </w:r>
+    </w:p>
+    <w:p>
+      <w:pPr>
+        <w:spacing w:before="100" w:beforeAutospacing="1" w:after="100" w:afterAutospacing="1" w:line="240" w:lineRule="auto"/>
+        <w:rPr>
+          <w:rFonts w:ascii="Times New Roman" w:eastAsia="Times New Roman" w:hAnsi="Times New Roman" w:cs="Times New Roman"/>
+          <w:kern w:val="0"/>
+          <w:lang w:eastAsia="en-IN" w:bidi="hi-IN"/>
+          <w14:ligatures w14:val="none"/>
+        </w:rPr>
+      </w:pPr>
+      <w:r>
+        <w:rPr>
+          <w:rFonts w:ascii="Times New Roman" w:eastAsia="Times New Roman" w:hAnsi="Times New Roman" w:cs="Times New Roman"/>
+          <w:kern w:val="0"/>
+          <w:lang w:eastAsia="en-IN" w:bidi="hi-IN"/>
+          <w14:ligatures w14:val="none"/>
+        </w:rPr>
+        <w:t>Several losses followed a similar pattern in which the king became exposed and was gradually driven into increasingly vulnerable positions.</w:t>
+      </w:r>
+    </w:p>
+    <w:p>
+      <w:pPr>
+        <w:spacing w:before="100" w:beforeAutospacing="1" w:after="100" w:afterAutospacing="1" w:line="240" w:lineRule="auto"/>
+        <w:rPr>
+          <w:rFonts w:ascii="Times New Roman" w:eastAsia="Times New Roman" w:hAnsi="Times New Roman" w:cs="Times New Roman"/>
+          <w:kern w:val="0"/>
+          <w:lang w:eastAsia="en-IN" w:bidi="hi-IN"/>
+          <w14:ligatures w14:val="none"/>
+        </w:rPr>
+      </w:pPr>
+      <w:r>
+        <w:rPr>
+          <w:rFonts w:ascii="Times New Roman" w:eastAsia="Times New Roman" w:hAnsi="Times New Roman" w:cs="Times New Roman"/>
+          <w:kern w:val="0"/>
+          <w:lang w:eastAsia="en-IN" w:bidi="hi-IN"/>
+          <w14:ligatures w14:val="none"/>
+        </w:rPr>
+        <w:t>A notable milestone was achieving a 64-move draw against Stockfish, marking the first draw against a major chess engine during development.</w:t>
+      </w:r>
+    </w:p>
+    <w:p>
+      <w:pPr>
+        <w:spacing w:after="0" w:line="240" w:lineRule="auto"/>
+        <w:rPr>
+          <w:rFonts w:ascii="Times New Roman" w:eastAsia="Times New Roman" w:hAnsi="Times New Roman" w:cs="Times New Roman"/>
+          <w:kern w:val="0"/>
+          <w:lang w:eastAsia="en-IN" w:bidi="hi-IN"/>
+          <w14:ligatures w14:val="none"/>
+        </w:rPr>
+      </w:pPr>
+    </w:p>
+    <w:p>
+      <w:pPr>
+        <w:spacing w:after="0" w:line="240" w:lineRule="auto"/>
+        <w:rPr>
+          <w:rFonts w:ascii="Times New Roman" w:eastAsia="Times New Roman" w:hAnsi="Times New Roman" w:cs="Times New Roman"/>
+          <w:kern w:val="0"/>
+          <w:lang w:eastAsia="en-IN" w:bidi="hi-IN"/>
+          <w14:ligatures w14:val="none"/>
+        </w:rPr>
+      </w:pPr>
+      <w:r>
+        <w:rPr>
+          <w:rFonts w:ascii="Times New Roman" w:eastAsia="Times New Roman" w:hAnsi="Times New Roman" w:cs="Times New Roman"/>
+          <w:kern w:val="0"/>
+          <w:lang w:eastAsia="en-IN" w:bidi="hi-IN"/>
+          <w14:ligatures w14:val="none"/>
+        </w:rPr>
+        <w:pict w14:anchorId="2408E3B0">
+          <v:rect id="_x0000_i1050" style="width:0;height:1.5pt" o:hralign="center" o:hrstd="t" o:hr="t" fillcolor="#a0a0a0" stroked="f"/>
+        </w:pict>
+      </w:r>
+    </w:p>
+    <w:p>
+      <w:pPr>
+        <w:spacing w:before="100" w:beforeAutospacing="1" w:after="100" w:afterAutospacing="1" w:line="240" w:lineRule="auto"/>
+        <w:outlineLvl w:val="2"/>
+        <w:rPr>
+          <w:rFonts w:ascii="Times New Roman" w:eastAsia="Times New Roman" w:hAnsi="Times New Roman" w:cs="Times New Roman"/>
+          <w:b/>
+          <w:bCs/>
+          <w:kern w:val="0"/>
+          <w:sz w:val="24"/>
+          <w:szCs w:val="24"/>
+          <w:lang w:eastAsia="en-IN" w:bidi="hi-IN"/>
+          <w14:ligatures w14:val="none"/>
+        </w:rPr>
+      </w:pPr>
+    </w:p>
+    <w:p>
+      <w:pPr>
+        <w:spacing w:before="100" w:beforeAutospacing="1" w:after="100" w:afterAutospacing="1" w:line="240" w:lineRule="auto"/>
+        <w:outlineLvl w:val="2"/>
+        <w:rPr>
+          <w:rFonts w:ascii="Times New Roman" w:eastAsia="Times New Roman" w:hAnsi="Times New Roman" w:cs="Times New Roman"/>
+          <w:b/>
+          <w:bCs/>
+          <w:kern w:val="0"/>
+          <w:sz w:val="24"/>
+          <w:szCs w:val="24"/>
+          <w:lang w:eastAsia="en-IN" w:bidi="hi-IN"/>
+          <w14:ligatures w14:val="none"/>
+        </w:rPr>
+      </w:pPr>
+      <w:r>
+        <w:rPr>
+          <w:rFonts w:ascii="Times New Roman" w:eastAsia="Times New Roman" w:hAnsi="Times New Roman" w:cs="Times New Roman"/>
+          <w:b/>
+          <w:bCs/>
+          <w:kern w:val="0"/>
+          <w:sz w:val="24"/>
+          <w:szCs w:val="24"/>
+          <w:lang w:eastAsia="en-IN" w:bidi="hi-IN"/>
+          <w14:ligatures w14:val="none"/>
+        </w:rPr>
+        <w:lastRenderedPageBreak/>
+        <w:t>Human Testing</w:t>
+      </w:r>
+    </w:p>
+    <w:p>
+      <w:pPr>
+        <w:spacing w:before="100" w:beforeAutospacing="1" w:after="100" w:afterAutospacing="1" w:line="240" w:lineRule="auto"/>
+        <w:rPr>
+          <w:rFonts w:ascii="Times New Roman" w:eastAsia="Times New Roman" w:hAnsi="Times New Roman" w:cs="Times New Roman"/>
+          <w:kern w:val="0"/>
+          <w:lang w:eastAsia="en-IN" w:bidi="hi-IN"/>
+          <w14:ligatures w14:val="none"/>
+        </w:rPr>
+      </w:pPr>
+      <w:r>
+        <w:rPr>
+          <w:rFonts w:ascii="Times New Roman" w:eastAsia="Times New Roman" w:hAnsi="Times New Roman" w:cs="Times New Roman"/>
+          <w:kern w:val="0"/>
+          <w:lang w:eastAsia="en-IN" w:bidi="hi-IN"/>
+          <w14:ligatures w14:val="none"/>
+        </w:rPr>
+        <w:t>Testing was also conducted against human players with approximate online ratings between 1100 and 1400.</w:t>
+      </w:r>
+    </w:p>
+    <w:p>
+      <w:pPr>
+        <w:spacing w:before="100" w:beforeAutospacing="1" w:after="100" w:afterAutospacing="1" w:line="240" w:lineRule="auto"/>
+        <w:outlineLvl w:val="3"/>
+        <w:rPr>
+          <w:rFonts w:ascii="Times New Roman" w:eastAsia="Times New Roman" w:hAnsi="Times New Roman" w:cs="Times New Roman"/>
+          <w:b/>
+          <w:bCs/>
+          <w:kern w:val="0"/>
+          <w:lang w:eastAsia="en-IN" w:bidi="hi-IN"/>
+          <w14:ligatures w14:val="none"/>
+        </w:rPr>
+      </w:pPr>
+      <w:r>
+        <w:rPr>
+          <w:rFonts w:ascii="Times New Roman" w:eastAsia="Times New Roman" w:hAnsi="Times New Roman" w:cs="Times New Roman"/>
+          <w:b/>
+          <w:bCs/>
+          <w:kern w:val="0"/>
+          <w:lang w:eastAsia="en-IN" w:bidi="hi-IN"/>
+          <w14:ligatures w14:val="none"/>
+        </w:rPr>
+        <w:t>Results</w:t>
+      </w:r>
+    </w:p>
+    <w:p>
+      <w:pPr>
+        <w:spacing w:before="100" w:beforeAutospacing="1" w:after="100" w:afterAutospacing="1" w:line="240" w:lineRule="auto"/>
+        <w:rPr>
+          <w:rFonts w:ascii="Times New Roman" w:eastAsia="Times New Roman" w:hAnsi="Times New Roman" w:cs="Times New Roman"/>
+          <w:kern w:val="0"/>
+          <w:lang w:eastAsia="en-IN" w:bidi="hi-IN"/>
+          <w14:ligatures w14:val="none"/>
+        </w:rPr>
+      </w:pPr>
+      <w:r>
+        <w:rPr>
+          <w:rFonts w:ascii="Times New Roman" w:eastAsia="Times New Roman" w:hAnsi="Times New Roman" w:cs="Times New Roman"/>
+          <w:kern w:val="0"/>
+          <w:lang w:eastAsia="en-IN" w:bidi="hi-IN"/>
+          <w14:ligatures w14:val="none"/>
+        </w:rPr>
+        <w:t>~1100-rated player:</w:t>
+      </w:r>
+    </w:p>
+    <w:p>
+      <w:pPr>
+        <w:numPr>
+          <w:ilvl w:val="0"/>
+          <w:numId w:val="17"/>
+        </w:numPr>
+        <w:spacing w:before="100" w:beforeAutospacing="1" w:after="100" w:afterAutospacing="1" w:line="240" w:lineRule="auto"/>
+        <w:rPr>
+          <w:rFonts w:ascii="Times New Roman" w:eastAsia="Times New Roman" w:hAnsi="Times New Roman" w:cs="Times New Roman"/>
+          <w:kern w:val="0"/>
+          <w:lang w:eastAsia="en-IN" w:bidi="hi-IN"/>
+          <w14:ligatures w14:val="none"/>
+        </w:rPr>
+      </w:pPr>
+      <w:r>
+        <w:rPr>
+          <w:rFonts w:ascii="Times New Roman" w:eastAsia="Times New Roman" w:hAnsi="Times New Roman" w:cs="Times New Roman"/>
+          <w:kern w:val="0"/>
+          <w:lang w:eastAsia="en-IN" w:bidi="hi-IN"/>
+          <w14:ligatures w14:val="none"/>
+        </w:rPr>
+        <w:t>Arbor won convincingly</w:t>
+      </w:r>
+      <w:r>
+        <w:rPr>
+          <w:rFonts w:ascii="Times New Roman" w:eastAsia="Times New Roman" w:hAnsi="Times New Roman" w:cs="Times New Roman"/>
+          <w:kern w:val="0"/>
+          <w:lang w:eastAsia="en-IN" w:bidi="hi-IN"/>
+          <w14:ligatures w14:val="none"/>
+        </w:rPr>
+        <w:t xml:space="preserve"> unless lack of king safety parameter exploited.</w:t>
+      </w:r>
+    </w:p>
+    <w:p>
+      <w:pPr>
+        <w:spacing w:before="100" w:beforeAutospacing="1" w:after="100" w:afterAutospacing="1" w:line="240" w:lineRule="auto"/>
+        <w:rPr>
+          <w:rFonts w:ascii="Times New Roman" w:eastAsia="Times New Roman" w:hAnsi="Times New Roman" w:cs="Times New Roman"/>
+          <w:kern w:val="0"/>
+          <w:lang w:eastAsia="en-IN" w:bidi="hi-IN"/>
+          <w14:ligatures w14:val="none"/>
+        </w:rPr>
+      </w:pPr>
+      <w:r>
+        <w:rPr>
+          <w:rFonts w:ascii="Times New Roman" w:eastAsia="Times New Roman" w:hAnsi="Times New Roman" w:cs="Times New Roman"/>
+          <w:kern w:val="0"/>
+          <w:lang w:eastAsia="en-IN" w:bidi="hi-IN"/>
+          <w14:ligatures w14:val="none"/>
+        </w:rPr>
+        <w:t>~1400-rated player:</w:t>
+      </w:r>
+    </w:p>
+    <w:p>
+      <w:pPr>
+        <w:numPr>
+          <w:ilvl w:val="0"/>
+          <w:numId w:val="18"/>
+        </w:numPr>
+        <w:spacing w:before="100" w:beforeAutospacing="1" w:after="100" w:afterAutospacing="1" w:line="240" w:lineRule="auto"/>
+        <w:rPr>
+          <w:rFonts w:ascii="Times New Roman" w:eastAsia="Times New Roman" w:hAnsi="Times New Roman" w:cs="Times New Roman"/>
+          <w:kern w:val="0"/>
+          <w:lang w:eastAsia="en-IN" w:bidi="hi-IN"/>
+          <w14:ligatures w14:val="none"/>
+        </w:rPr>
+      </w:pPr>
+      <w:r>
+        <w:rPr>
+          <w:rFonts w:ascii="Times New Roman" w:eastAsia="Times New Roman" w:hAnsi="Times New Roman" w:cs="Times New Roman"/>
+          <w:kern w:val="0"/>
+          <w:lang w:eastAsia="en-IN" w:bidi="hi-IN"/>
+          <w14:ligatures w14:val="none"/>
+        </w:rPr>
+        <w:t>Multiple draws.</w:t>
+      </w:r>
+    </w:p>
+    <w:p>
+      <w:pPr>
+        <w:spacing w:before="100" w:beforeAutospacing="1" w:after="100" w:afterAutospacing="1" w:line="240" w:lineRule="auto"/>
+        <w:outlineLvl w:val="3"/>
+        <w:rPr>
+          <w:rFonts w:ascii="Times New Roman" w:eastAsia="Times New Roman" w:hAnsi="Times New Roman" w:cs="Times New Roman"/>
+          <w:b/>
+          <w:bCs/>
+          <w:kern w:val="0"/>
+          <w:lang w:eastAsia="en-IN" w:bidi="hi-IN"/>
+          <w14:ligatures w14:val="none"/>
+        </w:rPr>
+      </w:pPr>
+      <w:r>
+        <w:rPr>
+          <w:rFonts w:ascii="Times New Roman" w:eastAsia="Times New Roman" w:hAnsi="Times New Roman" w:cs="Times New Roman"/>
+          <w:b/>
+          <w:bCs/>
+          <w:kern w:val="0"/>
+          <w:lang w:eastAsia="en-IN" w:bidi="hi-IN"/>
+          <w14:ligatures w14:val="none"/>
+        </w:rPr>
+        <w:t>Observations</w:t>
+      </w:r>
+    </w:p>
+    <w:p>
+      <w:pPr>
+        <w:spacing w:before="100" w:beforeAutospacing="1" w:after="100" w:afterAutospacing="1" w:line="240" w:lineRule="auto"/>
+        <w:rPr>
+          <w:rFonts w:ascii="Times New Roman" w:eastAsia="Times New Roman" w:hAnsi="Times New Roman" w:cs="Times New Roman"/>
+          <w:kern w:val="0"/>
+          <w:lang w:eastAsia="en-IN" w:bidi="hi-IN"/>
+          <w14:ligatures w14:val="none"/>
+        </w:rPr>
+      </w:pPr>
+      <w:r>
+        <w:rPr>
+          <w:rFonts w:ascii="Times New Roman" w:eastAsia="Times New Roman" w:hAnsi="Times New Roman" w:cs="Times New Roman"/>
+          <w:kern w:val="0"/>
+          <w:lang w:eastAsia="en-IN" w:bidi="hi-IN"/>
+          <w14:ligatures w14:val="none"/>
+        </w:rPr>
+        <w:t>Arbor frequently obtained advantageous middlegame positions against stronger human opposition and occasionally reached clearly winning positions.</w:t>
+      </w:r>
+    </w:p>
+    <w:p>
+      <w:pPr>
+        <w:spacing w:before="100" w:beforeAutospacing="1" w:after="100" w:afterAutospacing="1" w:line="240" w:lineRule="auto"/>
+        <w:rPr>
+          <w:rFonts w:ascii="Times New Roman" w:eastAsia="Times New Roman" w:hAnsi="Times New Roman" w:cs="Times New Roman"/>
+          <w:kern w:val="0"/>
+          <w:lang w:eastAsia="en-IN" w:bidi="hi-IN"/>
+          <w14:ligatures w14:val="none"/>
+        </w:rPr>
+      </w:pPr>
+      <w:r>
+        <w:rPr>
+          <w:rFonts w:ascii="Times New Roman" w:eastAsia="Times New Roman" w:hAnsi="Times New Roman" w:cs="Times New Roman"/>
+          <w:kern w:val="0"/>
+          <w:lang w:eastAsia="en-IN" w:bidi="hi-IN"/>
+          <w14:ligatures w14:val="none"/>
+        </w:rPr>
+        <w:t>However, these advantages were not always converted into victories.</w:t>
+      </w:r>
+    </w:p>
+    <w:p>
+      <w:pPr>
+        <w:spacing w:before="100" w:beforeAutospacing="1" w:after="100" w:afterAutospacing="1" w:line="240" w:lineRule="auto"/>
+        <w:rPr>
+          <w:rFonts w:ascii="Times New Roman" w:eastAsia="Times New Roman" w:hAnsi="Times New Roman" w:cs="Times New Roman"/>
+          <w:kern w:val="0"/>
+          <w:lang w:eastAsia="en-IN" w:bidi="hi-IN"/>
+          <w14:ligatures w14:val="none"/>
+        </w:rPr>
+      </w:pPr>
+      <w:r>
+        <w:rPr>
+          <w:rFonts w:ascii="Times New Roman" w:eastAsia="Times New Roman" w:hAnsi="Times New Roman" w:cs="Times New Roman"/>
+          <w:kern w:val="0"/>
+          <w:lang w:eastAsia="en-IN" w:bidi="hi-IN"/>
+          <w14:ligatures w14:val="none"/>
+        </w:rPr>
+        <w:t>The primary weakness observed during human testing was endgame play. In several cases, winning positions were drawn because Arbor lacked sufficient endgame knowledge and evaluation features to convert the advantage efficiently.</w:t>
+      </w:r>
+    </w:p>
+    <w:p>
+      <w:pPr>
+        <w:spacing w:after="0" w:line="240" w:lineRule="auto"/>
+        <w:rPr>
+          <w:rFonts w:ascii="Times New Roman" w:eastAsia="Times New Roman" w:hAnsi="Times New Roman" w:cs="Times New Roman"/>
+          <w:kern w:val="0"/>
+          <w:lang w:eastAsia="en-IN" w:bidi="hi-IN"/>
+          <w14:ligatures w14:val="none"/>
+        </w:rPr>
+      </w:pPr>
+      <w:r>
+        <w:rPr>
+          <w:rFonts w:ascii="Times New Roman" w:eastAsia="Times New Roman" w:hAnsi="Times New Roman" w:cs="Times New Roman"/>
+          <w:kern w:val="0"/>
+          <w:lang w:eastAsia="en-IN" w:bidi="hi-IN"/>
+          <w14:ligatures w14:val="none"/>
+        </w:rPr>
+        <w:pict w14:anchorId="04139B6D">
+          <v:rect id="_x0000_i1051" style="width:0;height:1.5pt" o:hralign="center" o:hrstd="t" o:hr="t" fillcolor="#a0a0a0" stroked="f"/>
+        </w:pict>
+      </w:r>
+    </w:p>
+    <w:p>
+      <w:pPr>
+        <w:spacing w:before="100" w:beforeAutospacing="1" w:after="100" w:afterAutospacing="1" w:line="240" w:lineRule="auto"/>
+        <w:outlineLvl w:val="1"/>
+        <w:rPr>
+          <w:rFonts w:ascii="Times New Roman" w:eastAsia="Times New Roman" w:hAnsi="Times New Roman" w:cs="Times New Roman"/>
+          <w:b/>
+          <w:bCs/>
+          <w:kern w:val="0"/>
+          <w:sz w:val="32"/>
+          <w:szCs w:val="32"/>
+          <w:lang w:eastAsia="en-IN" w:bidi="hi-IN"/>
+          <w14:ligatures w14:val="none"/>
+        </w:rPr>
+      </w:pPr>
+      <w:r>
+        <w:rPr>
+          <w:rFonts w:ascii="Times New Roman" w:eastAsia="Times New Roman" w:hAnsi="Times New Roman" w:cs="Times New Roman"/>
+          <w:b/>
+          <w:bCs/>
+          <w:kern w:val="0"/>
+          <w:sz w:val="32"/>
+          <w:szCs w:val="32"/>
+          <w:lang w:eastAsia="en-IN" w:bidi="hi-IN"/>
+          <w14:ligatures w14:val="none"/>
+        </w:rPr>
+        <w:t>Strengths</w:t>
+      </w:r>
+    </w:p>
+    <w:p>
+      <w:pPr>
+        <w:spacing w:before="100" w:beforeAutospacing="1" w:after="100" w:afterAutospacing="1" w:line="240" w:lineRule="auto"/>
+        <w:rPr>
+          <w:rFonts w:ascii="Times New Roman" w:eastAsia="Times New Roman" w:hAnsi="Times New Roman" w:cs="Times New Roman"/>
+          <w:kern w:val="0"/>
+          <w:lang w:eastAsia="en-IN" w:bidi="hi-IN"/>
+          <w14:ligatures w14:val="none"/>
+        </w:rPr>
+      </w:pPr>
+      <w:r>
+        <w:rPr>
+          <w:rFonts w:ascii="Times New Roman" w:eastAsia="Times New Roman" w:hAnsi="Times New Roman" w:cs="Times New Roman"/>
+          <w:kern w:val="0"/>
+          <w:lang w:eastAsia="en-IN" w:bidi="hi-IN"/>
+          <w14:ligatures w14:val="none"/>
+        </w:rPr>
+        <w:t>At the time of release, Arbor demonstrated the following strengths:</w:t>
+      </w:r>
+    </w:p>
+    <w:p>
+      <w:pPr>
+        <w:numPr>
+          <w:ilvl w:val="0"/>
+          <w:numId w:val="19"/>
+        </w:numPr>
+        <w:spacing w:before="100" w:beforeAutospacing="1" w:after="100" w:afterAutospacing="1" w:line="240" w:lineRule="auto"/>
+        <w:rPr>
+          <w:rFonts w:ascii="Times New Roman" w:eastAsia="Times New Roman" w:hAnsi="Times New Roman" w:cs="Times New Roman"/>
+          <w:kern w:val="0"/>
+          <w:lang w:eastAsia="en-IN" w:bidi="hi-IN"/>
+          <w14:ligatures w14:val="none"/>
+        </w:rPr>
+      </w:pPr>
+      <w:r>
+        <w:rPr>
+          <w:rFonts w:ascii="Times New Roman" w:eastAsia="Times New Roman" w:hAnsi="Times New Roman" w:cs="Times New Roman"/>
+          <w:kern w:val="0"/>
+          <w:lang w:eastAsia="en-IN" w:bidi="hi-IN"/>
+          <w14:ligatures w14:val="none"/>
+        </w:rPr>
+        <w:t>Stable move generation</w:t>
+      </w:r>
+      <w:r>
+        <w:rPr>
+          <w:rFonts w:ascii="Times New Roman" w:eastAsia="Times New Roman" w:hAnsi="Times New Roman" w:cs="Times New Roman"/>
+          <w:kern w:val="0"/>
+          <w:lang w:eastAsia="en-IN" w:bidi="hi-IN"/>
+          <w14:ligatures w14:val="none"/>
+        </w:rPr>
+        <w:t>.</w:t>
+      </w:r>
+    </w:p>
+    <w:p>
+      <w:pPr>
+        <w:numPr>
+          <w:ilvl w:val="0"/>
+          <w:numId w:val="19"/>
+        </w:numPr>
+        <w:spacing w:before="100" w:beforeAutospacing="1" w:after="100" w:afterAutospacing="1" w:line="240" w:lineRule="auto"/>
+        <w:rPr>
+          <w:rFonts w:ascii="Times New Roman" w:eastAsia="Times New Roman" w:hAnsi="Times New Roman" w:cs="Times New Roman"/>
+          <w:kern w:val="0"/>
+          <w:lang w:eastAsia="en-IN" w:bidi="hi-IN"/>
+          <w14:ligatures w14:val="none"/>
+        </w:rPr>
+      </w:pPr>
+      <w:r>
+        <w:rPr>
+          <w:rFonts w:ascii="Times New Roman" w:eastAsia="Times New Roman" w:hAnsi="Times New Roman" w:cs="Times New Roman"/>
+          <w:kern w:val="0"/>
+          <w:lang w:eastAsia="en-IN" w:bidi="hi-IN"/>
+          <w14:ligatures w14:val="none"/>
+        </w:rPr>
+        <w:t>Reliable tactical calculation</w:t>
+      </w:r>
+      <w:r>
+        <w:rPr>
+          <w:rFonts w:ascii="Times New Roman" w:eastAsia="Times New Roman" w:hAnsi="Times New Roman" w:cs="Times New Roman"/>
+          <w:kern w:val="0"/>
+          <w:lang w:eastAsia="en-IN" w:bidi="hi-IN"/>
+          <w14:ligatures w14:val="none"/>
+        </w:rPr>
+        <w:t>.</w:t>
+      </w:r>
+    </w:p>
+    <w:p>
+      <w:pPr>
+        <w:numPr>
+          <w:ilvl w:val="0"/>
+          <w:numId w:val="19"/>
+        </w:numPr>
+        <w:spacing w:before="100" w:beforeAutospacing="1" w:after="100" w:afterAutospacing="1" w:line="240" w:lineRule="auto"/>
+        <w:rPr>
+          <w:rFonts w:ascii="Times New Roman" w:eastAsia="Times New Roman" w:hAnsi="Times New Roman" w:cs="Times New Roman"/>
+          <w:kern w:val="0"/>
+          <w:lang w:eastAsia="en-IN" w:bidi="hi-IN"/>
+          <w14:ligatures w14:val="none"/>
+        </w:rPr>
+      </w:pPr>
+      <w:r>
+        <w:rPr>
+          <w:rFonts w:ascii="Times New Roman" w:eastAsia="Times New Roman" w:hAnsi="Times New Roman" w:cs="Times New Roman"/>
+          <w:kern w:val="0"/>
+          <w:lang w:eastAsia="en-IN" w:bidi="hi-IN"/>
+          <w14:ligatures w14:val="none"/>
+        </w:rPr>
+        <w:t>Strong material awareness</w:t>
+      </w:r>
+      <w:r>
+        <w:rPr>
+          <w:rFonts w:ascii="Times New Roman" w:eastAsia="Times New Roman" w:hAnsi="Times New Roman" w:cs="Times New Roman"/>
+          <w:kern w:val="0"/>
+          <w:lang w:eastAsia="en-IN" w:bidi="hi-IN"/>
+          <w14:ligatures w14:val="none"/>
+        </w:rPr>
+        <w:t>.</w:t>
+      </w:r>
+    </w:p>
+    <w:p>
+      <w:pPr>
+        <w:numPr>
+          <w:ilvl w:val="0"/>
+          <w:numId w:val="19"/>
+        </w:numPr>
+        <w:spacing w:before="100" w:beforeAutospacing="1" w:after="100" w:afterAutospacing="1" w:line="240" w:lineRule="auto"/>
+        <w:rPr>
+          <w:rFonts w:ascii="Times New Roman" w:eastAsia="Times New Roman" w:hAnsi="Times New Roman" w:cs="Times New Roman"/>
+          <w:kern w:val="0"/>
+          <w:lang w:eastAsia="en-IN" w:bidi="hi-IN"/>
+          <w14:ligatures w14:val="none"/>
+        </w:rPr>
+      </w:pPr>
+      <w:r>
+        <w:rPr>
+          <w:rFonts w:ascii="Times New Roman" w:eastAsia="Times New Roman" w:hAnsi="Times New Roman" w:cs="Times New Roman"/>
+          <w:kern w:val="0"/>
+          <w:lang w:eastAsia="en-IN" w:bidi="hi-IN"/>
+          <w14:ligatures w14:val="none"/>
+        </w:rPr>
+        <w:t>Effective use of Piece-Square Tables</w:t>
+      </w:r>
+      <w:r>
+        <w:rPr>
+          <w:rFonts w:ascii="Times New Roman" w:eastAsia="Times New Roman" w:hAnsi="Times New Roman" w:cs="Times New Roman"/>
+          <w:kern w:val="0"/>
+          <w:lang w:eastAsia="en-IN" w:bidi="hi-IN"/>
+          <w14:ligatures w14:val="none"/>
+        </w:rPr>
+        <w:t>.</w:t>
+      </w:r>
+    </w:p>
+    <w:p>
+      <w:pPr>
+        <w:numPr>
+          <w:ilvl w:val="0"/>
+          <w:numId w:val="19"/>
+        </w:numPr>
+        <w:spacing w:before="100" w:beforeAutospacing="1" w:after="100" w:afterAutospacing="1" w:line="240" w:lineRule="auto"/>
+        <w:rPr>
+          <w:rFonts w:ascii="Times New Roman" w:eastAsia="Times New Roman" w:hAnsi="Times New Roman" w:cs="Times New Roman"/>
+          <w:kern w:val="0"/>
+          <w:lang w:eastAsia="en-IN" w:bidi="hi-IN"/>
+          <w14:ligatures w14:val="none"/>
+        </w:rPr>
+      </w:pPr>
+      <w:r>
+        <w:rPr>
+          <w:rFonts w:ascii="Times New Roman" w:eastAsia="Times New Roman" w:hAnsi="Times New Roman" w:cs="Times New Roman"/>
+          <w:kern w:val="0"/>
+          <w:lang w:eastAsia="en-IN" w:bidi="hi-IN"/>
+          <w14:ligatures w14:val="none"/>
+        </w:rPr>
+        <w:t>Ability to identify and exploit simple tactical opportunities</w:t>
+      </w:r>
+      <w:r>
+        <w:rPr>
+          <w:rFonts w:ascii="Times New Roman" w:eastAsia="Times New Roman" w:hAnsi="Times New Roman" w:cs="Times New Roman"/>
+          <w:kern w:val="0"/>
+          <w:lang w:eastAsia="en-IN" w:bidi="hi-IN"/>
+          <w14:ligatures w14:val="none"/>
+        </w:rPr>
+        <w:t>.</w:t>
+      </w:r>
+    </w:p>
+    <w:p>
+      <w:pPr>
+        <w:numPr>
+          <w:ilvl w:val="0"/>
+          <w:numId w:val="19"/>
+        </w:numPr>
+        <w:spacing w:before="100" w:beforeAutospacing="1" w:after="100" w:afterAutospacing="1" w:line="240" w:lineRule="auto"/>
+        <w:rPr>
+          <w:rFonts w:ascii="Times New Roman" w:eastAsia="Times New Roman" w:hAnsi="Times New Roman" w:cs="Times New Roman"/>
+          <w:kern w:val="0"/>
+          <w:lang w:eastAsia="en-IN" w:bidi="hi-IN"/>
+          <w14:ligatures w14:val="none"/>
+        </w:rPr>
+      </w:pPr>
+      <w:r>
+        <w:rPr>
+          <w:rFonts w:ascii="Times New Roman" w:eastAsia="Times New Roman" w:hAnsi="Times New Roman" w:cs="Times New Roman"/>
+          <w:kern w:val="0"/>
+          <w:lang w:eastAsia="en-IN" w:bidi="hi-IN"/>
+          <w14:ligatures w14:val="none"/>
+        </w:rPr>
+        <w:t>Competitive middlegame play against club-level opponents</w:t>
+      </w:r>
+      <w:r>
+        <w:rPr>
+          <w:rFonts w:ascii="Times New Roman" w:eastAsia="Times New Roman" w:hAnsi="Times New Roman" w:cs="Times New Roman"/>
+          <w:kern w:val="0"/>
+          <w:lang w:eastAsia="en-IN" w:bidi="hi-IN"/>
+          <w14:ligatures w14:val="none"/>
+        </w:rPr>
+        <w:t>.</w:t>
+      </w:r>
+    </w:p>
+    <w:p>
+      <w:pPr>
+        <w:numPr>
+          <w:ilvl w:val="0"/>
+          <w:numId w:val="19"/>
+        </w:numPr>
+        <w:spacing w:before="100" w:beforeAutospacing="1" w:after="100" w:afterAutospacing="1" w:line="240" w:lineRule="auto"/>
+        <w:rPr>
+          <w:rFonts w:ascii="Times New Roman" w:eastAsia="Times New Roman" w:hAnsi="Times New Roman" w:cs="Times New Roman"/>
+          <w:kern w:val="0"/>
+          <w:lang w:eastAsia="en-IN" w:bidi="hi-IN"/>
+          <w14:ligatures w14:val="none"/>
+        </w:rPr>
+      </w:pPr>
+      <w:r>
+        <w:rPr>
+          <w:rFonts w:ascii="Times New Roman" w:eastAsia="Times New Roman" w:hAnsi="Times New Roman" w:cs="Times New Roman"/>
+          <w:kern w:val="0"/>
+          <w:lang w:eastAsia="en-IN" w:bidi="hi-IN"/>
+          <w14:ligatures w14:val="none"/>
+        </w:rPr>
+        <w:t>Stable UCI integration and game completion</w:t>
+      </w:r>
+      <w:r>
+        <w:rPr>
+          <w:rFonts w:ascii="Times New Roman" w:eastAsia="Times New Roman" w:hAnsi="Times New Roman" w:cs="Times New Roman"/>
+          <w:kern w:val="0"/>
+          <w:lang w:eastAsia="en-IN" w:bidi="hi-IN"/>
+          <w14:ligatures w14:val="none"/>
+        </w:rPr>
+        <w:t>.</w:t>
+      </w:r>
+    </w:p>
+    <w:p>
+      <w:pPr>
+        <w:spacing w:after="0" w:line="240" w:lineRule="auto"/>
+        <w:rPr>
+          <w:rFonts w:ascii="Times New Roman" w:eastAsia="Times New Roman" w:hAnsi="Times New Roman" w:cs="Times New Roman"/>
+          <w:kern w:val="0"/>
+          <w:lang w:eastAsia="en-IN" w:bidi="hi-IN"/>
+          <w14:ligatures w14:val="none"/>
+        </w:rPr>
+      </w:pPr>
+      <w:r>
+        <w:rPr>
+          <w:rFonts w:ascii="Times New Roman" w:eastAsia="Times New Roman" w:hAnsi="Times New Roman" w:cs="Times New Roman"/>
+          <w:kern w:val="0"/>
+          <w:lang w:eastAsia="en-IN" w:bidi="hi-IN"/>
+          <w14:ligatures w14:val="none"/>
+        </w:rPr>
+        <w:pict w14:anchorId="7F3E58D2">
+          <v:rect id="_x0000_i1052" style="width:0;height:1.5pt" o:hralign="center" o:hrstd="t" o:hr="t" fillcolor="#a0a0a0" stroked="f"/>
+        </w:pict>
+      </w:r>
+    </w:p>
+    <w:p>
+      <w:pPr>
+        <w:spacing w:before="100" w:beforeAutospacing="1" w:after="100" w:afterAutospacing="1" w:line="240" w:lineRule="auto"/>
+        <w:outlineLvl w:val="1"/>
+        <w:rPr>
+          <w:rFonts w:ascii="Times New Roman" w:eastAsia="Times New Roman" w:hAnsi="Times New Roman" w:cs="Times New Roman"/>
+          <w:b/>
+          <w:bCs/>
+          <w:kern w:val="0"/>
+          <w:sz w:val="32"/>
+          <w:szCs w:val="32"/>
+          <w:lang w:eastAsia="en-IN" w:bidi="hi-IN"/>
+          <w14:ligatures w14:val="none"/>
+        </w:rPr>
+      </w:pPr>
+      <w:r>
+        <w:rPr>
+          <w:rFonts w:ascii="Times New Roman" w:eastAsia="Times New Roman" w:hAnsi="Times New Roman" w:cs="Times New Roman"/>
+          <w:b/>
+          <w:bCs/>
+          <w:kern w:val="0"/>
+          <w:sz w:val="32"/>
+          <w:szCs w:val="32"/>
+          <w:lang w:eastAsia="en-IN" w:bidi="hi-IN"/>
+          <w14:ligatures w14:val="none"/>
+        </w:rPr>
+        <w:t>Current Shortcomings</w:t>
+      </w:r>
+    </w:p>
+    <w:p>
+      <w:pPr>
+        <w:spacing w:before="100" w:beforeAutospacing="1" w:after="100" w:afterAutospacing="1" w:line="240" w:lineRule="auto"/>
+        <w:rPr>
+          <w:rFonts w:ascii="Times New Roman" w:eastAsia="Times New Roman" w:hAnsi="Times New Roman" w:cs="Times New Roman"/>
+          <w:kern w:val="0"/>
+          <w:lang w:eastAsia="en-IN" w:bidi="hi-IN"/>
+          <w14:ligatures w14:val="none"/>
+        </w:rPr>
+      </w:pPr>
+      <w:r>
+        <w:rPr>
+          <w:rFonts w:ascii="Times New Roman" w:eastAsia="Times New Roman" w:hAnsi="Times New Roman" w:cs="Times New Roman"/>
+          <w:kern w:val="0"/>
+          <w:lang w:eastAsia="en-IN" w:bidi="hi-IN"/>
+          <w14:ligatures w14:val="none"/>
+        </w:rPr>
+        <w:t>The following weaknesses were consistently observed:</w:t>
+      </w:r>
+    </w:p>
+    <w:p>
+      <w:pPr>
+        <w:numPr>
+          <w:ilvl w:val="0"/>
+          <w:numId w:val="20"/>
+        </w:numPr>
+        <w:spacing w:before="100" w:beforeAutospacing="1" w:after="100" w:afterAutospacing="1" w:line="240" w:lineRule="auto"/>
+        <w:rPr>
+          <w:rFonts w:ascii="Times New Roman" w:eastAsia="Times New Roman" w:hAnsi="Times New Roman" w:cs="Times New Roman"/>
+          <w:kern w:val="0"/>
+          <w:lang w:eastAsia="en-IN" w:bidi="hi-IN"/>
+          <w14:ligatures w14:val="none"/>
+        </w:rPr>
+      </w:pPr>
+      <w:r>
+        <w:rPr>
+          <w:rFonts w:ascii="Times New Roman" w:eastAsia="Times New Roman" w:hAnsi="Times New Roman" w:cs="Times New Roman"/>
+          <w:kern w:val="0"/>
+          <w:lang w:eastAsia="en-IN" w:bidi="hi-IN"/>
+          <w14:ligatures w14:val="none"/>
+        </w:rPr>
+        <w:t>Limited king safety evaluation</w:t>
+      </w:r>
+      <w:r>
+        <w:rPr>
+          <w:rFonts w:ascii="Times New Roman" w:eastAsia="Times New Roman" w:hAnsi="Times New Roman" w:cs="Times New Roman"/>
+          <w:kern w:val="0"/>
+          <w:lang w:eastAsia="en-IN" w:bidi="hi-IN"/>
+          <w14:ligatures w14:val="none"/>
+        </w:rPr>
+        <w:t>.</w:t>
+      </w:r>
+    </w:p>
+    <w:p>
+      <w:pPr>
+        <w:numPr>
+          <w:ilvl w:val="0"/>
+          <w:numId w:val="20"/>
+        </w:numPr>
+        <w:spacing w:before="100" w:beforeAutospacing="1" w:after="100" w:afterAutospacing="1" w:line="240" w:lineRule="auto"/>
+        <w:rPr>
+          <w:rFonts w:ascii="Times New Roman" w:eastAsia="Times New Roman" w:hAnsi="Times New Roman" w:cs="Times New Roman"/>
+          <w:kern w:val="0"/>
+          <w:lang w:eastAsia="en-IN" w:bidi="hi-IN"/>
+          <w14:ligatures w14:val="none"/>
+        </w:rPr>
+      </w:pPr>
+      <w:r>
+        <w:rPr>
+          <w:rFonts w:ascii="Times New Roman" w:eastAsia="Times New Roman" w:hAnsi="Times New Roman" w:cs="Times New Roman"/>
+          <w:kern w:val="0"/>
+          <w:lang w:eastAsia="en-IN" w:bidi="hi-IN"/>
+          <w14:ligatures w14:val="none"/>
+        </w:rPr>
+        <w:t>Weak endgame technique</w:t>
+      </w:r>
+      <w:r>
+        <w:rPr>
+          <w:rFonts w:ascii="Times New Roman" w:eastAsia="Times New Roman" w:hAnsi="Times New Roman" w:cs="Times New Roman"/>
+          <w:kern w:val="0"/>
+          <w:lang w:eastAsia="en-IN" w:bidi="hi-IN"/>
+          <w14:ligatures w14:val="none"/>
+        </w:rPr>
+        <w:t>.</w:t>
+      </w:r>
+    </w:p>
+    <w:p>
+      <w:pPr>
+        <w:numPr>
+          <w:ilvl w:val="0"/>
+          <w:numId w:val="20"/>
+        </w:numPr>
+        <w:spacing w:before="100" w:beforeAutospacing="1" w:after="100" w:afterAutospacing="1" w:line="240" w:lineRule="auto"/>
+        <w:rPr>
+          <w:rFonts w:ascii="Times New Roman" w:eastAsia="Times New Roman" w:hAnsi="Times New Roman" w:cs="Times New Roman"/>
+          <w:kern w:val="0"/>
+          <w:lang w:eastAsia="en-IN" w:bidi="hi-IN"/>
+          <w14:ligatures w14:val="none"/>
+        </w:rPr>
+      </w:pPr>
+      <w:r>
+        <w:rPr>
+          <w:rFonts w:ascii="Times New Roman" w:eastAsia="Times New Roman" w:hAnsi="Times New Roman" w:cs="Times New Roman"/>
+          <w:kern w:val="0"/>
+          <w:lang w:eastAsia="en-IN" w:bidi="hi-IN"/>
+          <w14:ligatures w14:val="none"/>
+        </w:rPr>
+        <w:t xml:space="preserve">Lack of passed pawn </w:t>
+      </w:r>
+      <w:r>
+        <w:rPr>
+          <w:rFonts w:ascii="Times New Roman" w:eastAsia="Times New Roman" w:hAnsi="Times New Roman" w:cs="Times New Roman"/>
+          <w:kern w:val="0"/>
+          <w:lang w:eastAsia="en-IN" w:bidi="hi-IN"/>
+          <w14:ligatures w14:val="none"/>
+        </w:rPr>
+        <w:t>evaluation.</w:t>
+      </w:r>
+    </w:p>
+    <w:p>
+      <w:pPr>
+        <w:numPr>
+          <w:ilvl w:val="0"/>
+          <w:numId w:val="20"/>
+        </w:numPr>
+        <w:spacing w:before="100" w:beforeAutospacing="1" w:after="100" w:afterAutospacing="1" w:line="240" w:lineRule="auto"/>
+        <w:rPr>
+          <w:rFonts w:ascii="Times New Roman" w:eastAsia="Times New Roman" w:hAnsi="Times New Roman" w:cs="Times New Roman"/>
+          <w:kern w:val="0"/>
+          <w:lang w:eastAsia="en-IN" w:bidi="hi-IN"/>
+          <w14:ligatures w14:val="none"/>
+        </w:rPr>
+      </w:pPr>
+      <w:r>
+        <w:rPr>
+          <w:rFonts w:ascii="Times New Roman" w:eastAsia="Times New Roman" w:hAnsi="Times New Roman" w:cs="Times New Roman"/>
+          <w:kern w:val="0"/>
+          <w:lang w:eastAsia="en-IN" w:bidi="hi-IN"/>
+          <w14:ligatures w14:val="none"/>
+        </w:rPr>
+        <w:t>Lack of pawn structure evaluation</w:t>
+      </w:r>
+      <w:r>
+        <w:rPr>
+          <w:rFonts w:ascii="Times New Roman" w:eastAsia="Times New Roman" w:hAnsi="Times New Roman" w:cs="Times New Roman"/>
+          <w:kern w:val="0"/>
+          <w:lang w:eastAsia="en-IN" w:bidi="hi-IN"/>
+          <w14:ligatures w14:val="none"/>
+        </w:rPr>
+        <w:t>.</w:t>
+      </w:r>
+    </w:p>
+    <w:p>
+      <w:pPr>
+        <w:numPr>
+          <w:ilvl w:val="0"/>
+          <w:numId w:val="20"/>
+        </w:numPr>
+        <w:spacing w:before="100" w:beforeAutospacing="1" w:after="100" w:afterAutospacing="1" w:line="240" w:lineRule="auto"/>
+        <w:rPr>
+          <w:rFonts w:ascii="Times New Roman" w:eastAsia="Times New Roman" w:hAnsi="Times New Roman" w:cs="Times New Roman"/>
+          <w:kern w:val="0"/>
+          <w:lang w:eastAsia="en-IN" w:bidi="hi-IN"/>
+          <w14:ligatures w14:val="none"/>
+        </w:rPr>
+      </w:pPr>
+      <w:r>
+        <w:rPr>
+          <w:rFonts w:ascii="Times New Roman" w:eastAsia="Times New Roman" w:hAnsi="Times New Roman" w:cs="Times New Roman"/>
+          <w:kern w:val="0"/>
+          <w:lang w:eastAsia="en-IN" w:bidi="hi-IN"/>
+          <w14:ligatures w14:val="none"/>
+        </w:rPr>
+        <w:t>Limited positional understanding</w:t>
+      </w:r>
+      <w:r>
+        <w:rPr>
+          <w:rFonts w:ascii="Times New Roman" w:eastAsia="Times New Roman" w:hAnsi="Times New Roman" w:cs="Times New Roman"/>
+          <w:kern w:val="0"/>
+          <w:lang w:eastAsia="en-IN" w:bidi="hi-IN"/>
+          <w14:ligatures w14:val="none"/>
+        </w:rPr>
+        <w:t>.</w:t>
+      </w:r>
+    </w:p>
+    <w:p>
+      <w:pPr>
+        <w:numPr>
+          <w:ilvl w:val="0"/>
+          <w:numId w:val="20"/>
+        </w:numPr>
+        <w:spacing w:before="100" w:beforeAutospacing="1" w:after="100" w:afterAutospacing="1" w:line="240" w:lineRule="auto"/>
+        <w:rPr>
+          <w:rFonts w:ascii="Times New Roman" w:eastAsia="Times New Roman" w:hAnsi="Times New Roman" w:cs="Times New Roman"/>
+          <w:kern w:val="0"/>
+          <w:lang w:eastAsia="en-IN" w:bidi="hi-IN"/>
+          <w14:ligatures w14:val="none"/>
+        </w:rPr>
+      </w:pPr>
+      <w:r>
+        <w:rPr>
+          <w:rFonts w:ascii="Times New Roman" w:eastAsia="Times New Roman" w:hAnsi="Times New Roman" w:cs="Times New Roman"/>
+          <w:kern w:val="0"/>
+          <w:lang w:eastAsia="en-IN" w:bidi="hi-IN"/>
+          <w14:ligatures w14:val="none"/>
+        </w:rPr>
+        <w:t>No transposition tables</w:t>
+      </w:r>
+      <w:r>
+        <w:rPr>
+          <w:rFonts w:ascii="Times New Roman" w:eastAsia="Times New Roman" w:hAnsi="Times New Roman" w:cs="Times New Roman"/>
+          <w:kern w:val="0"/>
+          <w:lang w:eastAsia="en-IN" w:bidi="hi-IN"/>
+          <w14:ligatures w14:val="none"/>
+        </w:rPr>
+        <w:t>.</w:t>
+      </w:r>
+    </w:p>
+    <w:p>
+      <w:pPr>
+        <w:numPr>
+          <w:ilvl w:val="0"/>
+          <w:numId w:val="20"/>
+        </w:numPr>
+        <w:spacing w:before="100" w:beforeAutospacing="1" w:after="100" w:afterAutospacing="1" w:line="240" w:lineRule="auto"/>
+        <w:rPr>
+          <w:rFonts w:ascii="Times New Roman" w:eastAsia="Times New Roman" w:hAnsi="Times New Roman" w:cs="Times New Roman"/>
+          <w:kern w:val="0"/>
+          <w:lang w:eastAsia="en-IN" w:bidi="hi-IN"/>
+          <w14:ligatures w14:val="none"/>
+        </w:rPr>
+      </w:pPr>
+      <w:r>
+        <w:rPr>
+          <w:rFonts w:ascii="Times New Roman" w:eastAsia="Times New Roman" w:hAnsi="Times New Roman" w:cs="Times New Roman"/>
+          <w:kern w:val="0"/>
+          <w:lang w:eastAsia="en-IN" w:bidi="hi-IN"/>
+          <w14:ligatures w14:val="none"/>
+        </w:rPr>
+        <w:lastRenderedPageBreak/>
+        <w:t>No iterative deepening</w:t>
+      </w:r>
+      <w:r>
+        <w:rPr>
+          <w:rFonts w:ascii="Times New Roman" w:eastAsia="Times New Roman" w:hAnsi="Times New Roman" w:cs="Times New Roman"/>
+          <w:kern w:val="0"/>
+          <w:lang w:eastAsia="en-IN" w:bidi="hi-IN"/>
+          <w14:ligatures w14:val="none"/>
+        </w:rPr>
+        <w:t>.</w:t>
+      </w:r>
+    </w:p>
+    <w:p>
+      <w:pPr>
+        <w:numPr>
+          <w:ilvl w:val="0"/>
+          <w:numId w:val="20"/>
+        </w:numPr>
+        <w:spacing w:before="100" w:beforeAutospacing="1" w:after="100" w:afterAutospacing="1" w:line="240" w:lineRule="auto"/>
+        <w:rPr>
+          <w:rFonts w:ascii="Times New Roman" w:eastAsia="Times New Roman" w:hAnsi="Times New Roman" w:cs="Times New Roman"/>
+          <w:kern w:val="0"/>
+          <w:lang w:eastAsia="en-IN" w:bidi="hi-IN"/>
+          <w14:ligatures w14:val="none"/>
+        </w:rPr>
+      </w:pPr>
+      <w:r>
+        <w:rPr>
+          <w:rFonts w:ascii="Times New Roman" w:eastAsia="Times New Roman" w:hAnsi="Times New Roman" w:cs="Times New Roman"/>
+          <w:kern w:val="0"/>
+          <w:lang w:eastAsia="en-IN" w:bidi="hi-IN"/>
+          <w14:ligatures w14:val="none"/>
+        </w:rPr>
+        <w:t>No advanced search extensions</w:t>
+      </w:r>
+      <w:r>
+        <w:rPr>
+          <w:rFonts w:ascii="Times New Roman" w:eastAsia="Times New Roman" w:hAnsi="Times New Roman" w:cs="Times New Roman"/>
+          <w:kern w:val="0"/>
+          <w:lang w:eastAsia="en-IN" w:bidi="hi-IN"/>
+          <w14:ligatures w14:val="none"/>
+        </w:rPr>
+        <w:t>.</w:t>
+      </w:r>
+    </w:p>
+    <w:p>
+      <w:pPr>
+        <w:numPr>
+          <w:ilvl w:val="0"/>
+          <w:numId w:val="20"/>
+        </w:numPr>
+        <w:spacing w:before="100" w:beforeAutospacing="1" w:after="100" w:afterAutospacing="1" w:line="240" w:lineRule="auto"/>
+        <w:rPr>
+          <w:rFonts w:ascii="Times New Roman" w:eastAsia="Times New Roman" w:hAnsi="Times New Roman" w:cs="Times New Roman"/>
+          <w:kern w:val="0"/>
+          <w:lang w:eastAsia="en-IN" w:bidi="hi-IN"/>
+          <w14:ligatures w14:val="none"/>
+        </w:rPr>
+      </w:pPr>
+      <w:r>
+        <w:rPr>
+          <w:rFonts w:ascii="Times New Roman" w:eastAsia="Times New Roman" w:hAnsi="Times New Roman" w:cs="Times New Roman"/>
+          <w:kern w:val="0"/>
+          <w:lang w:eastAsia="en-IN" w:bidi="hi-IN"/>
+          <w14:ligatures w14:val="none"/>
+        </w:rPr>
+        <w:t>Difficulty converting winning positions</w:t>
+      </w:r>
+      <w:r>
+        <w:rPr>
+          <w:rFonts w:ascii="Times New Roman" w:eastAsia="Times New Roman" w:hAnsi="Times New Roman" w:cs="Times New Roman"/>
+          <w:kern w:val="0"/>
+          <w:lang w:eastAsia="en-IN" w:bidi="hi-IN"/>
+          <w14:ligatures w14:val="none"/>
+        </w:rPr>
+        <w:t>.</w:t>
+      </w:r>
+    </w:p>
+    <w:p>
+      <w:pPr>
+        <w:spacing w:before="100" w:beforeAutospacing="1" w:after="100" w:afterAutospacing="1" w:line="240" w:lineRule="auto"/>
+        <w:rPr>
+          <w:rFonts w:ascii="Times New Roman" w:eastAsia="Times New Roman" w:hAnsi="Times New Roman" w:cs="Times New Roman"/>
+          <w:kern w:val="0"/>
+          <w:lang w:eastAsia="en-IN" w:bidi="hi-IN"/>
+          <w14:ligatures w14:val="none"/>
+        </w:rPr>
+      </w:pPr>
+      <w:r>
+        <w:rPr>
+          <w:rFonts w:ascii="Times New Roman" w:eastAsia="Times New Roman" w:hAnsi="Times New Roman" w:cs="Times New Roman"/>
+          <w:kern w:val="0"/>
+          <w:lang w:eastAsia="en-IN" w:bidi="hi-IN"/>
+          <w14:ligatures w14:val="none"/>
+        </w:rPr>
+        <w:t>These shortcomings define the primary development goals for future versions of Arbor.</w:t>
+      </w:r>
     </w:p>
     <w:sectPr>
       <w:pgSz w:w="11906" w:h="16838"/>
@@ -6082,6 +8921,304 @@
     </w:lvl>
   </w:abstractNum>
   <w:abstractNum w:abstractNumId="3" w15:restartNumberingAfterBreak="0">
+    <w:nsid w:val="16D94218"/>
+    <w:multiLevelType w:val="multilevel"/>
+    <w:tmpl w:val="853850FC"/>
+    <w:lvl w:ilvl="0">
+      <w:start w:val="1"/>
+      <w:numFmt w:val="bullet"/>
+      <w:lvlText w:val=""/>
+      <w:lvlJc w:val="left"/>
+      <w:pPr>
+        <w:tabs>
+          <w:tab w:val="num" w:pos="720"/>
+        </w:tabs>
+        <w:ind w:left="720" w:hanging="360"/>
+      </w:pPr>
+      <w:rPr>
+        <w:rFonts w:ascii="Symbol" w:hAnsi="Symbol" w:hint="default"/>
+        <w:sz w:val="20"/>
+      </w:rPr>
+    </w:lvl>
+    <w:lvl w:ilvl="1" w:tentative="1">
+      <w:start w:val="1"/>
+      <w:numFmt w:val="bullet"/>
+      <w:lvlText w:val="o"/>
+      <w:lvlJc w:val="left"/>
+      <w:pPr>
+        <w:tabs>
+          <w:tab w:val="num" w:pos="1440"/>
+        </w:tabs>
+        <w:ind w:left="1440" w:hanging="360"/>
+      </w:pPr>
+      <w:rPr>
+        <w:rFonts w:ascii="Courier New" w:hAnsi="Courier New" w:hint="default"/>
+        <w:sz w:val="20"/>
+      </w:rPr>
+    </w:lvl>
+    <w:lvl w:ilvl="2" w:tentative="1">
+      <w:start w:val="1"/>
+      <w:numFmt w:val="bullet"/>
+      <w:lvlText w:val=""/>
+      <w:lvlJc w:val="left"/>
+      <w:pPr>
+        <w:tabs>
+          <w:tab w:val="num" w:pos="2160"/>
+        </w:tabs>
+        <w:ind w:left="2160" w:hanging="360"/>
+      </w:pPr>
+      <w:rPr>
+        <w:rFonts w:ascii="Wingdings" w:hAnsi="Wingdings" w:hint="default"/>
+        <w:sz w:val="20"/>
+      </w:rPr>
+    </w:lvl>
+    <w:lvl w:ilvl="3" w:tentative="1">
+      <w:start w:val="1"/>
+      <w:numFmt w:val="bullet"/>
+      <w:lvlText w:val=""/>
+      <w:lvlJc w:val="left"/>
+      <w:pPr>
+        <w:tabs>
+          <w:tab w:val="num" w:pos="2880"/>
+        </w:tabs>
+        <w:ind w:left="2880" w:hanging="360"/>
+      </w:pPr>
+      <w:rPr>
+        <w:rFonts w:ascii="Wingdings" w:hAnsi="Wingdings" w:hint="default"/>
+        <w:sz w:val="20"/>
+      </w:rPr>
+    </w:lvl>
+    <w:lvl w:ilvl="4" w:tentative="1">
+      <w:start w:val="1"/>
+      <w:numFmt w:val="bullet"/>
+      <w:lvlText w:val=""/>
+      <w:lvlJc w:val="left"/>
+      <w:pPr>
+        <w:tabs>
+          <w:tab w:val="num" w:pos="3600"/>
+        </w:tabs>
+        <w:ind w:left="3600" w:hanging="360"/>
+      </w:pPr>
+      <w:rPr>
+        <w:rFonts w:ascii="Wingdings" w:hAnsi="Wingdings" w:hint="default"/>
+        <w:sz w:val="20"/>
+      </w:rPr>
+    </w:lvl>
+    <w:lvl w:ilvl="5" w:tentative="1">
+      <w:start w:val="1"/>
+      <w:numFmt w:val="bullet"/>
+      <w:lvlText w:val=""/>
+      <w:lvlJc w:val="left"/>
+      <w:pPr>
+        <w:tabs>
+          <w:tab w:val="num" w:pos="4320"/>
+        </w:tabs>
+        <w:ind w:left="4320" w:hanging="360"/>
+      </w:pPr>
+      <w:rPr>
+        <w:rFonts w:ascii="Wingdings" w:hAnsi="Wingdings" w:hint="default"/>
+        <w:sz w:val="20"/>
+      </w:rPr>
+    </w:lvl>
+    <w:lvl w:ilvl="6" w:tentative="1">
+      <w:start w:val="1"/>
+      <w:numFmt w:val="bullet"/>
+      <w:lvlText w:val=""/>
+      <w:lvlJc w:val="left"/>
+      <w:pPr>
+        <w:tabs>
+          <w:tab w:val="num" w:pos="5040"/>
+        </w:tabs>
+        <w:ind w:left="5040" w:hanging="360"/>
+      </w:pPr>
+      <w:rPr>
+        <w:rFonts w:ascii="Wingdings" w:hAnsi="Wingdings" w:hint="default"/>
+        <w:sz w:val="20"/>
+      </w:rPr>
+    </w:lvl>
+    <w:lvl w:ilvl="7" w:tentative="1">
+      <w:start w:val="1"/>
+      <w:numFmt w:val="bullet"/>
+      <w:lvlText w:val=""/>
+      <w:lvlJc w:val="left"/>
+      <w:pPr>
+        <w:tabs>
+          <w:tab w:val="num" w:pos="5760"/>
+        </w:tabs>
+        <w:ind w:left="5760" w:hanging="360"/>
+      </w:pPr>
+      <w:rPr>
+        <w:rFonts w:ascii="Wingdings" w:hAnsi="Wingdings" w:hint="default"/>
+        <w:sz w:val="20"/>
+      </w:rPr>
+    </w:lvl>
+    <w:lvl w:ilvl="8" w:tentative="1">
+      <w:start w:val="1"/>
+      <w:numFmt w:val="bullet"/>
+      <w:lvlText w:val=""/>
+      <w:lvlJc w:val="left"/>
+      <w:pPr>
+        <w:tabs>
+          <w:tab w:val="num" w:pos="6480"/>
+        </w:tabs>
+        <w:ind w:left="6480" w:hanging="360"/>
+      </w:pPr>
+      <w:rPr>
+        <w:rFonts w:ascii="Wingdings" w:hAnsi="Wingdings" w:hint="default"/>
+        <w:sz w:val="20"/>
+      </w:rPr>
+    </w:lvl>
+  </w:abstractNum>
+  <w:abstractNum w:abstractNumId="4" w15:restartNumberingAfterBreak="0">
+    <w:nsid w:val="19503EBD"/>
+    <w:multiLevelType w:val="multilevel"/>
+    <w:tmpl w:val="440C005C"/>
+    <w:lvl w:ilvl="0">
+      <w:start w:val="1"/>
+      <w:numFmt w:val="bullet"/>
+      <w:lvlText w:val=""/>
+      <w:lvlJc w:val="left"/>
+      <w:pPr>
+        <w:tabs>
+          <w:tab w:val="num" w:pos="720"/>
+        </w:tabs>
+        <w:ind w:left="720" w:hanging="360"/>
+      </w:pPr>
+      <w:rPr>
+        <w:rFonts w:ascii="Symbol" w:hAnsi="Symbol" w:hint="default"/>
+        <w:sz w:val="20"/>
+      </w:rPr>
+    </w:lvl>
+    <w:lvl w:ilvl="1" w:tentative="1">
+      <w:start w:val="1"/>
+      <w:numFmt w:val="bullet"/>
+      <w:lvlText w:val="o"/>
+      <w:lvlJc w:val="left"/>
+      <w:pPr>
+        <w:tabs>
+          <w:tab w:val="num" w:pos="1440"/>
+        </w:tabs>
+        <w:ind w:left="1440" w:hanging="360"/>
+      </w:pPr>
+      <w:rPr>
+        <w:rFonts w:ascii="Courier New" w:hAnsi="Courier New" w:hint="default"/>
+        <w:sz w:val="20"/>
+      </w:rPr>
+    </w:lvl>
+    <w:lvl w:ilvl="2" w:tentative="1">
+      <w:start w:val="1"/>
+      <w:numFmt w:val="bullet"/>
+      <w:lvlText w:val=""/>
+      <w:lvlJc w:val="left"/>
+      <w:pPr>
+        <w:tabs>
+          <w:tab w:val="num" w:pos="2160"/>
+        </w:tabs>
+        <w:ind w:left="2160" w:hanging="360"/>
+      </w:pPr>
+      <w:rPr>
+        <w:rFonts w:ascii="Wingdings" w:hAnsi="Wingdings" w:hint="default"/>
+        <w:sz w:val="20"/>
+      </w:rPr>
+    </w:lvl>
+    <w:lvl w:ilvl="3" w:tentative="1">
+      <w:start w:val="1"/>
+      <w:numFmt w:val="bullet"/>
+      <w:lvlText w:val=""/>
+      <w:lvlJc w:val="left"/>
+      <w:pPr>
+        <w:tabs>
+          <w:tab w:val="num" w:pos="2880"/>
+        </w:tabs>
+        <w:ind w:left="2880" w:hanging="360"/>
+      </w:pPr>
+      <w:rPr>
+        <w:rFonts w:ascii="Wingdings" w:hAnsi="Wingdings" w:hint="default"/>
+        <w:sz w:val="20"/>
+      </w:rPr>
+    </w:lvl>
+    <w:lvl w:ilvl="4" w:tentative="1">
+      <w:start w:val="1"/>
+      <w:numFmt w:val="bullet"/>
+      <w:lvlText w:val=""/>
+      <w:lvlJc w:val="left"/>
+      <w:pPr>
+        <w:tabs>
+          <w:tab w:val="num" w:pos="3600"/>
+        </w:tabs>
+        <w:ind w:left="3600" w:hanging="360"/>
+      </w:pPr>
+      <w:rPr>
+        <w:rFonts w:ascii="Wingdings" w:hAnsi="Wingdings" w:hint="default"/>
+        <w:sz w:val="20"/>
+      </w:rPr>
+    </w:lvl>
+    <w:lvl w:ilvl="5" w:tentative="1">
+      <w:start w:val="1"/>
+      <w:numFmt w:val="bullet"/>
+      <w:lvlText w:val=""/>
+      <w:lvlJc w:val="left"/>
+      <w:pPr>
+        <w:tabs>
+          <w:tab w:val="num" w:pos="4320"/>
+        </w:tabs>
+        <w:ind w:left="4320" w:hanging="360"/>
+      </w:pPr>
+      <w:rPr>
+        <w:rFonts w:ascii="Wingdings" w:hAnsi="Wingdings" w:hint="default"/>
+        <w:sz w:val="20"/>
+      </w:rPr>
+    </w:lvl>
+    <w:lvl w:ilvl="6" w:tentative="1">
+      <w:start w:val="1"/>
+      <w:numFmt w:val="bullet"/>
+      <w:lvlText w:val=""/>
+      <w:lvlJc w:val="left"/>
+      <w:pPr>
+        <w:tabs>
+          <w:tab w:val="num" w:pos="5040"/>
+        </w:tabs>
+        <w:ind w:left="5040" w:hanging="360"/>
+      </w:pPr>
+      <w:rPr>
+        <w:rFonts w:ascii="Wingdings" w:hAnsi="Wingdings" w:hint="default"/>
+        <w:sz w:val="20"/>
+      </w:rPr>
+    </w:lvl>
+    <w:lvl w:ilvl="7" w:tentative="1">
+      <w:start w:val="1"/>
+      <w:numFmt w:val="bullet"/>
+      <w:lvlText w:val=""/>
+      <w:lvlJc w:val="left"/>
+      <w:pPr>
+        <w:tabs>
+          <w:tab w:val="num" w:pos="5760"/>
+        </w:tabs>
+        <w:ind w:left="5760" w:hanging="360"/>
+      </w:pPr>
+      <w:rPr>
+        <w:rFonts w:ascii="Wingdings" w:hAnsi="Wingdings" w:hint="default"/>
+        <w:sz w:val="20"/>
+      </w:rPr>
+    </w:lvl>
+    <w:lvl w:ilvl="8" w:tentative="1">
+      <w:start w:val="1"/>
+      <w:numFmt w:val="bullet"/>
+      <w:lvlText w:val=""/>
+      <w:lvlJc w:val="left"/>
+      <w:pPr>
+        <w:tabs>
+          <w:tab w:val="num" w:pos="6480"/>
+        </w:tabs>
+        <w:ind w:left="6480" w:hanging="360"/>
+      </w:pPr>
+      <w:rPr>
+        <w:rFonts w:ascii="Wingdings" w:hAnsi="Wingdings" w:hint="default"/>
+        <w:sz w:val="20"/>
+      </w:rPr>
+    </w:lvl>
+  </w:abstractNum>
+  <w:abstractNum w:abstractNumId="5" w15:restartNumberingAfterBreak="0">
     <w:nsid w:val="1C0F1852"/>
     <w:multiLevelType w:val="multilevel"/>
     <w:tmpl w:val="79E0FA14"/>
@@ -6230,7 +9367,156 @@
       </w:rPr>
     </w:lvl>
   </w:abstractNum>
-  <w:abstractNum w:abstractNumId="4" w15:restartNumberingAfterBreak="0">
+  <w:abstractNum w:abstractNumId="6" w15:restartNumberingAfterBreak="0">
+    <w:nsid w:val="24895EBD"/>
+    <w:multiLevelType w:val="multilevel"/>
+    <w:tmpl w:val="67D606AA"/>
+    <w:lvl w:ilvl="0">
+      <w:start w:val="1"/>
+      <w:numFmt w:val="bullet"/>
+      <w:lvlText w:val=""/>
+      <w:lvlJc w:val="left"/>
+      <w:pPr>
+        <w:tabs>
+          <w:tab w:val="num" w:pos="720"/>
+        </w:tabs>
+        <w:ind w:left="720" w:hanging="360"/>
+      </w:pPr>
+      <w:rPr>
+        <w:rFonts w:ascii="Symbol" w:hAnsi="Symbol" w:hint="default"/>
+        <w:sz w:val="20"/>
+      </w:rPr>
+    </w:lvl>
+    <w:lvl w:ilvl="1" w:tentative="1">
+      <w:start w:val="1"/>
+      <w:numFmt w:val="bullet"/>
+      <w:lvlText w:val="o"/>
+      <w:lvlJc w:val="left"/>
+      <w:pPr>
+        <w:tabs>
+          <w:tab w:val="num" w:pos="1440"/>
+        </w:tabs>
+        <w:ind w:left="1440" w:hanging="360"/>
+      </w:pPr>
+      <w:rPr>
+        <w:rFonts w:ascii="Courier New" w:hAnsi="Courier New" w:hint="default"/>
+        <w:sz w:val="20"/>
+      </w:rPr>
+    </w:lvl>
+    <w:lvl w:ilvl="2" w:tentative="1">
+      <w:start w:val="1"/>
+      <w:numFmt w:val="bullet"/>
+      <w:lvlText w:val=""/>
+      <w:lvlJc w:val="left"/>
+      <w:pPr>
+        <w:tabs>
+          <w:tab w:val="num" w:pos="2160"/>
+        </w:tabs>
+        <w:ind w:left="2160" w:hanging="360"/>
+      </w:pPr>
+      <w:rPr>
+        <w:rFonts w:ascii="Wingdings" w:hAnsi="Wingdings" w:hint="default"/>
+        <w:sz w:val="20"/>
+      </w:rPr>
+    </w:lvl>
+    <w:lvl w:ilvl="3" w:tentative="1">
+      <w:start w:val="1"/>
+      <w:numFmt w:val="bullet"/>
+      <w:lvlText w:val=""/>
+      <w:lvlJc w:val="left"/>
+      <w:pPr>
+        <w:tabs>
+          <w:tab w:val="num" w:pos="2880"/>
+        </w:tabs>
+        <w:ind w:left="2880" w:hanging="360"/>
+      </w:pPr>
+      <w:rPr>
+        <w:rFonts w:ascii="Wingdings" w:hAnsi="Wingdings" w:hint="default"/>
+        <w:sz w:val="20"/>
+      </w:rPr>
+    </w:lvl>
+    <w:lvl w:ilvl="4" w:tentative="1">
+      <w:start w:val="1"/>
+      <w:numFmt w:val="bullet"/>
+      <w:lvlText w:val=""/>
+      <w:lvlJc w:val="left"/>
+      <w:pPr>
+        <w:tabs>
+          <w:tab w:val="num" w:pos="3600"/>
+        </w:tabs>
+        <w:ind w:left="3600" w:hanging="360"/>
+      </w:pPr>
+      <w:rPr>
+        <w:rFonts w:ascii="Wingdings" w:hAnsi="Wingdings" w:hint="default"/>
+        <w:sz w:val="20"/>
+      </w:rPr>
+    </w:lvl>
+    <w:lvl w:ilvl="5" w:tentative="1">
+      <w:start w:val="1"/>
+      <w:numFmt w:val="bullet"/>
+      <w:lvlText w:val=""/>
+      <w:lvlJc w:val="left"/>
+      <w:pPr>
+        <w:tabs>
+          <w:tab w:val="num" w:pos="4320"/>
+        </w:tabs>
+        <w:ind w:left="4320" w:hanging="360"/>
+      </w:pPr>
+      <w:rPr>
+        <w:rFonts w:ascii="Wingdings" w:hAnsi="Wingdings" w:hint="default"/>
+        <w:sz w:val="20"/>
+      </w:rPr>
+    </w:lvl>
+    <w:lvl w:ilvl="6" w:tentative="1">
+      <w:start w:val="1"/>
+      <w:numFmt w:val="bullet"/>
+      <w:lvlText w:val=""/>
+      <w:lvlJc w:val="left"/>
+      <w:pPr>
+        <w:tabs>
+          <w:tab w:val="num" w:pos="5040"/>
+        </w:tabs>
+        <w:ind w:left="5040" w:hanging="360"/>
+      </w:pPr>
+      <w:rPr>
+        <w:rFonts w:ascii="Wingdings" w:hAnsi="Wingdings" w:hint="default"/>
+        <w:sz w:val="20"/>
+      </w:rPr>
+    </w:lvl>
+    <w:lvl w:ilvl="7" w:tentative="1">
+      <w:start w:val="1"/>
+      <w:numFmt w:val="bullet"/>
+      <w:lvlText w:val=""/>
+      <w:lvlJc w:val="left"/>
+      <w:pPr>
+        <w:tabs>
+          <w:tab w:val="num" w:pos="5760"/>
+        </w:tabs>
+        <w:ind w:left="5760" w:hanging="360"/>
+      </w:pPr>
+      <w:rPr>
+        <w:rFonts w:ascii="Wingdings" w:hAnsi="Wingdings" w:hint="default"/>
+        <w:sz w:val="20"/>
+      </w:rPr>
+    </w:lvl>
+    <w:lvl w:ilvl="8" w:tentative="1">
+      <w:start w:val="1"/>
+      <w:numFmt w:val="bullet"/>
+      <w:lvlText w:val=""/>
+      <w:lvlJc w:val="left"/>
+      <w:pPr>
+        <w:tabs>
+          <w:tab w:val="num" w:pos="6480"/>
+        </w:tabs>
+        <w:ind w:left="6480" w:hanging="360"/>
+      </w:pPr>
+      <w:rPr>
+        <w:rFonts w:ascii="Wingdings" w:hAnsi="Wingdings" w:hint="default"/>
+        <w:sz w:val="20"/>
+      </w:rPr>
+    </w:lvl>
+  </w:abstractNum>
+  <w:abstractNum w:abstractNumId="7" w15:restartNumberingAfterBreak="0">
     <w:nsid w:val="28FB640F"/>
     <w:multiLevelType w:val="hybridMultilevel"/>
     <w:tmpl w:val="B8F8B052"/>
@@ -6345,7 +9631,7 @@
       </w:rPr>
     </w:lvl>
   </w:abstractNum>
-  <w:abstractNum w:abstractNumId="5" w15:restartNumberingAfterBreak="0">
+  <w:abstractNum w:abstractNumId="8" w15:restartNumberingAfterBreak="0">
     <w:nsid w:val="2BE05B12"/>
     <w:multiLevelType w:val="hybridMultilevel"/>
     <w:tmpl w:val="78D4E05A"/>
@@ -6434,7 +9720,156 @@
       </w:pPr>
     </w:lvl>
   </w:abstractNum>
-  <w:abstractNum w:abstractNumId="6" w15:restartNumberingAfterBreak="0">
+  <w:abstractNum w:abstractNumId="9" w15:restartNumberingAfterBreak="0">
+    <w:nsid w:val="31B51D0B"/>
+    <w:multiLevelType w:val="multilevel"/>
+    <w:tmpl w:val="E18C74E4"/>
+    <w:lvl w:ilvl="0">
+      <w:start w:val="1"/>
+      <w:numFmt w:val="bullet"/>
+      <w:lvlText w:val=""/>
+      <w:lvlJc w:val="left"/>
+      <w:pPr>
+        <w:tabs>
+          <w:tab w:val="num" w:pos="720"/>
+        </w:tabs>
+        <w:ind w:left="720" w:hanging="360"/>
+      </w:pPr>
+      <w:rPr>
+        <w:rFonts w:ascii="Symbol" w:hAnsi="Symbol" w:hint="default"/>
+        <w:sz w:val="20"/>
+      </w:rPr>
+    </w:lvl>
+    <w:lvl w:ilvl="1" w:tentative="1">
+      <w:start w:val="1"/>
+      <w:numFmt w:val="bullet"/>
+      <w:lvlText w:val="o"/>
+      <w:lvlJc w:val="left"/>
+      <w:pPr>
+        <w:tabs>
+          <w:tab w:val="num" w:pos="1440"/>
+        </w:tabs>
+        <w:ind w:left="1440" w:hanging="360"/>
+      </w:pPr>
+      <w:rPr>
+        <w:rFonts w:ascii="Courier New" w:hAnsi="Courier New" w:hint="default"/>
+        <w:sz w:val="20"/>
+      </w:rPr>
+    </w:lvl>
+    <w:lvl w:ilvl="2" w:tentative="1">
+      <w:start w:val="1"/>
+      <w:numFmt w:val="bullet"/>
+      <w:lvlText w:val=""/>
+      <w:lvlJc w:val="left"/>
+      <w:pPr>
+        <w:tabs>
+          <w:tab w:val="num" w:pos="2160"/>
+        </w:tabs>
+        <w:ind w:left="2160" w:hanging="360"/>
+      </w:pPr>
+      <w:rPr>
+        <w:rFonts w:ascii="Wingdings" w:hAnsi="Wingdings" w:hint="default"/>
+        <w:sz w:val="20"/>
+      </w:rPr>
+    </w:lvl>
+    <w:lvl w:ilvl="3" w:tentative="1">
+      <w:start w:val="1"/>
+      <w:numFmt w:val="bullet"/>
+      <w:lvlText w:val=""/>
+      <w:lvlJc w:val="left"/>
+      <w:pPr>
+        <w:tabs>
+          <w:tab w:val="num" w:pos="2880"/>
+        </w:tabs>
+        <w:ind w:left="2880" w:hanging="360"/>
+      </w:pPr>
+      <w:rPr>
+        <w:rFonts w:ascii="Wingdings" w:hAnsi="Wingdings" w:hint="default"/>
+        <w:sz w:val="20"/>
+      </w:rPr>
+    </w:lvl>
+    <w:lvl w:ilvl="4" w:tentative="1">
+      <w:start w:val="1"/>
+      <w:numFmt w:val="bullet"/>
+      <w:lvlText w:val=""/>
+      <w:lvlJc w:val="left"/>
+      <w:pPr>
+        <w:tabs>
+          <w:tab w:val="num" w:pos="3600"/>
+        </w:tabs>
+        <w:ind w:left="3600" w:hanging="360"/>
+      </w:pPr>
+      <w:rPr>
+        <w:rFonts w:ascii="Wingdings" w:hAnsi="Wingdings" w:hint="default"/>
+        <w:sz w:val="20"/>
+      </w:rPr>
+    </w:lvl>
+    <w:lvl w:ilvl="5" w:tentative="1">
+      <w:start w:val="1"/>
+      <w:numFmt w:val="bullet"/>
+      <w:lvlText w:val=""/>
+      <w:lvlJc w:val="left"/>
+      <w:pPr>
+        <w:tabs>
+          <w:tab w:val="num" w:pos="4320"/>
+        </w:tabs>
+        <w:ind w:left="4320" w:hanging="360"/>
+      </w:pPr>
+      <w:rPr>
+        <w:rFonts w:ascii="Wingdings" w:hAnsi="Wingdings" w:hint="default"/>
+        <w:sz w:val="20"/>
+      </w:rPr>
+    </w:lvl>
+    <w:lvl w:ilvl="6" w:tentative="1">
+      <w:start w:val="1"/>
+      <w:numFmt w:val="bullet"/>
+      <w:lvlText w:val=""/>
+      <w:lvlJc w:val="left"/>
+      <w:pPr>
+        <w:tabs>
+          <w:tab w:val="num" w:pos="5040"/>
+        </w:tabs>
+        <w:ind w:left="5040" w:hanging="360"/>
+      </w:pPr>
+      <w:rPr>
+        <w:rFonts w:ascii="Wingdings" w:hAnsi="Wingdings" w:hint="default"/>
+        <w:sz w:val="20"/>
+      </w:rPr>
+    </w:lvl>
+    <w:lvl w:ilvl="7" w:tentative="1">
+      <w:start w:val="1"/>
+      <w:numFmt w:val="bullet"/>
+      <w:lvlText w:val=""/>
+      <w:lvlJc w:val="left"/>
+      <w:pPr>
+        <w:tabs>
+          <w:tab w:val="num" w:pos="5760"/>
+        </w:tabs>
+        <w:ind w:left="5760" w:hanging="360"/>
+      </w:pPr>
+      <w:rPr>
+        <w:rFonts w:ascii="Wingdings" w:hAnsi="Wingdings" w:hint="default"/>
+        <w:sz w:val="20"/>
+      </w:rPr>
+    </w:lvl>
+    <w:lvl w:ilvl="8" w:tentative="1">
+      <w:start w:val="1"/>
+      <w:numFmt w:val="bullet"/>
+      <w:lvlText w:val=""/>
+      <w:lvlJc w:val="left"/>
+      <w:pPr>
+        <w:tabs>
+          <w:tab w:val="num" w:pos="6480"/>
+        </w:tabs>
+        <w:ind w:left="6480" w:hanging="360"/>
+      </w:pPr>
+      <w:rPr>
+        <w:rFonts w:ascii="Wingdings" w:hAnsi="Wingdings" w:hint="default"/>
+        <w:sz w:val="20"/>
+      </w:rPr>
+    </w:lvl>
+  </w:abstractNum>
+  <w:abstractNum w:abstractNumId="10" w15:restartNumberingAfterBreak="0">
     <w:nsid w:val="41201E69"/>
     <w:multiLevelType w:val="multilevel"/>
     <w:tmpl w:val="B71AF922"/>
@@ -6583,7 +10018,156 @@
       </w:rPr>
     </w:lvl>
   </w:abstractNum>
-  <w:abstractNum w:abstractNumId="7" w15:restartNumberingAfterBreak="0">
+  <w:abstractNum w:abstractNumId="11" w15:restartNumberingAfterBreak="0">
+    <w:nsid w:val="56B22344"/>
+    <w:multiLevelType w:val="multilevel"/>
+    <w:tmpl w:val="50486892"/>
+    <w:lvl w:ilvl="0">
+      <w:start w:val="1"/>
+      <w:numFmt w:val="bullet"/>
+      <w:lvlText w:val=""/>
+      <w:lvlJc w:val="left"/>
+      <w:pPr>
+        <w:tabs>
+          <w:tab w:val="num" w:pos="720"/>
+        </w:tabs>
+        <w:ind w:left="720" w:hanging="360"/>
+      </w:pPr>
+      <w:rPr>
+        <w:rFonts w:ascii="Symbol" w:hAnsi="Symbol" w:hint="default"/>
+        <w:sz w:val="20"/>
+      </w:rPr>
+    </w:lvl>
+    <w:lvl w:ilvl="1" w:tentative="1">
+      <w:start w:val="1"/>
+      <w:numFmt w:val="bullet"/>
+      <w:lvlText w:val="o"/>
+      <w:lvlJc w:val="left"/>
+      <w:pPr>
+        <w:tabs>
+          <w:tab w:val="num" w:pos="1440"/>
+        </w:tabs>
+        <w:ind w:left="1440" w:hanging="360"/>
+      </w:pPr>
+      <w:rPr>
+        <w:rFonts w:ascii="Courier New" w:hAnsi="Courier New" w:hint="default"/>
+        <w:sz w:val="20"/>
+      </w:rPr>
+    </w:lvl>
+    <w:lvl w:ilvl="2" w:tentative="1">
+      <w:start w:val="1"/>
+      <w:numFmt w:val="bullet"/>
+      <w:lvlText w:val=""/>
+      <w:lvlJc w:val="left"/>
+      <w:pPr>
+        <w:tabs>
+          <w:tab w:val="num" w:pos="2160"/>
+        </w:tabs>
+        <w:ind w:left="2160" w:hanging="360"/>
+      </w:pPr>
+      <w:rPr>
+        <w:rFonts w:ascii="Wingdings" w:hAnsi="Wingdings" w:hint="default"/>
+        <w:sz w:val="20"/>
+      </w:rPr>
+    </w:lvl>
+    <w:lvl w:ilvl="3" w:tentative="1">
+      <w:start w:val="1"/>
+      <w:numFmt w:val="bullet"/>
+      <w:lvlText w:val=""/>
+      <w:lvlJc w:val="left"/>
+      <w:pPr>
+        <w:tabs>
+          <w:tab w:val="num" w:pos="2880"/>
+        </w:tabs>
+        <w:ind w:left="2880" w:hanging="360"/>
+      </w:pPr>
+      <w:rPr>
+        <w:rFonts w:ascii="Wingdings" w:hAnsi="Wingdings" w:hint="default"/>
+        <w:sz w:val="20"/>
+      </w:rPr>
+    </w:lvl>
+    <w:lvl w:ilvl="4" w:tentative="1">
+      <w:start w:val="1"/>
+      <w:numFmt w:val="bullet"/>
+      <w:lvlText w:val=""/>
+      <w:lvlJc w:val="left"/>
+      <w:pPr>
+        <w:tabs>
+          <w:tab w:val="num" w:pos="3600"/>
+        </w:tabs>
+        <w:ind w:left="3600" w:hanging="360"/>
+      </w:pPr>
+      <w:rPr>
+        <w:rFonts w:ascii="Wingdings" w:hAnsi="Wingdings" w:hint="default"/>
+        <w:sz w:val="20"/>
+      </w:rPr>
+    </w:lvl>
+    <w:lvl w:ilvl="5" w:tentative="1">
+      <w:start w:val="1"/>
+      <w:numFmt w:val="bullet"/>
+      <w:lvlText w:val=""/>
+      <w:lvlJc w:val="left"/>
+      <w:pPr>
+        <w:tabs>
+          <w:tab w:val="num" w:pos="4320"/>
+        </w:tabs>
+        <w:ind w:left="4320" w:hanging="360"/>
+      </w:pPr>
+      <w:rPr>
+        <w:rFonts w:ascii="Wingdings" w:hAnsi="Wingdings" w:hint="default"/>
+        <w:sz w:val="20"/>
+      </w:rPr>
+    </w:lvl>
+    <w:lvl w:ilvl="6" w:tentative="1">
+      <w:start w:val="1"/>
+      <w:numFmt w:val="bullet"/>
+      <w:lvlText w:val=""/>
+      <w:lvlJc w:val="left"/>
+      <w:pPr>
+        <w:tabs>
+          <w:tab w:val="num" w:pos="5040"/>
+        </w:tabs>
+        <w:ind w:left="5040" w:hanging="360"/>
+      </w:pPr>
+      <w:rPr>
+        <w:rFonts w:ascii="Wingdings" w:hAnsi="Wingdings" w:hint="default"/>
+        <w:sz w:val="20"/>
+      </w:rPr>
+    </w:lvl>
+    <w:lvl w:ilvl="7" w:tentative="1">
+      <w:start w:val="1"/>
+      <w:numFmt w:val="bullet"/>
+      <w:lvlText w:val=""/>
+      <w:lvlJc w:val="left"/>
+      <w:pPr>
+        <w:tabs>
+          <w:tab w:val="num" w:pos="5760"/>
+        </w:tabs>
+        <w:ind w:left="5760" w:hanging="360"/>
+      </w:pPr>
+      <w:rPr>
+        <w:rFonts w:ascii="Wingdings" w:hAnsi="Wingdings" w:hint="default"/>
+        <w:sz w:val="20"/>
+      </w:rPr>
+    </w:lvl>
+    <w:lvl w:ilvl="8" w:tentative="1">
+      <w:start w:val="1"/>
+      <w:numFmt w:val="bullet"/>
+      <w:lvlText w:val=""/>
+      <w:lvlJc w:val="left"/>
+      <w:pPr>
+        <w:tabs>
+          <w:tab w:val="num" w:pos="6480"/>
+        </w:tabs>
+        <w:ind w:left="6480" w:hanging="360"/>
+      </w:pPr>
+      <w:rPr>
+        <w:rFonts w:ascii="Wingdings" w:hAnsi="Wingdings" w:hint="default"/>
+        <w:sz w:val="20"/>
+      </w:rPr>
+    </w:lvl>
+  </w:abstractNum>
+  <w:abstractNum w:abstractNumId="12" w15:restartNumberingAfterBreak="0">
     <w:nsid w:val="65441C26"/>
     <w:multiLevelType w:val="hybridMultilevel"/>
     <w:tmpl w:val="831C6E54"/>
@@ -6672,7 +10256,156 @@
       </w:pPr>
     </w:lvl>
   </w:abstractNum>
-  <w:abstractNum w:abstractNumId="8" w15:restartNumberingAfterBreak="0">
+  <w:abstractNum w:abstractNumId="13" w15:restartNumberingAfterBreak="0">
+    <w:nsid w:val="67CA79DD"/>
+    <w:multiLevelType w:val="multilevel"/>
+    <w:tmpl w:val="C966D96E"/>
+    <w:lvl w:ilvl="0">
+      <w:start w:val="1"/>
+      <w:numFmt w:val="bullet"/>
+      <w:lvlText w:val=""/>
+      <w:lvlJc w:val="left"/>
+      <w:pPr>
+        <w:tabs>
+          <w:tab w:val="num" w:pos="720"/>
+        </w:tabs>
+        <w:ind w:left="720" w:hanging="360"/>
+      </w:pPr>
+      <w:rPr>
+        <w:rFonts w:ascii="Symbol" w:hAnsi="Symbol" w:hint="default"/>
+        <w:sz w:val="20"/>
+      </w:rPr>
+    </w:lvl>
+    <w:lvl w:ilvl="1" w:tentative="1">
+      <w:start w:val="1"/>
+      <w:numFmt w:val="bullet"/>
+      <w:lvlText w:val="o"/>
+      <w:lvlJc w:val="left"/>
+      <w:pPr>
+        <w:tabs>
+          <w:tab w:val="num" w:pos="1440"/>
+        </w:tabs>
+        <w:ind w:left="1440" w:hanging="360"/>
+      </w:pPr>
+      <w:rPr>
+        <w:rFonts w:ascii="Courier New" w:hAnsi="Courier New" w:hint="default"/>
+        <w:sz w:val="20"/>
+      </w:rPr>
+    </w:lvl>
+    <w:lvl w:ilvl="2" w:tentative="1">
+      <w:start w:val="1"/>
+      <w:numFmt w:val="bullet"/>
+      <w:lvlText w:val=""/>
+      <w:lvlJc w:val="left"/>
+      <w:pPr>
+        <w:tabs>
+          <w:tab w:val="num" w:pos="2160"/>
+        </w:tabs>
+        <w:ind w:left="2160" w:hanging="360"/>
+      </w:pPr>
+      <w:rPr>
+        <w:rFonts w:ascii="Wingdings" w:hAnsi="Wingdings" w:hint="default"/>
+        <w:sz w:val="20"/>
+      </w:rPr>
+    </w:lvl>
+    <w:lvl w:ilvl="3" w:tentative="1">
+      <w:start w:val="1"/>
+      <w:numFmt w:val="bullet"/>
+      <w:lvlText w:val=""/>
+      <w:lvlJc w:val="left"/>
+      <w:pPr>
+        <w:tabs>
+          <w:tab w:val="num" w:pos="2880"/>
+        </w:tabs>
+        <w:ind w:left="2880" w:hanging="360"/>
+      </w:pPr>
+      <w:rPr>
+        <w:rFonts w:ascii="Wingdings" w:hAnsi="Wingdings" w:hint="default"/>
+        <w:sz w:val="20"/>
+      </w:rPr>
+    </w:lvl>
+    <w:lvl w:ilvl="4" w:tentative="1">
+      <w:start w:val="1"/>
+      <w:numFmt w:val="bullet"/>
+      <w:lvlText w:val=""/>
+      <w:lvlJc w:val="left"/>
+      <w:pPr>
+        <w:tabs>
+          <w:tab w:val="num" w:pos="3600"/>
+        </w:tabs>
+        <w:ind w:left="3600" w:hanging="360"/>
+      </w:pPr>
+      <w:rPr>
+        <w:rFonts w:ascii="Wingdings" w:hAnsi="Wingdings" w:hint="default"/>
+        <w:sz w:val="20"/>
+      </w:rPr>
+    </w:lvl>
+    <w:lvl w:ilvl="5" w:tentative="1">
+      <w:start w:val="1"/>
+      <w:numFmt w:val="bullet"/>
+      <w:lvlText w:val=""/>
+      <w:lvlJc w:val="left"/>
+      <w:pPr>
+        <w:tabs>
+          <w:tab w:val="num" w:pos="4320"/>
+        </w:tabs>
+        <w:ind w:left="4320" w:hanging="360"/>
+      </w:pPr>
+      <w:rPr>
+        <w:rFonts w:ascii="Wingdings" w:hAnsi="Wingdings" w:hint="default"/>
+        <w:sz w:val="20"/>
+      </w:rPr>
+    </w:lvl>
+    <w:lvl w:ilvl="6" w:tentative="1">
+      <w:start w:val="1"/>
+      <w:numFmt w:val="bullet"/>
+      <w:lvlText w:val=""/>
+      <w:lvlJc w:val="left"/>
+      <w:pPr>
+        <w:tabs>
+          <w:tab w:val="num" w:pos="5040"/>
+        </w:tabs>
+        <w:ind w:left="5040" w:hanging="360"/>
+      </w:pPr>
+      <w:rPr>
+        <w:rFonts w:ascii="Wingdings" w:hAnsi="Wingdings" w:hint="default"/>
+        <w:sz w:val="20"/>
+      </w:rPr>
+    </w:lvl>
+    <w:lvl w:ilvl="7" w:tentative="1">
+      <w:start w:val="1"/>
+      <w:numFmt w:val="bullet"/>
+      <w:lvlText w:val=""/>
+      <w:lvlJc w:val="left"/>
+      <w:pPr>
+        <w:tabs>
+          <w:tab w:val="num" w:pos="5760"/>
+        </w:tabs>
+        <w:ind w:left="5760" w:hanging="360"/>
+      </w:pPr>
+      <w:rPr>
+        <w:rFonts w:ascii="Wingdings" w:hAnsi="Wingdings" w:hint="default"/>
+        <w:sz w:val="20"/>
+      </w:rPr>
+    </w:lvl>
+    <w:lvl w:ilvl="8" w:tentative="1">
+      <w:start w:val="1"/>
+      <w:numFmt w:val="bullet"/>
+      <w:lvlText w:val=""/>
+      <w:lvlJc w:val="left"/>
+      <w:pPr>
+        <w:tabs>
+          <w:tab w:val="num" w:pos="6480"/>
+        </w:tabs>
+        <w:ind w:left="6480" w:hanging="360"/>
+      </w:pPr>
+      <w:rPr>
+        <w:rFonts w:ascii="Wingdings" w:hAnsi="Wingdings" w:hint="default"/>
+        <w:sz w:val="20"/>
+      </w:rPr>
+    </w:lvl>
+  </w:abstractNum>
+  <w:abstractNum w:abstractNumId="14" w15:restartNumberingAfterBreak="0">
     <w:nsid w:val="6C53764C"/>
     <w:multiLevelType w:val="multilevel"/>
     <w:tmpl w:val="47A01330"/>
@@ -6821,7 +10554,7 @@
       </w:rPr>
     </w:lvl>
   </w:abstractNum>
-  <w:abstractNum w:abstractNumId="9" w15:restartNumberingAfterBreak="0">
+  <w:abstractNum w:abstractNumId="15" w15:restartNumberingAfterBreak="0">
     <w:nsid w:val="6D5B0677"/>
     <w:multiLevelType w:val="multilevel"/>
     <w:tmpl w:val="5F56C992"/>
@@ -6970,7 +10703,156 @@
       </w:rPr>
     </w:lvl>
   </w:abstractNum>
-  <w:abstractNum w:abstractNumId="10" w15:restartNumberingAfterBreak="0">
+  <w:abstractNum w:abstractNumId="16" w15:restartNumberingAfterBreak="0">
+    <w:nsid w:val="6E5619A9"/>
+    <w:multiLevelType w:val="multilevel"/>
+    <w:tmpl w:val="2C22996C"/>
+    <w:lvl w:ilvl="0">
+      <w:start w:val="1"/>
+      <w:numFmt w:val="bullet"/>
+      <w:lvlText w:val=""/>
+      <w:lvlJc w:val="left"/>
+      <w:pPr>
+        <w:tabs>
+          <w:tab w:val="num" w:pos="720"/>
+        </w:tabs>
+        <w:ind w:left="720" w:hanging="360"/>
+      </w:pPr>
+      <w:rPr>
+        <w:rFonts w:ascii="Symbol" w:hAnsi="Symbol" w:hint="default"/>
+        <w:sz w:val="20"/>
+      </w:rPr>
+    </w:lvl>
+    <w:lvl w:ilvl="1" w:tentative="1">
+      <w:start w:val="1"/>
+      <w:numFmt w:val="bullet"/>
+      <w:lvlText w:val="o"/>
+      <w:lvlJc w:val="left"/>
+      <w:pPr>
+        <w:tabs>
+          <w:tab w:val="num" w:pos="1440"/>
+        </w:tabs>
+        <w:ind w:left="1440" w:hanging="360"/>
+      </w:pPr>
+      <w:rPr>
+        <w:rFonts w:ascii="Courier New" w:hAnsi="Courier New" w:hint="default"/>
+        <w:sz w:val="20"/>
+      </w:rPr>
+    </w:lvl>
+    <w:lvl w:ilvl="2" w:tentative="1">
+      <w:start w:val="1"/>
+      <w:numFmt w:val="bullet"/>
+      <w:lvlText w:val=""/>
+      <w:lvlJc w:val="left"/>
+      <w:pPr>
+        <w:tabs>
+          <w:tab w:val="num" w:pos="2160"/>
+        </w:tabs>
+        <w:ind w:left="2160" w:hanging="360"/>
+      </w:pPr>
+      <w:rPr>
+        <w:rFonts w:ascii="Wingdings" w:hAnsi="Wingdings" w:hint="default"/>
+        <w:sz w:val="20"/>
+      </w:rPr>
+    </w:lvl>
+    <w:lvl w:ilvl="3" w:tentative="1">
+      <w:start w:val="1"/>
+      <w:numFmt w:val="bullet"/>
+      <w:lvlText w:val=""/>
+      <w:lvlJc w:val="left"/>
+      <w:pPr>
+        <w:tabs>
+          <w:tab w:val="num" w:pos="2880"/>
+        </w:tabs>
+        <w:ind w:left="2880" w:hanging="360"/>
+      </w:pPr>
+      <w:rPr>
+        <w:rFonts w:ascii="Wingdings" w:hAnsi="Wingdings" w:hint="default"/>
+        <w:sz w:val="20"/>
+      </w:rPr>
+    </w:lvl>
+    <w:lvl w:ilvl="4" w:tentative="1">
+      <w:start w:val="1"/>
+      <w:numFmt w:val="bullet"/>
+      <w:lvlText w:val=""/>
+      <w:lvlJc w:val="left"/>
+      <w:pPr>
+        <w:tabs>
+          <w:tab w:val="num" w:pos="3600"/>
+        </w:tabs>
+        <w:ind w:left="3600" w:hanging="360"/>
+      </w:pPr>
+      <w:rPr>
+        <w:rFonts w:ascii="Wingdings" w:hAnsi="Wingdings" w:hint="default"/>
+        <w:sz w:val="20"/>
+      </w:rPr>
+    </w:lvl>
+    <w:lvl w:ilvl="5" w:tentative="1">
+      <w:start w:val="1"/>
+      <w:numFmt w:val="bullet"/>
+      <w:lvlText w:val=""/>
+      <w:lvlJc w:val="left"/>
+      <w:pPr>
+        <w:tabs>
+          <w:tab w:val="num" w:pos="4320"/>
+        </w:tabs>
+        <w:ind w:left="4320" w:hanging="360"/>
+      </w:pPr>
+      <w:rPr>
+        <w:rFonts w:ascii="Wingdings" w:hAnsi="Wingdings" w:hint="default"/>
+        <w:sz w:val="20"/>
+      </w:rPr>
+    </w:lvl>
+    <w:lvl w:ilvl="6" w:tentative="1">
+      <w:start w:val="1"/>
+      <w:numFmt w:val="bullet"/>
+      <w:lvlText w:val=""/>
+      <w:lvlJc w:val="left"/>
+      <w:pPr>
+        <w:tabs>
+          <w:tab w:val="num" w:pos="5040"/>
+        </w:tabs>
+        <w:ind w:left="5040" w:hanging="360"/>
+      </w:pPr>
+      <w:rPr>
+        <w:rFonts w:ascii="Wingdings" w:hAnsi="Wingdings" w:hint="default"/>
+        <w:sz w:val="20"/>
+      </w:rPr>
+    </w:lvl>
+    <w:lvl w:ilvl="7" w:tentative="1">
+      <w:start w:val="1"/>
+      <w:numFmt w:val="bullet"/>
+      <w:lvlText w:val=""/>
+      <w:lvlJc w:val="left"/>
+      <w:pPr>
+        <w:tabs>
+          <w:tab w:val="num" w:pos="5760"/>
+        </w:tabs>
+        <w:ind w:left="5760" w:hanging="360"/>
+      </w:pPr>
+      <w:rPr>
+        <w:rFonts w:ascii="Wingdings" w:hAnsi="Wingdings" w:hint="default"/>
+        <w:sz w:val="20"/>
+      </w:rPr>
+    </w:lvl>
+    <w:lvl w:ilvl="8" w:tentative="1">
+      <w:start w:val="1"/>
+      <w:numFmt w:val="bullet"/>
+      <w:lvlText w:val=""/>
+      <w:lvlJc w:val="left"/>
+      <w:pPr>
+        <w:tabs>
+          <w:tab w:val="num" w:pos="6480"/>
+        </w:tabs>
+        <w:ind w:left="6480" w:hanging="360"/>
+      </w:pPr>
+      <w:rPr>
+        <w:rFonts w:ascii="Wingdings" w:hAnsi="Wingdings" w:hint="default"/>
+        <w:sz w:val="20"/>
+      </w:rPr>
+    </w:lvl>
+  </w:abstractNum>
+  <w:abstractNum w:abstractNumId="17" w15:restartNumberingAfterBreak="0">
     <w:nsid w:val="77710BE0"/>
     <w:multiLevelType w:val="hybridMultilevel"/>
     <w:tmpl w:val="96F844D0"/>
@@ -7083,7 +10965,156 @@
       </w:rPr>
     </w:lvl>
   </w:abstractNum>
-  <w:abstractNum w:abstractNumId="11" w15:restartNumberingAfterBreak="0">
+  <w:abstractNum w:abstractNumId="18" w15:restartNumberingAfterBreak="0">
+    <w:nsid w:val="7B8D2A87"/>
+    <w:multiLevelType w:val="multilevel"/>
+    <w:tmpl w:val="705E491C"/>
+    <w:lvl w:ilvl="0">
+      <w:start w:val="1"/>
+      <w:numFmt w:val="bullet"/>
+      <w:lvlText w:val=""/>
+      <w:lvlJc w:val="left"/>
+      <w:pPr>
+        <w:tabs>
+          <w:tab w:val="num" w:pos="720"/>
+        </w:tabs>
+        <w:ind w:left="720" w:hanging="360"/>
+      </w:pPr>
+      <w:rPr>
+        <w:rFonts w:ascii="Symbol" w:hAnsi="Symbol" w:hint="default"/>
+        <w:sz w:val="20"/>
+      </w:rPr>
+    </w:lvl>
+    <w:lvl w:ilvl="1" w:tentative="1">
+      <w:start w:val="1"/>
+      <w:numFmt w:val="bullet"/>
+      <w:lvlText w:val="o"/>
+      <w:lvlJc w:val="left"/>
+      <w:pPr>
+        <w:tabs>
+          <w:tab w:val="num" w:pos="1440"/>
+        </w:tabs>
+        <w:ind w:left="1440" w:hanging="360"/>
+      </w:pPr>
+      <w:rPr>
+        <w:rFonts w:ascii="Courier New" w:hAnsi="Courier New" w:hint="default"/>
+        <w:sz w:val="20"/>
+      </w:rPr>
+    </w:lvl>
+    <w:lvl w:ilvl="2" w:tentative="1">
+      <w:start w:val="1"/>
+      <w:numFmt w:val="bullet"/>
+      <w:lvlText w:val=""/>
+      <w:lvlJc w:val="left"/>
+      <w:pPr>
+        <w:tabs>
+          <w:tab w:val="num" w:pos="2160"/>
+        </w:tabs>
+        <w:ind w:left="2160" w:hanging="360"/>
+      </w:pPr>
+      <w:rPr>
+        <w:rFonts w:ascii="Wingdings" w:hAnsi="Wingdings" w:hint="default"/>
+        <w:sz w:val="20"/>
+      </w:rPr>
+    </w:lvl>
+    <w:lvl w:ilvl="3" w:tentative="1">
+      <w:start w:val="1"/>
+      <w:numFmt w:val="bullet"/>
+      <w:lvlText w:val=""/>
+      <w:lvlJc w:val="left"/>
+      <w:pPr>
+        <w:tabs>
+          <w:tab w:val="num" w:pos="2880"/>
+        </w:tabs>
+        <w:ind w:left="2880" w:hanging="360"/>
+      </w:pPr>
+      <w:rPr>
+        <w:rFonts w:ascii="Wingdings" w:hAnsi="Wingdings" w:hint="default"/>
+        <w:sz w:val="20"/>
+      </w:rPr>
+    </w:lvl>
+    <w:lvl w:ilvl="4" w:tentative="1">
+      <w:start w:val="1"/>
+      <w:numFmt w:val="bullet"/>
+      <w:lvlText w:val=""/>
+      <w:lvlJc w:val="left"/>
+      <w:pPr>
+        <w:tabs>
+          <w:tab w:val="num" w:pos="3600"/>
+        </w:tabs>
+        <w:ind w:left="3600" w:hanging="360"/>
+      </w:pPr>
+      <w:rPr>
+        <w:rFonts w:ascii="Wingdings" w:hAnsi="Wingdings" w:hint="default"/>
+        <w:sz w:val="20"/>
+      </w:rPr>
+    </w:lvl>
+    <w:lvl w:ilvl="5" w:tentative="1">
+      <w:start w:val="1"/>
+      <w:numFmt w:val="bullet"/>
+      <w:lvlText w:val=""/>
+      <w:lvlJc w:val="left"/>
+      <w:pPr>
+        <w:tabs>
+          <w:tab w:val="num" w:pos="4320"/>
+        </w:tabs>
+        <w:ind w:left="4320" w:hanging="360"/>
+      </w:pPr>
+      <w:rPr>
+        <w:rFonts w:ascii="Wingdings" w:hAnsi="Wingdings" w:hint="default"/>
+        <w:sz w:val="20"/>
+      </w:rPr>
+    </w:lvl>
+    <w:lvl w:ilvl="6" w:tentative="1">
+      <w:start w:val="1"/>
+      <w:numFmt w:val="bullet"/>
+      <w:lvlText w:val=""/>
+      <w:lvlJc w:val="left"/>
+      <w:pPr>
+        <w:tabs>
+          <w:tab w:val="num" w:pos="5040"/>
+        </w:tabs>
+        <w:ind w:left="5040" w:hanging="360"/>
+      </w:pPr>
+      <w:rPr>
+        <w:rFonts w:ascii="Wingdings" w:hAnsi="Wingdings" w:hint="default"/>
+        <w:sz w:val="20"/>
+      </w:rPr>
+    </w:lvl>
+    <w:lvl w:ilvl="7" w:tentative="1">
+      <w:start w:val="1"/>
+      <w:numFmt w:val="bullet"/>
+      <w:lvlText w:val=""/>
+      <w:lvlJc w:val="left"/>
+      <w:pPr>
+        <w:tabs>
+          <w:tab w:val="num" w:pos="5760"/>
+        </w:tabs>
+        <w:ind w:left="5760" w:hanging="360"/>
+      </w:pPr>
+      <w:rPr>
+        <w:rFonts w:ascii="Wingdings" w:hAnsi="Wingdings" w:hint="default"/>
+        <w:sz w:val="20"/>
+      </w:rPr>
+    </w:lvl>
+    <w:lvl w:ilvl="8" w:tentative="1">
+      <w:start w:val="1"/>
+      <w:numFmt w:val="bullet"/>
+      <w:lvlText w:val=""/>
+      <w:lvlJc w:val="left"/>
+      <w:pPr>
+        <w:tabs>
+          <w:tab w:val="num" w:pos="6480"/>
+        </w:tabs>
+        <w:ind w:left="6480" w:hanging="360"/>
+      </w:pPr>
+      <w:rPr>
+        <w:rFonts w:ascii="Wingdings" w:hAnsi="Wingdings" w:hint="default"/>
+        <w:sz w:val="20"/>
+      </w:rPr>
+    </w:lvl>
+  </w:abstractNum>
+  <w:abstractNum w:abstractNumId="19" w15:restartNumberingAfterBreak="0">
     <w:nsid w:val="7C150684"/>
     <w:multiLevelType w:val="multilevel"/>
     <w:tmpl w:val="466276DA"/>
@@ -7233,31 +11264,31 @@
     </w:lvl>
   </w:abstractNum>
   <w:num w:numId="1" w16cid:durableId="1918008032">
-    <w:abstractNumId w:val="7"/>
+    <w:abstractNumId w:val="12"/>
   </w:num>
   <w:num w:numId="2" w16cid:durableId="1736316788">
-    <w:abstractNumId w:val="5"/>
+    <w:abstractNumId w:val="8"/>
   </w:num>
   <w:num w:numId="3" w16cid:durableId="1231237616">
     <w:abstractNumId w:val="2"/>
   </w:num>
   <w:num w:numId="4" w16cid:durableId="692732249">
-    <w:abstractNumId w:val="4"/>
+    <w:abstractNumId w:val="7"/>
   </w:num>
   <w:num w:numId="5" w16cid:durableId="1347050104">
-    <w:abstractNumId w:val="8"/>
+    <w:abstractNumId w:val="14"/>
   </w:num>
   <w:num w:numId="6" w16cid:durableId="1323775650">
-    <w:abstractNumId w:val="9"/>
+    <w:abstractNumId w:val="15"/>
   </w:num>
   <w:num w:numId="7" w16cid:durableId="1010063160">
-    <w:abstractNumId w:val="3"/>
+    <w:abstractNumId w:val="5"/>
   </w:num>
   <w:num w:numId="8" w16cid:durableId="174543059">
-    <w:abstractNumId w:val="6"/>
+    <w:abstractNumId w:val="10"/>
   </w:num>
   <w:num w:numId="9" w16cid:durableId="2143887793">
-    <w:abstractNumId w:val="11"/>
+    <w:abstractNumId w:val="19"/>
   </w:num>
   <w:num w:numId="10" w16cid:durableId="775103206">
     <w:abstractNumId w:val="1"/>
@@ -7266,7 +11297,31 @@
     <w:abstractNumId w:val="0"/>
   </w:num>
   <w:num w:numId="12" w16cid:durableId="190653458">
-    <w:abstractNumId w:val="10"/>
+    <w:abstractNumId w:val="17"/>
+  </w:num>
+  <w:num w:numId="13" w16cid:durableId="606741855">
+    <w:abstractNumId w:val="16"/>
+  </w:num>
+  <w:num w:numId="14" w16cid:durableId="1948996752">
+    <w:abstractNumId w:val="13"/>
+  </w:num>
+  <w:num w:numId="15" w16cid:durableId="378552061">
+    <w:abstractNumId w:val="18"/>
+  </w:num>
+  <w:num w:numId="16" w16cid:durableId="1958025914">
+    <w:abstractNumId w:val="9"/>
+  </w:num>
+  <w:num w:numId="17" w16cid:durableId="510802345">
+    <w:abstractNumId w:val="4"/>
+  </w:num>
+  <w:num w:numId="18" w16cid:durableId="126558520">
+    <w:abstractNumId w:val="11"/>
+  </w:num>
+  <w:num w:numId="19" w16cid:durableId="656033216">
+    <w:abstractNumId w:val="3"/>
+  </w:num>
+  <w:num w:numId="20" w16cid:durableId="290134020">
+    <w:abstractNumId w:val="6"/>
   </w:num>
 </w:numbering>
 </file>

</xml_diff>